<commit_message>
Docs: fix KF example label, uncertainty units, UNIT_ID name; add Shotover/GSS lens types (rev 1.5)
</commit_message>
<xml_diff>
--- a/docs/VIPS+Airpixel output end user documentation.docx
+++ b/docs/VIPS+Airpixel output end user documentation.docx
@@ -2859,6 +2859,98 @@
           </w:p>
         </w:tc>
       </w:tr>
+      <w:tr>
+        <w:trPr>
+          <w:cnfStyle w:val="000000100000" w:firstRow="0" w:lastRow="0" w:firstColumn="0" w:lastColumn="0" w:oddVBand="0" w:evenVBand="0" w:oddHBand="1" w:evenHBand="0" w:firstRowFirstColumn="0" w:firstRowLastColumn="0" w:lastRowFirstColumn="0" w:lastRowLastColumn="0"/>
+          <w:trHeight w:val="375"/>
+        </w:trPr>
+        <w:tc>
+          <w:tcPr>
+            <w:cnfStyle w:val="001000000000" w:firstRow="0" w:lastRow="0" w:firstColumn="1" w:lastColumn="0" w:oddVBand="0" w:evenVBand="0" w:oddHBand="0" w:evenHBand="0" w:firstRowFirstColumn="0" w:firstRowLastColumn="0" w:lastRowFirstColumn="0" w:lastRowLastColumn="0"/>
+            <w:tcW w:w="1050" w:type="dxa"/>
+            <w:vAlign w:val="center"/>
+          </w:tcPr>
+          <w:p>
+            <w:pPr>
+              <w:jc w:val="center"/>
+              <w:rPr>
+                <w:b w:val="0"/>
+                <w:bCs w:val="0"/>
+              </w:rPr>
+            </w:pPr>
+            <w:r>
+              <w:rPr>
+                <w:b w:val="0"/>
+                <w:bCs w:val="0"/>
+              </w:rPr>
+              <w:t>1.5</w:t>
+            </w:r>
+          </w:p>
+        </w:tc>
+        <w:tc>
+          <w:tcPr>
+            <w:tcW w:w="1395" w:type="dxa"/>
+            <w:vAlign w:val="center"/>
+          </w:tcPr>
+          <w:p>
+            <w:pPr>
+              <w:jc w:val="center"/>
+              <w:cnfStyle w:val="000000100000" w:firstRow="0" w:lastRow="0" w:firstColumn="0" w:lastColumn="0" w:oddVBand="0" w:evenVBand="0" w:oddHBand="1" w:evenHBand="0" w:firstRowFirstColumn="0" w:firstRowLastColumn="0" w:lastRowFirstColumn="0" w:lastRowLastColumn="0"/>
+            </w:pPr>
+            <w:r>
+              <w:t>15/09/2026</w:t>
+            </w:r>
+          </w:p>
+        </w:tc>
+        <w:tc>
+          <w:tcPr>
+            <w:tcW w:w="6359" w:type="dxa"/>
+            <w:vAlign w:val="center"/>
+          </w:tcPr>
+          <w:p>
+            <w:pPr>
+              <w:jc w:val="center"/>
+              <w:cnfStyle w:val="000000100000" w:firstRow="0" w:lastRow="0" w:firstColumn="0" w:lastColumn="0" w:oddVBand="0" w:evenVBand="0" w:oddHBand="1" w:evenHBand="0" w:firstRowFirstColumn="0" w:firstRowLastColumn="0" w:lastRowFirstColumn="0" w:lastRowLastColumn="0"/>
+            </w:pPr>
+            <w:r>
+              <w:t>Corrected example KF status description, orientation uncertainty units and UNIT_ID naming. Added Shotover and GSS lens types.</w:t>
+            </w:r>
+            <w:r>
+              <w:t xml:space="preserve"/>
+            </w:r>
+            <w:r>
+              <w:t/>
+            </w:r>
+            <w:r>
+              <w:t/>
+            </w:r>
+            <w:r>
+              <w:t/>
+            </w:r>
+            <w:r>
+              <w:t xml:space="preserve"/>
+            </w:r>
+            <w:r>
+              <w:t/>
+            </w:r>
+          </w:p>
+        </w:tc>
+        <w:tc>
+          <w:tcPr>
+            <w:tcW w:w="976" w:type="dxa"/>
+            <w:vAlign w:val="center"/>
+          </w:tcPr>
+          <w:p>
+            <w:pPr>
+              <w:jc w:val="center"/>
+              <w:cnfStyle w:val="000000100000" w:firstRow="0" w:lastRow="0" w:firstColumn="0" w:lastColumn="0" w:oddVBand="0" w:evenVBand="0" w:oddHBand="1" w:evenHBand="0" w:firstRowFirstColumn="0" w:firstRowLastColumn="0" w:lastRowFirstColumn="0" w:lastRowLastColumn="0"/>
+            </w:pPr>
+            <w:r>
+              <w:t>JB</w:t>
+            </w:r>
+          </w:p>
+        </w:tc>
+      </w:tr>
     </w:tbl>
     <w:p/>
     <w:p>
@@ -6607,7 +6699,7 @@
             </w:r>
             <w:proofErr w:type="spellEnd"/>
             <w:r>
-              <w:t>/s)</w:t>
+              <w:t>)</w:t>
             </w:r>
           </w:p>
         </w:tc>
@@ -7340,7 +7432,7 @@
               <w:jc w:val="center"/>
             </w:pPr>
             <w:r>
-              <w:t>Bit UNIT_INFO set</w:t>
+              <w:t>Bit UNIT_ID set</w:t>
             </w:r>
           </w:p>
         </w:tc>
@@ -8469,7 +8561,7 @@
               <w:rPr>
                 <w:color w:val="0070C0"/>
               </w:rPr>
-              <w:t>(3), Arri (Pending Support, 4), Zeiss (Pending Support, 5),</w:t>
+              <w:t>(3), Arri (Pending Support, 4), Zeiss (Pending Support, 5), Shotover (6), GSS (7),</w:t>
             </w:r>
             <w:r>
               <w:rPr>
@@ -10844,7 +10936,7 @@
       </w:r>
       <w:proofErr w:type="gramEnd"/>
       <w:r>
-        <w:t xml:space="preserve"> filter status = 0x0235, static initialisation</w:t>
+        <w:t xml:space="preserve"> filter status = 0x0235, ready for motion (0x0234 after masking with 0xE634)</w:t>
       </w:r>
     </w:p>
     <w:p>

</xml_diff>

<commit_message>
Docs: frame rate values per VCU firmware, battery flag 16 is Battery Unavailable
</commit_message>
<xml_diff>
--- a/docs/VIPS+Airpixel output end user documentation.docx
+++ b/docs/VIPS+Airpixel output end user documentation.docx
@@ -2913,7 +2913,7 @@
               <w:cnfStyle w:val="000000100000" w:firstRow="0" w:lastRow="0" w:firstColumn="0" w:lastColumn="0" w:oddVBand="0" w:evenVBand="0" w:oddHBand="1" w:evenHBand="0" w:firstRowFirstColumn="0" w:firstRowLastColumn="0" w:lastRowFirstColumn="0" w:lastRowLastColumn="0"/>
             </w:pPr>
             <w:r>
-              <w:t>Corrected example KF status description, orientation uncertainty units and UNIT_ID naming. Added Shotover and GSS lens types.</w:t>
+              <w:t>Corrected example KF status description, orientation uncertainty units and UNIT_ID naming. Added Shotover and GSS lens types. Frame rate values aligned to VCU firmware. Battery flag (16) redefined as Battery Unavailable.</w:t>
             </w:r>
             <w:r>
               <w:t xml:space="preserve"/>
@@ -8270,13 +8270,13 @@
               <w:rPr>
                 <w:color w:val="0070C0"/>
               </w:rPr>
-              <w:t>Values of 0 - 11 indicate frame rates of None, 23.976, 24, 25, 29.97, 29.97DF, 30, 48, 50, 59.94, 59.94DF, and 60 respectively.</w:t>
-            </w:r>
-            <w:r>
-              <w:rPr>
-                <w:color w:val="0070C0"/>
-              </w:rPr>
-              <w:t xml:space="preserve"> </w:t>
+              <w:t>Values of 0 - 10 indicate frame rates of None, 23.976, 24, 25, 29.97, 30, 47.95, 48, 50, 59.94 and 60 respectively. Drop-frame is not indicated in this field. If zero/none, no sync detected. Other values are reserved.</w:t>
+            </w:r>
+            <w:r>
+              <w:rPr>
+                <w:color w:val="0070C0"/>
+              </w:rPr>
+              <w:t xml:space="preserve"/>
             </w:r>
             <w:r>
               <w:rPr>
@@ -8288,82 +8288,7 @@
               <w:rPr>
                 <w:color w:val="0070C0"/>
               </w:rPr>
-              <w:t>If zero/none, no sync detected</w:t>
-            </w:r>
-          </w:p>
-          <w:p>
-            <w:pPr>
-              <w:rPr>
-                <w:color w:val="0070C0"/>
-                <w:vertAlign w:val="superscript"/>
-              </w:rPr>
-            </w:pPr>
-            <w:r>
-              <w:rPr>
-                <w:color w:val="0070C0"/>
-              </w:rPr>
-              <w:t>If ‘0xF</w:t>
-            </w:r>
-            <w:r>
-              <w:rPr>
-                <w:color w:val="0070C0"/>
-              </w:rPr>
-              <w:t>E</w:t>
-            </w:r>
-            <w:r>
-              <w:rPr>
-                <w:color w:val="0070C0"/>
-              </w:rPr>
-              <w:t>/25</w:t>
-            </w:r>
-            <w:r>
-              <w:rPr>
-                <w:color w:val="0070C0"/>
-              </w:rPr>
-              <w:t>4</w:t>
-            </w:r>
-            <w:r>
-              <w:rPr>
-                <w:color w:val="0070C0"/>
-              </w:rPr>
-              <w:t>’, Unknown Sync Detected</w:t>
-            </w:r>
-          </w:p>
-          <w:p>
-            <w:pPr>
-              <w:rPr>
-                <w:color w:val="0070C0"/>
-              </w:rPr>
-            </w:pPr>
-            <w:r>
-              <w:rPr>
-                <w:color w:val="0070C0"/>
-              </w:rPr>
-              <w:t>If 0xF</w:t>
-            </w:r>
-            <w:r>
-              <w:rPr>
-                <w:color w:val="0070C0"/>
-              </w:rPr>
-              <w:t>F</w:t>
-            </w:r>
-            <w:r>
-              <w:rPr>
-                <w:color w:val="0070C0"/>
-              </w:rPr>
-              <w:t>/25</w:t>
-            </w:r>
-            <w:r>
-              <w:rPr>
-                <w:color w:val="0070C0"/>
-              </w:rPr>
-              <w:t>5</w:t>
-            </w:r>
-            <w:r>
-              <w:rPr>
-                <w:color w:val="0070C0"/>
-              </w:rPr>
-              <w:t>, Free Running at 100hz</w:t>
+              <w:t/>
             </w:r>
           </w:p>
         </w:tc>
@@ -8768,19 +8693,19 @@
               <w:rPr>
                 <w:color w:val="0070C0"/>
               </w:rPr>
-              <w:t xml:space="preserve">16: </w:t>
-            </w:r>
-            <w:r>
-              <w:rPr>
-                <w:color w:val="0070C0"/>
-              </w:rPr>
-              <w:t>Backup-</w:t>
-            </w:r>
-            <w:r>
-              <w:rPr>
-                <w:color w:val="0070C0"/>
-              </w:rPr>
-              <w:t>Battery Charging</w:t>
+              <w:t xml:space="preserve">16: Backup-Battery Unavailable (charge too low or fault)</w:t>
+            </w:r>
+            <w:r>
+              <w:rPr>
+                <w:color w:val="0070C0"/>
+              </w:rPr>
+              <w:t/>
+            </w:r>
+            <w:r>
+              <w:rPr>
+                <w:color w:val="0070C0"/>
+              </w:rPr>
+              <w:t/>
             </w:r>
           </w:p>
           <w:p>

</xml_diff>

<commit_message>
Docs: document the coordinate frame and deprecate the legacy FIZ fields
- Added Coordinate frame section with axis and rotation diagram (rev 1.6)
- X/Y/Z named as the normal position output, FIZ_DATA marked deprecated
- Word: flattened heading indents and refreshed the contents page
</commit_message>
<xml_diff>
--- a/docs/VIPS+Airpixel output end user documentation.docx
+++ b/docs/VIPS+Airpixel output end user documentation.docx
@@ -1,6 +1,6 @@
 
 <file path=word/document.xml><?xml version="1.0" encoding="utf-8"?>
-<w:document xmlns:wpc="http://schemas.microsoft.com/office/word/2010/wordprocessingCanvas" xmlns:cx="http://schemas.microsoft.com/office/drawing/2014/chartex" xmlns:cx1="http://schemas.microsoft.com/office/drawing/2015/9/8/chartex" xmlns:cx2="http://schemas.microsoft.com/office/drawing/2015/10/21/chartex" xmlns:cx3="http://schemas.microsoft.com/office/drawing/2016/5/9/chartex" xmlns:cx4="http://schemas.microsoft.com/office/drawing/2016/5/10/chartex" xmlns:cx5="http://schemas.microsoft.com/office/drawing/2016/5/11/chartex" xmlns:cx6="http://schemas.microsoft.com/office/drawing/2016/5/12/chartex" xmlns:cx7="http://schemas.microsoft.com/office/drawing/2016/5/13/chartex" xmlns:cx8="http://schemas.microsoft.com/office/drawing/2016/5/14/chartex" xmlns:mc="http://schemas.openxmlformats.org/markup-compatibility/2006" xmlns:aink="http://schemas.microsoft.com/office/drawing/2016/ink" xmlns:am3d="http://schemas.microsoft.com/office/drawing/2017/model3d" xmlns:o="urn:schemas-microsoft-com:office:office" xmlns:oel="http://schemas.microsoft.com/office/2019/extlst" xmlns:r="http://schemas.openxmlformats.org/officeDocument/2006/relationships" xmlns:m="http://schemas.openxmlformats.org/officeDocument/2006/math" xmlns:v="urn:schemas-microsoft-com:vml" xmlns:wp14="http://schemas.microsoft.com/office/word/2010/wordprocessingDrawing" xmlns:wp="http://schemas.openxmlformats.org/drawingml/2006/wordprocessingDrawing" xmlns:w10="urn:schemas-microsoft-com:office:word" xmlns:w="http://schemas.openxmlformats.org/wordprocessingml/2006/main" xmlns:w14="http://schemas.microsoft.com/office/word/2010/wordml" xmlns:w15="http://schemas.microsoft.com/office/word/2012/wordml" xmlns:w16cex="http://schemas.microsoft.com/office/word/2018/wordml/cex" xmlns:w16cid="http://schemas.microsoft.com/office/word/2016/wordml/cid" xmlns:w16="http://schemas.microsoft.com/office/word/2018/wordml" xmlns:w16du="http://schemas.microsoft.com/office/word/2023/wordml/word16du" xmlns:w16sdtdh="http://schemas.microsoft.com/office/word/2020/wordml/sdtdatahash" xmlns:w16se="http://schemas.microsoft.com/office/word/2015/wordml/symex" xmlns:wpg="http://schemas.microsoft.com/office/word/2010/wordprocessingGroup" xmlns:wpi="http://schemas.microsoft.com/office/word/2010/wordprocessingInk" xmlns:wne="http://schemas.microsoft.com/office/word/2006/wordml" xmlns:wps="http://schemas.microsoft.com/office/word/2010/wordprocessingShape" mc:Ignorable="w14 w15 w16se w16cid w16 w16cex w16sdtdh w16du wp14">
+<w:document xmlns:wpc="http://schemas.microsoft.com/office/word/2010/wordprocessingCanvas" xmlns:cx="http://schemas.microsoft.com/office/drawing/2014/chartex" xmlns:cx1="http://schemas.microsoft.com/office/drawing/2015/9/8/chartex" xmlns:cx2="http://schemas.microsoft.com/office/drawing/2015/10/21/chartex" xmlns:cx3="http://schemas.microsoft.com/office/drawing/2016/5/9/chartex" xmlns:cx4="http://schemas.microsoft.com/office/drawing/2016/5/10/chartex" xmlns:cx5="http://schemas.microsoft.com/office/drawing/2016/5/11/chartex" xmlns:cx6="http://schemas.microsoft.com/office/drawing/2016/5/12/chartex" xmlns:cx7="http://schemas.microsoft.com/office/drawing/2016/5/13/chartex" xmlns:cx8="http://schemas.microsoft.com/office/drawing/2016/5/14/chartex" xmlns:mc="http://schemas.openxmlformats.org/markup-compatibility/2006" xmlns:aink="http://schemas.microsoft.com/office/drawing/2016/ink" xmlns:am3d="http://schemas.microsoft.com/office/drawing/2017/model3d" xmlns:o="urn:schemas-microsoft-com:office:office" xmlns:oel="http://schemas.microsoft.com/office/2019/extlst" xmlns:r="http://schemas.openxmlformats.org/officeDocument/2006/relationships" xmlns:m="http://schemas.openxmlformats.org/officeDocument/2006/math" xmlns:v="urn:schemas-microsoft-com:vml" xmlns:wp14="http://schemas.microsoft.com/office/word/2010/wordprocessingDrawing" xmlns:wp="http://schemas.openxmlformats.org/drawingml/2006/wordprocessingDrawing" xmlns:w10="urn:schemas-microsoft-com:office:word" xmlns:w="http://schemas.openxmlformats.org/wordprocessingml/2006/main" xmlns:w14="http://schemas.microsoft.com/office/word/2010/wordml" xmlns:w15="http://schemas.microsoft.com/office/word/2012/wordml" xmlns:w16cex="http://schemas.microsoft.com/office/word/2018/wordml/cex" xmlns:w16cid="http://schemas.microsoft.com/office/word/2016/wordml/cid" xmlns:w16="http://schemas.microsoft.com/office/word/2018/wordml" xmlns:w16du="http://schemas.microsoft.com/office/word/2023/wordml/word16du" xmlns:w16sdtdh="http://schemas.microsoft.com/office/word/2020/wordml/sdtdatahash" xmlns:w16sdtfl="http://schemas.microsoft.com/office/word/2024/wordml/sdtformatlock" xmlns:w16se="http://schemas.microsoft.com/office/word/2015/wordml/symex" xmlns:wpg="http://schemas.microsoft.com/office/word/2010/wordprocessingGroup" xmlns:wpi="http://schemas.microsoft.com/office/word/2010/wordprocessingInk" xmlns:wne="http://schemas.microsoft.com/office/word/2006/wordml" xmlns:wps="http://schemas.microsoft.com/office/word/2010/wordprocessingShape" mc:Ignorable="w14 w15 w16se w16cid w16 w16cex w16sdtdh w16sdtfl w16du wp14">
   <w:body>
     <w:p>
       <w:pPr>
@@ -73,7 +73,7 @@
           <w:r>
             <w:fldChar w:fldCharType="separate"/>
           </w:r>
-          <w:hyperlink w:anchor="_Toc177630128" w:history="1">
+          <w:hyperlink w:anchor="_Toc240447979" w:history="1">
             <w:r>
               <w:rPr>
                 <w:rStyle w:val="Hyperlink"/>
@@ -119,7 +119,7 @@
                 <w:noProof/>
                 <w:webHidden/>
               </w:rPr>
-              <w:instrText xml:space="preserve"> PAGEREF _Toc177630128 \h </w:instrText>
+              <w:instrText xml:space="preserve"> PAGEREF _Toc240447979 \h </w:instrText>
             </w:r>
             <w:r>
               <w:rPr>
@@ -167,7 +167,7 @@
               <w14:ligatures w14:val="standardContextual"/>
             </w:rPr>
           </w:pPr>
-          <w:hyperlink w:anchor="_Toc177630129" w:history="1">
+          <w:hyperlink w:anchor="_Toc240447980" w:history="1">
             <w:r>
               <w:rPr>
                 <w:rStyle w:val="Hyperlink"/>
@@ -213,7 +213,7 @@
                 <w:noProof/>
                 <w:webHidden/>
               </w:rPr>
-              <w:instrText xml:space="preserve"> PAGEREF _Toc177630129 \h </w:instrText>
+              <w:instrText xml:space="preserve"> PAGEREF _Toc240447980 \h </w:instrText>
             </w:r>
             <w:r>
               <w:rPr>
@@ -261,7 +261,7 @@
               <w14:ligatures w14:val="standardContextual"/>
             </w:rPr>
           </w:pPr>
-          <w:hyperlink w:anchor="_Toc177630130" w:history="1">
+          <w:hyperlink w:anchor="_Toc240447981" w:history="1">
             <w:r>
               <w:rPr>
                 <w:rStyle w:val="Hyperlink"/>
@@ -307,7 +307,7 @@
                 <w:noProof/>
                 <w:webHidden/>
               </w:rPr>
-              <w:instrText xml:space="preserve"> PAGEREF _Toc177630130 \h </w:instrText>
+              <w:instrText xml:space="preserve"> PAGEREF _Toc240447981 \h </w:instrText>
             </w:r>
             <w:r>
               <w:rPr>
@@ -355,7 +355,7 @@
               <w14:ligatures w14:val="standardContextual"/>
             </w:rPr>
           </w:pPr>
-          <w:hyperlink w:anchor="_Toc177630134" w:history="1">
+          <w:hyperlink w:anchor="_Toc240447985" w:history="1">
             <w:r>
               <w:rPr>
                 <w:rStyle w:val="Hyperlink"/>
@@ -401,7 +401,7 @@
                 <w:noProof/>
                 <w:webHidden/>
               </w:rPr>
-              <w:instrText xml:space="preserve"> PAGEREF _Toc177630134 \h </w:instrText>
+              <w:instrText xml:space="preserve"> PAGEREF _Toc240447985 \h </w:instrText>
             </w:r>
             <w:r>
               <w:rPr>
@@ -449,7 +449,7 @@
               <w14:ligatures w14:val="standardContextual"/>
             </w:rPr>
           </w:pPr>
-          <w:hyperlink w:anchor="_Toc177630135" w:history="1">
+          <w:hyperlink w:anchor="_Toc240447986" w:history="1">
             <w:r>
               <w:rPr>
                 <w:rStyle w:val="Hyperlink"/>
@@ -495,7 +495,7 @@
                 <w:noProof/>
                 <w:webHidden/>
               </w:rPr>
-              <w:instrText xml:space="preserve"> PAGEREF _Toc177630135 \h </w:instrText>
+              <w:instrText xml:space="preserve"> PAGEREF _Toc240447986 \h </w:instrText>
             </w:r>
             <w:r>
               <w:rPr>
@@ -543,7 +543,7 @@
               <w14:ligatures w14:val="standardContextual"/>
             </w:rPr>
           </w:pPr>
-          <w:hyperlink w:anchor="_Toc177630136" w:history="1">
+          <w:hyperlink w:anchor="_Toc240447987" w:history="1">
             <w:r>
               <w:rPr>
                 <w:rStyle w:val="Hyperlink"/>
@@ -589,7 +589,7 @@
                 <w:noProof/>
                 <w:webHidden/>
               </w:rPr>
-              <w:instrText xml:space="preserve"> PAGEREF _Toc177630136 \h </w:instrText>
+              <w:instrText xml:space="preserve"> PAGEREF _Toc240447987 \h </w:instrText>
             </w:r>
             <w:r>
               <w:rPr>
@@ -637,7 +637,7 @@
               <w14:ligatures w14:val="standardContextual"/>
             </w:rPr>
           </w:pPr>
-          <w:hyperlink w:anchor="_Toc177630137" w:history="1">
+          <w:hyperlink w:anchor="_Toc240447988" w:history="1">
             <w:r>
               <w:rPr>
                 <w:rStyle w:val="Hyperlink"/>
@@ -662,7 +662,7 @@
                 <w:rStyle w:val="Hyperlink"/>
                 <w:noProof/>
               </w:rPr>
-              <w:t>Options mask</w:t>
+              <w:t>Coordinate frame</w:t>
             </w:r>
             <w:r>
               <w:rPr>
@@ -683,7 +683,7 @@
                 <w:noProof/>
                 <w:webHidden/>
               </w:rPr>
-              <w:instrText xml:space="preserve"> PAGEREF _Toc177630137 \h </w:instrText>
+              <w:instrText xml:space="preserve"> PAGEREF _Toc240447988 \h </w:instrText>
             </w:r>
             <w:r>
               <w:rPr>
@@ -703,7 +703,7 @@
                 <w:noProof/>
                 <w:webHidden/>
               </w:rPr>
-              <w:t>3</w:t>
+              <w:t>4</w:t>
             </w:r>
             <w:r>
               <w:rPr>
@@ -731,7 +731,7 @@
               <w14:ligatures w14:val="standardContextual"/>
             </w:rPr>
           </w:pPr>
-          <w:hyperlink w:anchor="_Toc177630138" w:history="1">
+          <w:hyperlink w:anchor="_Toc240447989" w:history="1">
             <w:r>
               <w:rPr>
                 <w:rStyle w:val="Hyperlink"/>
@@ -756,7 +756,7 @@
                 <w:rStyle w:val="Hyperlink"/>
                 <w:noProof/>
               </w:rPr>
-              <w:t>Details of output fields</w:t>
+              <w:t>Options mask</w:t>
             </w:r>
             <w:r>
               <w:rPr>
@@ -777,7 +777,7 @@
                 <w:noProof/>
                 <w:webHidden/>
               </w:rPr>
-              <w:instrText xml:space="preserve"> PAGEREF _Toc177630138 \h </w:instrText>
+              <w:instrText xml:space="preserve"> PAGEREF _Toc240447989 \h </w:instrText>
             </w:r>
             <w:r>
               <w:rPr>
@@ -797,7 +797,7 @@
                 <w:noProof/>
                 <w:webHidden/>
               </w:rPr>
-              <w:t>5</w:t>
+              <w:t>4</w:t>
             </w:r>
             <w:r>
               <w:rPr>
@@ -825,7 +825,7 @@
               <w14:ligatures w14:val="standardContextual"/>
             </w:rPr>
           </w:pPr>
-          <w:hyperlink w:anchor="_Toc177630139" w:history="1">
+          <w:hyperlink w:anchor="_Toc240447990" w:history="1">
             <w:r>
               <w:rPr>
                 <w:rStyle w:val="Hyperlink"/>
@@ -850,7 +850,7 @@
                 <w:rStyle w:val="Hyperlink"/>
                 <w:noProof/>
               </w:rPr>
-              <w:t>Kalman Filter Status</w:t>
+              <w:t>Details of output fields</w:t>
             </w:r>
             <w:r>
               <w:rPr>
@@ -871,7 +871,7 @@
                 <w:noProof/>
                 <w:webHidden/>
               </w:rPr>
-              <w:instrText xml:space="preserve"> PAGEREF _Toc177630139 \h </w:instrText>
+              <w:instrText xml:space="preserve"> PAGEREF _Toc240447990 \h </w:instrText>
             </w:r>
             <w:r>
               <w:rPr>
@@ -891,7 +891,7 @@
                 <w:noProof/>
                 <w:webHidden/>
               </w:rPr>
-              <w:t>11</w:t>
+              <w:t>6</w:t>
             </w:r>
             <w:r>
               <w:rPr>
@@ -919,7 +919,7 @@
               <w14:ligatures w14:val="standardContextual"/>
             </w:rPr>
           </w:pPr>
-          <w:hyperlink w:anchor="_Toc177630140" w:history="1">
+          <w:hyperlink w:anchor="_Toc240447991" w:history="1">
             <w:r>
               <w:rPr>
                 <w:rStyle w:val="Hyperlink"/>
@@ -944,7 +944,7 @@
                 <w:rStyle w:val="Hyperlink"/>
                 <w:noProof/>
               </w:rPr>
-              <w:t>Checksum</w:t>
+              <w:t>Kalman Filter Status</w:t>
             </w:r>
             <w:r>
               <w:rPr>
@@ -965,7 +965,7 @@
                 <w:noProof/>
                 <w:webHidden/>
               </w:rPr>
-              <w:instrText xml:space="preserve"> PAGEREF _Toc177630140 \h </w:instrText>
+              <w:instrText xml:space="preserve"> PAGEREF _Toc240447991 \h </w:instrText>
             </w:r>
             <w:r>
               <w:rPr>
@@ -1013,7 +1013,7 @@
               <w14:ligatures w14:val="standardContextual"/>
             </w:rPr>
           </w:pPr>
-          <w:hyperlink w:anchor="_Toc177630141" w:history="1">
+          <w:hyperlink w:anchor="_Toc240447992" w:history="1">
             <w:r>
               <w:rPr>
                 <w:rStyle w:val="Hyperlink"/>
@@ -1038,6 +1038,100 @@
                 <w:rStyle w:val="Hyperlink"/>
                 <w:noProof/>
               </w:rPr>
+              <w:t>Checksum</w:t>
+            </w:r>
+            <w:r>
+              <w:rPr>
+                <w:noProof/>
+                <w:webHidden/>
+              </w:rPr>
+              <w:tab/>
+            </w:r>
+            <w:r>
+              <w:rPr>
+                <w:noProof/>
+                <w:webHidden/>
+              </w:rPr>
+              <w:fldChar w:fldCharType="begin"/>
+            </w:r>
+            <w:r>
+              <w:rPr>
+                <w:noProof/>
+                <w:webHidden/>
+              </w:rPr>
+              <w:instrText xml:space="preserve"> PAGEREF _Toc240447992 \h </w:instrText>
+            </w:r>
+            <w:r>
+              <w:rPr>
+                <w:noProof/>
+                <w:webHidden/>
+              </w:rPr>
+            </w:r>
+            <w:r>
+              <w:rPr>
+                <w:noProof/>
+                <w:webHidden/>
+              </w:rPr>
+              <w:fldChar w:fldCharType="separate"/>
+            </w:r>
+            <w:r>
+              <w:rPr>
+                <w:noProof/>
+                <w:webHidden/>
+              </w:rPr>
+              <w:t>13</w:t>
+            </w:r>
+            <w:r>
+              <w:rPr>
+                <w:noProof/>
+                <w:webHidden/>
+              </w:rPr>
+              <w:fldChar w:fldCharType="end"/>
+            </w:r>
+          </w:hyperlink>
+        </w:p>
+        <w:p>
+          <w:pPr>
+            <w:pStyle w:val="TOC3"/>
+            <w:tabs>
+              <w:tab w:val="left" w:pos="1440"/>
+              <w:tab w:val="right" w:leader="dot" w:pos="9016"/>
+            </w:tabs>
+            <w:rPr>
+              <w:rFonts w:eastAsiaTheme="minorEastAsia"/>
+              <w:noProof/>
+              <w:kern w:val="2"/>
+              <w:sz w:val="24"/>
+              <w:szCs w:val="24"/>
+              <w:lang w:eastAsia="en-GB"/>
+              <w14:ligatures w14:val="standardContextual"/>
+            </w:rPr>
+          </w:pPr>
+          <w:hyperlink w:anchor="_Toc240447993" w:history="1">
+            <w:r>
+              <w:rPr>
+                <w:rStyle w:val="Hyperlink"/>
+                <w:noProof/>
+              </w:rPr>
+              <w:t>2.1.9.</w:t>
+            </w:r>
+            <w:r>
+              <w:rPr>
+                <w:rFonts w:eastAsiaTheme="minorEastAsia"/>
+                <w:noProof/>
+                <w:kern w:val="2"/>
+                <w:sz w:val="24"/>
+                <w:szCs w:val="24"/>
+                <w:lang w:eastAsia="en-GB"/>
+                <w14:ligatures w14:val="standardContextual"/>
+              </w:rPr>
+              <w:tab/>
+            </w:r>
+            <w:r>
+              <w:rPr>
+                <w:rStyle w:val="Hyperlink"/>
+                <w:noProof/>
+              </w:rPr>
               <w:t>Example data</w:t>
             </w:r>
             <w:r>
@@ -1059,7 +1153,7 @@
                 <w:noProof/>
                 <w:webHidden/>
               </w:rPr>
-              <w:instrText xml:space="preserve"> PAGEREF _Toc177630141 \h </w:instrText>
+              <w:instrText xml:space="preserve"> PAGEREF _Toc240447993 \h </w:instrText>
             </w:r>
             <w:r>
               <w:rPr>
@@ -1079,7 +1173,7 @@
                 <w:noProof/>
                 <w:webHidden/>
               </w:rPr>
-              <w:t>12</w:t>
+              <w:t>13</w:t>
             </w:r>
             <w:r>
               <w:rPr>
@@ -1107,7 +1201,7 @@
               <w14:ligatures w14:val="standardContextual"/>
             </w:rPr>
           </w:pPr>
-          <w:hyperlink w:anchor="_Toc177630142" w:history="1">
+          <w:hyperlink w:anchor="_Toc240447994" w:history="1">
             <w:r>
               <w:rPr>
                 <w:rStyle w:val="Hyperlink"/>
@@ -1153,7 +1247,7 @@
                 <w:noProof/>
                 <w:webHidden/>
               </w:rPr>
-              <w:instrText xml:space="preserve"> PAGEREF _Toc177630142 \h </w:instrText>
+              <w:instrText xml:space="preserve"> PAGEREF _Toc240447994 \h </w:instrText>
             </w:r>
             <w:r>
               <w:rPr>
@@ -1173,7 +1267,7 @@
                 <w:noProof/>
                 <w:webHidden/>
               </w:rPr>
-              <w:t>12</w:t>
+              <w:t>14</w:t>
             </w:r>
             <w:r>
               <w:rPr>
@@ -1201,7 +1295,7 @@
               <w14:ligatures w14:val="standardContextual"/>
             </w:rPr>
           </w:pPr>
-          <w:hyperlink w:anchor="_Toc177630143" w:history="1">
+          <w:hyperlink w:anchor="_Toc240447995" w:history="1">
             <w:r>
               <w:rPr>
                 <w:rStyle w:val="Hyperlink"/>
@@ -1247,7 +1341,7 @@
                 <w:noProof/>
                 <w:webHidden/>
               </w:rPr>
-              <w:instrText xml:space="preserve"> PAGEREF _Toc177630143 \h </w:instrText>
+              <w:instrText xml:space="preserve"> PAGEREF _Toc240447995 \h </w:instrText>
             </w:r>
             <w:r>
               <w:rPr>
@@ -1267,7 +1361,7 @@
                 <w:noProof/>
                 <w:webHidden/>
               </w:rPr>
-              <w:t>14</w:t>
+              <w:t>15</w:t>
             </w:r>
             <w:r>
               <w:rPr>
@@ -1295,7 +1389,7 @@
               <w14:ligatures w14:val="standardContextual"/>
             </w:rPr>
           </w:pPr>
-          <w:hyperlink w:anchor="_Toc177630144" w:history="1">
+          <w:hyperlink w:anchor="_Toc240447996" w:history="1">
             <w:r>
               <w:rPr>
                 <w:rStyle w:val="Hyperlink"/>
@@ -1341,7 +1435,7 @@
                 <w:noProof/>
                 <w:webHidden/>
               </w:rPr>
-              <w:instrText xml:space="preserve"> PAGEREF _Toc177630144 \h </w:instrText>
+              <w:instrText xml:space="preserve"> PAGEREF _Toc240447996 \h </w:instrText>
             </w:r>
             <w:r>
               <w:rPr>
@@ -1361,7 +1455,7 @@
                 <w:noProof/>
                 <w:webHidden/>
               </w:rPr>
-              <w:t>14</w:t>
+              <w:t>15</w:t>
             </w:r>
             <w:r>
               <w:rPr>
@@ -1389,7 +1483,7 @@
               <w14:ligatures w14:val="standardContextual"/>
             </w:rPr>
           </w:pPr>
-          <w:hyperlink w:anchor="_Toc177630145" w:history="1">
+          <w:hyperlink w:anchor="_Toc240447997" w:history="1">
             <w:r>
               <w:rPr>
                 <w:rStyle w:val="Hyperlink"/>
@@ -1435,7 +1529,7 @@
                 <w:noProof/>
                 <w:webHidden/>
               </w:rPr>
-              <w:instrText xml:space="preserve"> PAGEREF _Toc177630145 \h </w:instrText>
+              <w:instrText xml:space="preserve"> PAGEREF _Toc240447997 \h </w:instrText>
             </w:r>
             <w:r>
               <w:rPr>
@@ -1455,7 +1549,7 @@
                 <w:noProof/>
                 <w:webHidden/>
               </w:rPr>
-              <w:t>14</w:t>
+              <w:t>15</w:t>
             </w:r>
             <w:r>
               <w:rPr>
@@ -1483,7 +1577,7 @@
               <w14:ligatures w14:val="standardContextual"/>
             </w:rPr>
           </w:pPr>
-          <w:hyperlink w:anchor="_Toc177630146" w:history="1">
+          <w:hyperlink w:anchor="_Toc240447998" w:history="1">
             <w:r>
               <w:rPr>
                 <w:rStyle w:val="Hyperlink"/>
@@ -1529,7 +1623,7 @@
                 <w:noProof/>
                 <w:webHidden/>
               </w:rPr>
-              <w:instrText xml:space="preserve"> PAGEREF _Toc177630146 \h </w:instrText>
+              <w:instrText xml:space="preserve"> PAGEREF _Toc240447998 \h </w:instrText>
             </w:r>
             <w:r>
               <w:rPr>
@@ -1549,7 +1643,7 @@
                 <w:noProof/>
                 <w:webHidden/>
               </w:rPr>
-              <w:t>14</w:t>
+              <w:t>15</w:t>
             </w:r>
             <w:r>
               <w:rPr>
@@ -1577,7 +1671,7 @@
               <w14:ligatures w14:val="standardContextual"/>
             </w:rPr>
           </w:pPr>
-          <w:hyperlink w:anchor="_Toc177630147" w:history="1">
+          <w:hyperlink w:anchor="_Toc240447999" w:history="1">
             <w:r>
               <w:rPr>
                 <w:rStyle w:val="Hyperlink"/>
@@ -1623,7 +1717,7 @@
                 <w:noProof/>
                 <w:webHidden/>
               </w:rPr>
-              <w:instrText xml:space="preserve"> PAGEREF _Toc177630147 \h </w:instrText>
+              <w:instrText xml:space="preserve"> PAGEREF _Toc240447999 \h </w:instrText>
             </w:r>
             <w:r>
               <w:rPr>
@@ -1643,7 +1737,7 @@
                 <w:noProof/>
                 <w:webHidden/>
               </w:rPr>
-              <w:t>14</w:t>
+              <w:t>15</w:t>
             </w:r>
             <w:r>
               <w:rPr>
@@ -1671,7 +1765,7 @@
               <w14:ligatures w14:val="standardContextual"/>
             </w:rPr>
           </w:pPr>
-          <w:hyperlink w:anchor="_Toc177630148" w:history="1">
+          <w:hyperlink w:anchor="_Toc240448000" w:history="1">
             <w:r>
               <w:rPr>
                 <w:rStyle w:val="Hyperlink"/>
@@ -1717,7 +1811,7 @@
                 <w:noProof/>
                 <w:webHidden/>
               </w:rPr>
-              <w:instrText xml:space="preserve"> PAGEREF _Toc177630148 \h </w:instrText>
+              <w:instrText xml:space="preserve"> PAGEREF _Toc240448000 \h </w:instrText>
             </w:r>
             <w:r>
               <w:rPr>
@@ -1737,7 +1831,7 @@
                 <w:noProof/>
                 <w:webHidden/>
               </w:rPr>
-              <w:t>15</w:t>
+              <w:t>16</w:t>
             </w:r>
             <w:r>
               <w:rPr>
@@ -1765,7 +1859,7 @@
               <w14:ligatures w14:val="standardContextual"/>
             </w:rPr>
           </w:pPr>
-          <w:hyperlink w:anchor="_Toc177630149" w:history="1">
+          <w:hyperlink w:anchor="_Toc240448001" w:history="1">
             <w:r>
               <w:rPr>
                 <w:rStyle w:val="Hyperlink"/>
@@ -1811,7 +1905,7 @@
                 <w:noProof/>
                 <w:webHidden/>
               </w:rPr>
-              <w:instrText xml:space="preserve"> PAGEREF _Toc177630149 \h </w:instrText>
+              <w:instrText xml:space="preserve"> PAGEREF _Toc240448001 \h </w:instrText>
             </w:r>
             <w:r>
               <w:rPr>
@@ -1831,7 +1925,7 @@
                 <w:noProof/>
                 <w:webHidden/>
               </w:rPr>
-              <w:t>15</w:t>
+              <w:t>16</w:t>
             </w:r>
             <w:r>
               <w:rPr>
@@ -1859,7 +1953,7 @@
               <w14:ligatures w14:val="standardContextual"/>
             </w:rPr>
           </w:pPr>
-          <w:hyperlink w:anchor="_Toc177630150" w:history="1">
+          <w:hyperlink w:anchor="_Toc240448002" w:history="1">
             <w:r>
               <w:rPr>
                 <w:rStyle w:val="Hyperlink"/>
@@ -1905,7 +1999,7 @@
                 <w:noProof/>
                 <w:webHidden/>
               </w:rPr>
-              <w:instrText xml:space="preserve"> PAGEREF _Toc177630150 \h </w:instrText>
+              <w:instrText xml:space="preserve"> PAGEREF _Toc240448002 \h </w:instrText>
             </w:r>
             <w:r>
               <w:rPr>
@@ -1925,7 +2019,7 @@
                 <w:noProof/>
                 <w:webHidden/>
               </w:rPr>
-              <w:t>15</w:t>
+              <w:t>16</w:t>
             </w:r>
             <w:r>
               <w:rPr>
@@ -1953,7 +2047,7 @@
               <w14:ligatures w14:val="standardContextual"/>
             </w:rPr>
           </w:pPr>
-          <w:hyperlink w:anchor="_Toc177630151" w:history="1">
+          <w:hyperlink w:anchor="_Toc240448003" w:history="1">
             <w:r>
               <w:rPr>
                 <w:rStyle w:val="Hyperlink"/>
@@ -1999,7 +2093,7 @@
                 <w:noProof/>
                 <w:webHidden/>
               </w:rPr>
-              <w:instrText xml:space="preserve"> PAGEREF _Toc177630151 \h </w:instrText>
+              <w:instrText xml:space="preserve"> PAGEREF _Toc240448003 \h </w:instrText>
             </w:r>
             <w:r>
               <w:rPr>
@@ -2019,7 +2113,7 @@
                 <w:noProof/>
                 <w:webHidden/>
               </w:rPr>
-              <w:t>15</w:t>
+              <w:t>16</w:t>
             </w:r>
             <w:r>
               <w:rPr>
@@ -2047,7 +2141,7 @@
               <w14:ligatures w14:val="standardContextual"/>
             </w:rPr>
           </w:pPr>
-          <w:hyperlink w:anchor="_Toc177630152" w:history="1">
+          <w:hyperlink w:anchor="_Toc240448004" w:history="1">
             <w:r>
               <w:rPr>
                 <w:rStyle w:val="Hyperlink"/>
@@ -2093,7 +2187,7 @@
                 <w:noProof/>
                 <w:webHidden/>
               </w:rPr>
-              <w:instrText xml:space="preserve"> PAGEREF _Toc177630152 \h </w:instrText>
+              <w:instrText xml:space="preserve"> PAGEREF _Toc240448004 \h </w:instrText>
             </w:r>
             <w:r>
               <w:rPr>
@@ -2113,7 +2207,7 @@
                 <w:noProof/>
                 <w:webHidden/>
               </w:rPr>
-              <w:t>16</w:t>
+              <w:t>17</w:t>
             </w:r>
             <w:r>
               <w:rPr>
@@ -2141,7 +2235,7 @@
               <w14:ligatures w14:val="standardContextual"/>
             </w:rPr>
           </w:pPr>
-          <w:hyperlink w:anchor="_Toc177630153" w:history="1">
+          <w:hyperlink w:anchor="_Toc240448005" w:history="1">
             <w:r>
               <w:rPr>
                 <w:rStyle w:val="Hyperlink"/>
@@ -2187,7 +2281,7 @@
                 <w:noProof/>
                 <w:webHidden/>
               </w:rPr>
-              <w:instrText xml:space="preserve"> PAGEREF _Toc177630153 \h </w:instrText>
+              <w:instrText xml:space="preserve"> PAGEREF _Toc240448005 \h </w:instrText>
             </w:r>
             <w:r>
               <w:rPr>
@@ -2207,7 +2301,7 @@
                 <w:noProof/>
                 <w:webHidden/>
               </w:rPr>
-              <w:t>16</w:t>
+              <w:t>17</w:t>
             </w:r>
             <w:r>
               <w:rPr>
@@ -2235,7 +2329,7 @@
               <w14:ligatures w14:val="standardContextual"/>
             </w:rPr>
           </w:pPr>
-          <w:hyperlink w:anchor="_Toc177630154" w:history="1">
+          <w:hyperlink w:anchor="_Toc240448006" w:history="1">
             <w:r>
               <w:rPr>
                 <w:rStyle w:val="Hyperlink"/>
@@ -2281,7 +2375,7 @@
                 <w:noProof/>
                 <w:webHidden/>
               </w:rPr>
-              <w:instrText xml:space="preserve"> PAGEREF _Toc177630154 \h </w:instrText>
+              <w:instrText xml:space="preserve"> PAGEREF _Toc240448006 \h </w:instrText>
             </w:r>
             <w:r>
               <w:rPr>
@@ -2301,7 +2395,7 @@
                 <w:noProof/>
                 <w:webHidden/>
               </w:rPr>
-              <w:t>16</w:t>
+              <w:t>17</w:t>
             </w:r>
             <w:r>
               <w:rPr>
@@ -2331,7 +2425,7 @@
       </w:pPr>
       <w:bookmarkStart w:id="0" w:name="_Toc122445514"/>
       <w:bookmarkStart w:id="1" w:name="_Toc1145122854"/>
-      <w:bookmarkStart w:id="2" w:name="_Toc177630128"/>
+      <w:bookmarkStart w:id="2" w:name="_Toc240447979"/>
       <w:r>
         <w:lastRenderedPageBreak/>
         <w:t>Revision History</w:t>
@@ -2861,6 +2955,79 @@
       </w:tr>
       <w:tr>
         <w:trPr>
+          <w:trHeight w:val="375"/>
+        </w:trPr>
+        <w:tc>
+          <w:tcPr>
+            <w:cnfStyle w:val="001000000000" w:firstRow="0" w:lastRow="0" w:firstColumn="1" w:lastColumn="0" w:oddVBand="0" w:evenVBand="0" w:oddHBand="0" w:evenHBand="0" w:firstRowFirstColumn="0" w:firstRowLastColumn="0" w:lastRowFirstColumn="0" w:lastRowLastColumn="0"/>
+            <w:tcW w:w="1050" w:type="dxa"/>
+            <w:vAlign w:val="center"/>
+          </w:tcPr>
+          <w:p>
+            <w:pPr>
+              <w:jc w:val="center"/>
+              <w:rPr>
+                <w:b w:val="0"/>
+                <w:bCs w:val="0"/>
+              </w:rPr>
+            </w:pPr>
+            <w:r>
+              <w:rPr>
+                <w:b w:val="0"/>
+                <w:bCs w:val="0"/>
+              </w:rPr>
+              <w:t>1.5</w:t>
+            </w:r>
+          </w:p>
+        </w:tc>
+        <w:tc>
+          <w:tcPr>
+            <w:tcW w:w="1395" w:type="dxa"/>
+            <w:vAlign w:val="center"/>
+          </w:tcPr>
+          <w:p>
+            <w:pPr>
+              <w:jc w:val="center"/>
+              <w:cnfStyle w:val="000000000000" w:firstRow="0" w:lastRow="0" w:firstColumn="0" w:lastColumn="0" w:oddVBand="0" w:evenVBand="0" w:oddHBand="0" w:evenHBand="0" w:firstRowFirstColumn="0" w:firstRowLastColumn="0" w:lastRowFirstColumn="0" w:lastRowLastColumn="0"/>
+            </w:pPr>
+            <w:r>
+              <w:t>15/09/2026</w:t>
+            </w:r>
+          </w:p>
+        </w:tc>
+        <w:tc>
+          <w:tcPr>
+            <w:tcW w:w="6359" w:type="dxa"/>
+            <w:vAlign w:val="center"/>
+          </w:tcPr>
+          <w:p>
+            <w:pPr>
+              <w:jc w:val="center"/>
+              <w:cnfStyle w:val="000000000000" w:firstRow="0" w:lastRow="0" w:firstColumn="0" w:lastColumn="0" w:oddVBand="0" w:evenVBand="0" w:oddHBand="0" w:evenHBand="0" w:firstRowFirstColumn="0" w:firstRowLastColumn="0" w:lastRowFirstColumn="0" w:lastRowLastColumn="0"/>
+            </w:pPr>
+            <w:r>
+              <w:t>Corrected example KF status description, orientation uncertainty units and UNIT_ID naming. Added Shotover and GSS lens types. Frame rate values aligned to VCU firmware. Battery flag (16) redefined as Battery Unavailable.</w:t>
+            </w:r>
+          </w:p>
+        </w:tc>
+        <w:tc>
+          <w:tcPr>
+            <w:tcW w:w="976" w:type="dxa"/>
+            <w:vAlign w:val="center"/>
+          </w:tcPr>
+          <w:p>
+            <w:pPr>
+              <w:jc w:val="center"/>
+              <w:cnfStyle w:val="000000000000" w:firstRow="0" w:lastRow="0" w:firstColumn="0" w:lastColumn="0" w:oddVBand="0" w:evenVBand="0" w:oddHBand="0" w:evenHBand="0" w:firstRowFirstColumn="0" w:firstRowLastColumn="0" w:lastRowFirstColumn="0" w:lastRowLastColumn="0"/>
+            </w:pPr>
+            <w:r>
+              <w:t>JB</w:t>
+            </w:r>
+          </w:p>
+        </w:tc>
+      </w:tr>
+      <w:tr>
+        <w:trPr>
           <w:cnfStyle w:val="000000100000" w:firstRow="0" w:lastRow="0" w:firstColumn="0" w:lastColumn="0" w:oddVBand="0" w:evenVBand="0" w:oddHBand="1" w:evenHBand="0" w:firstRowFirstColumn="0" w:firstRowLastColumn="0" w:lastRowFirstColumn="0" w:lastRowLastColumn="0"/>
           <w:trHeight w:val="375"/>
         </w:trPr>
@@ -2883,7 +3050,7 @@
                 <w:b w:val="0"/>
                 <w:bCs w:val="0"/>
               </w:rPr>
-              <w:t>1.5</w:t>
+              <w:t>1.6</w:t>
             </w:r>
           </w:p>
         </w:tc>
@@ -2913,25 +3080,7 @@
               <w:cnfStyle w:val="000000100000" w:firstRow="0" w:lastRow="0" w:firstColumn="0" w:lastColumn="0" w:oddVBand="0" w:evenVBand="0" w:oddHBand="1" w:evenHBand="0" w:firstRowFirstColumn="0" w:firstRowLastColumn="0" w:lastRowFirstColumn="0" w:lastRowLastColumn="0"/>
             </w:pPr>
             <w:r>
-              <w:t>Corrected example KF status description, orientation uncertainty units and UNIT_ID naming. Added Shotover and GSS lens types. Frame rate values aligned to VCU firmware. Battery flag (16) redefined as Battery Unavailable.</w:t>
-            </w:r>
-            <w:r>
-              <w:t xml:space="preserve"/>
-            </w:r>
-            <w:r>
-              <w:t/>
-            </w:r>
-            <w:r>
-              <w:t/>
-            </w:r>
-            <w:r>
-              <w:t/>
-            </w:r>
-            <w:r>
-              <w:t xml:space="preserve"/>
-            </w:r>
-            <w:r>
-              <w:t/>
+              <w:t>Added Coordinate frame section with axis and rotation diagram, clarifying that local X/Y/Z are the normal output and defining the positive roll, pitch and yaw directions. Marked the FIZ_DATA fields as deprecated in favour of FIZ_EXTENDED.</w:t>
             </w:r>
           </w:p>
         </w:tc>
@@ -2957,7 +3106,7 @@
       <w:pPr>
         <w:pStyle w:val="Heading1"/>
       </w:pPr>
-      <w:bookmarkStart w:id="3" w:name="_Toc177630129"/>
+      <w:bookmarkStart w:id="3" w:name="_Toc240447980"/>
       <w:r>
         <w:lastRenderedPageBreak/>
         <w:t>O</w:t>
@@ -3012,7 +3161,7 @@
         <w:pStyle w:val="Heading2"/>
       </w:pPr>
       <w:bookmarkStart w:id="4" w:name="_Ref97549053"/>
-      <w:bookmarkStart w:id="5" w:name="_Toc177630130"/>
+      <w:bookmarkStart w:id="5" w:name="_Toc240447981"/>
       <w:r>
         <w:t>Racelogic</w:t>
       </w:r>
@@ -3049,7 +3198,9 @@
         </w:rPr>
       </w:pPr>
       <w:bookmarkStart w:id="6" w:name="_Toc177630131"/>
+      <w:bookmarkStart w:id="7" w:name="_Toc240447982"/>
       <w:bookmarkEnd w:id="6"/>
+      <w:bookmarkEnd w:id="7"/>
     </w:p>
     <w:p>
       <w:pPr>
@@ -3071,8 +3222,10 @@
           <w:szCs w:val="24"/>
         </w:rPr>
       </w:pPr>
-      <w:bookmarkStart w:id="7" w:name="_Toc177630132"/>
-      <w:bookmarkEnd w:id="7"/>
+      <w:bookmarkStart w:id="8" w:name="_Toc177630132"/>
+      <w:bookmarkStart w:id="9" w:name="_Toc240447983"/>
+      <w:bookmarkEnd w:id="8"/>
+      <w:bookmarkEnd w:id="9"/>
     </w:p>
     <w:p>
       <w:pPr>
@@ -3094,18 +3247,20 @@
           <w:szCs w:val="24"/>
         </w:rPr>
       </w:pPr>
-      <w:bookmarkStart w:id="8" w:name="_Toc177630133"/>
-      <w:bookmarkEnd w:id="8"/>
+      <w:bookmarkStart w:id="10" w:name="_Toc177630133"/>
+      <w:bookmarkStart w:id="11" w:name="_Toc240447984"/>
+      <w:bookmarkEnd w:id="10"/>
+      <w:bookmarkEnd w:id="11"/>
     </w:p>
     <w:p>
       <w:pPr>
         <w:pStyle w:val="Heading3"/>
       </w:pPr>
-      <w:bookmarkStart w:id="9" w:name="_Toc177630134"/>
+      <w:bookmarkStart w:id="12" w:name="_Toc240447985"/>
       <w:r>
         <w:t>Introduction</w:t>
       </w:r>
-      <w:bookmarkEnd w:id="9"/>
+      <w:bookmarkEnd w:id="12"/>
     </w:p>
     <w:p>
       <w:r>
@@ -3145,7 +3300,7 @@
         <w:fldChar w:fldCharType="separate"/>
       </w:r>
       <w:r>
-        <w:t>3.1</w:t>
+        <w:t>4.1</w:t>
       </w:r>
       <w:r>
         <w:fldChar w:fldCharType="end"/>
@@ -3165,13 +3320,7 @@
     </w:p>
     <w:p>
       <w:r>
-        <w:t xml:space="preserve">When connected to a Fizbox/VCU, Airpixel XT also outputs in this format, which is now the unified format for all Airpixel Output. Throughout this document, references to ‘VIPS’ refer to the indoor tracking solution, and references to ‘Airpixel XT’ refer to the outdoor </w:t>
-      </w:r>
-      <w:r>
-        <w:t xml:space="preserve">GNSS </w:t>
-      </w:r>
-      <w:r>
-        <w:t>tracking solution.</w:t>
+        <w:t>When connected to a Fizbox/VCU, Airpixel XT also outputs in this format, which is now the unified format for all Airpixel Output. Throughout this document, references to ‘VIPS’ refer to the indoor tracking solution, and references to ‘Airpixel XT’ refer to the outdoor GNSS tracking solution.</w:t>
       </w:r>
     </w:p>
     <w:p>
@@ -3352,23 +3501,15 @@
       <w:pPr>
         <w:pStyle w:val="Heading3"/>
       </w:pPr>
-      <w:bookmarkStart w:id="10" w:name="_Toc177630135"/>
+      <w:bookmarkStart w:id="13" w:name="_Toc240447986"/>
       <w:r>
         <w:t>Header</w:t>
       </w:r>
-      <w:bookmarkEnd w:id="10"/>
+      <w:bookmarkEnd w:id="13"/>
     </w:p>
     <w:p>
       <w:r>
-        <w:t xml:space="preserve">This is a fixed </w:t>
-      </w:r>
-      <w:proofErr w:type="gramStart"/>
-      <w:r>
-        <w:t>2 byte</w:t>
-      </w:r>
-      <w:proofErr w:type="gramEnd"/>
-      <w:r>
-        <w:t xml:space="preserve"> pattern of 0x24 followed by 0x</w:t>
+        <w:t>This is a fixed 2 byte pattern of 0x24 followed by 0x</w:t>
       </w:r>
       <w:r>
         <w:t>D</w:t>
@@ -3381,23 +3522,15 @@
       <w:pPr>
         <w:pStyle w:val="Heading3"/>
       </w:pPr>
-      <w:bookmarkStart w:id="11" w:name="_Toc177630136"/>
+      <w:bookmarkStart w:id="14" w:name="_Toc240447987"/>
       <w:r>
         <w:t>Message length</w:t>
       </w:r>
-      <w:bookmarkEnd w:id="11"/>
+      <w:bookmarkEnd w:id="14"/>
     </w:p>
     <w:p>
       <w:r>
-        <w:t xml:space="preserve">This is a </w:t>
-      </w:r>
-      <w:proofErr w:type="gramStart"/>
-      <w:r>
-        <w:t>16 bit</w:t>
-      </w:r>
-      <w:proofErr w:type="gramEnd"/>
-      <w:r>
-        <w:t xml:space="preserve"> unsigned integer</w:t>
+        <w:t>This is a 16 bit unsigned integer</w:t>
       </w:r>
       <w:r>
         <w:t xml:space="preserve"> containing the length of the entire message including header bytes and checksum. This allows the message checksum to be verified even if the meaning of some of the options mask</w:t>
@@ -3447,7 +3580,6 @@
           <w:szCs w:val="24"/>
         </w:rPr>
       </w:pPr>
-      <w:bookmarkStart w:id="12" w:name="_Toc177630137"/>
       <w:r>
         <w:br w:type="page"/>
       </w:r>
@@ -3456,23 +3588,142 @@
       <w:pPr>
         <w:pStyle w:val="Heading3"/>
       </w:pPr>
+      <w:bookmarkStart w:id="15" w:name="_Toc240447988"/>
       <w:r>
         <w:lastRenderedPageBreak/>
-        <w:t>Options mask</w:t>
-      </w:r>
-      <w:bookmarkEnd w:id="12"/>
+        <w:t>Coordinate frame</w:t>
+      </w:r>
+      <w:bookmarkEnd w:id="15"/>
     </w:p>
     <w:p>
       <w:r>
-        <w:t xml:space="preserve">This is a </w:t>
-      </w:r>
-      <w:proofErr w:type="gramStart"/>
-      <w:r>
-        <w:t>32 bit</w:t>
-      </w:r>
-      <w:proofErr w:type="gramEnd"/>
-      <w:r>
-        <w:t xml:space="preserve"> long bit field, each bit indicates whether a specific data field is present </w:t>
+        <w:t>The position fields carry one of two frames, chosen by the GLOBAL bit in the options mask. Both use the same three slots in the packet, so a receiver must test that bit before it can interpret them.</w:t>
+      </w:r>
+    </w:p>
+    <w:p>
+      <w:r>
+        <w:rPr>
+          <w:noProof/>
+        </w:rPr>
+        <w:drawing>
+          <wp:inline distT="0" distB="0" distL="0" distR="0" wp14:anchorId="5C694426" wp14:editId="4D6843C4">
+            <wp:extent cx="5669280" cy="4187536"/>
+            <wp:effectExtent l="0" t="0" r="0" b="0"/>
+            <wp:docPr id="2" name="Picture 2"/>
+            <wp:cNvGraphicFramePr>
+              <a:graphicFrameLocks xmlns:a="http://schemas.openxmlformats.org/drawingml/2006/main" noChangeAspect="1"/>
+            </wp:cNvGraphicFramePr>
+            <a:graphic xmlns:a="http://schemas.openxmlformats.org/drawingml/2006/main">
+              <a:graphicData uri="http://schemas.openxmlformats.org/drawingml/2006/picture">
+                <pic:pic xmlns:pic="http://schemas.openxmlformats.org/drawingml/2006/picture">
+                  <pic:nvPicPr>
+                    <pic:cNvPr id="0" name="coordframe8.png"/>
+                    <pic:cNvPicPr/>
+                  </pic:nvPicPr>
+                  <pic:blipFill>
+                    <a:blip r:embed="rId8"/>
+                    <a:stretch>
+                      <a:fillRect/>
+                    </a:stretch>
+                  </pic:blipFill>
+                  <pic:spPr>
+                    <a:xfrm>
+                      <a:off x="0" y="0"/>
+                      <a:ext cx="5669280" cy="4187536"/>
+                    </a:xfrm>
+                    <a:prstGeom prst="rect">
+                      <a:avLst/>
+                    </a:prstGeom>
+                  </pic:spPr>
+                </pic:pic>
+              </a:graphicData>
+            </a:graphic>
+          </wp:inline>
+        </w:drawing>
+      </w:r>
+    </w:p>
+    <w:p>
+      <w:r>
+        <w:t>Local grid, GLOBAL clear. This is the normal output for both Airpixel</w:t>
+      </w:r>
+      <w:r>
+        <w:t xml:space="preserve"> and Indoor-only VIPS</w:t>
+      </w:r>
+      <w:r>
+        <w:t>, and is what most integrations should expect. The three fields are X, Y and Z in metres, measured from the site origin:</w:t>
+      </w:r>
+    </w:p>
+    <w:p>
+      <w:pPr>
+        <w:pStyle w:val="ListParagraph"/>
+      </w:pPr>
+      <w:r>
+        <w:t>+X points East</w:t>
+      </w:r>
+    </w:p>
+    <w:p>
+      <w:pPr>
+        <w:pStyle w:val="ListParagraph"/>
+      </w:pPr>
+      <w:r>
+        <w:t>+Y points North</w:t>
+      </w:r>
+    </w:p>
+    <w:p>
+      <w:pPr>
+        <w:pStyle w:val="ListParagraph"/>
+      </w:pPr>
+      <w:r>
+        <w:t>+Z points up</w:t>
+      </w:r>
+    </w:p>
+    <w:p>
+      <w:r>
+        <w:t>Global, GLOBAL set. The same three fields instead carry latitude and longitude in degrees on WGS 84, and height above the WGS 84 ellipsoid in metres.</w:t>
+      </w:r>
+    </w:p>
+    <w:p>
+      <w:r>
+        <w:t>Orientation. Roll, pitch and yaw are all in degrees. The positive directions are:</w:t>
+      </w:r>
+    </w:p>
+    <w:p>
+      <w:pPr>
+        <w:pStyle w:val="ListParagraph"/>
+      </w:pPr>
+      <w:r>
+        <w:t>Roll is positive with the right hand side down</w:t>
+      </w:r>
+    </w:p>
+    <w:p>
+      <w:pPr>
+        <w:pStyle w:val="ListParagraph"/>
+      </w:pPr>
+      <w:r>
+        <w:t>Pitch is positive with the nose up</w:t>
+      </w:r>
+    </w:p>
+    <w:p>
+      <w:pPr>
+        <w:pStyle w:val="ListParagraph"/>
+      </w:pPr>
+      <w:r>
+        <w:t>Yaw is positive turning clockwise, and reads zero along the +Y axis</w:t>
+      </w:r>
+    </w:p>
+    <w:p>
+      <w:pPr>
+        <w:pStyle w:val="Heading3"/>
+      </w:pPr>
+      <w:bookmarkStart w:id="16" w:name="_Toc240447989"/>
+      <w:r>
+        <w:t>Options mask</w:t>
+      </w:r>
+      <w:bookmarkEnd w:id="16"/>
+    </w:p>
+    <w:p>
+      <w:r>
+        <w:t xml:space="preserve">This is a 32 bit long bit field, each bit indicates whether a specific data field is present </w:t>
       </w:r>
       <w:r>
         <w:t xml:space="preserve">in the output message </w:t>
@@ -3515,6 +3766,7 @@
     </w:p>
     <w:p>
       <w:r>
+        <w:lastRenderedPageBreak/>
         <w:t xml:space="preserve">Items in </w:t>
       </w:r>
       <w:r>
@@ -3579,21 +3831,14 @@
       <w:r>
         <w:t xml:space="preserve">Table </w:t>
       </w:r>
-      <w:r>
-        <w:fldChar w:fldCharType="begin"/>
-      </w:r>
-      <w:r>
-        <w:instrText xml:space="preserve"> SEQ Table \* ARABIC </w:instrText>
-      </w:r>
-      <w:r>
-        <w:fldChar w:fldCharType="separate"/>
-      </w:r>
-      <w:r>
-        <w:t>1</w:t>
-      </w:r>
-      <w:r>
-        <w:fldChar w:fldCharType="end"/>
-      </w:r>
+      <w:fldSimple w:instr=" SEQ Table \* ARABIC ">
+        <w:r>
+          <w:rPr>
+            <w:noProof/>
+          </w:rPr>
+          <w:t>1</w:t>
+        </w:r>
+      </w:fldSimple>
       <w:r>
         <w:t xml:space="preserve"> VIPS output option mask values</w:t>
       </w:r>
@@ -3616,7 +3861,7 @@
             <w:tcW w:w="1980" w:type="dxa"/>
           </w:tcPr>
           <w:p>
-            <w:bookmarkStart w:id="13" w:name="_Hlk84257669"/>
+            <w:bookmarkStart w:id="17" w:name="_Hlk84257669"/>
             <w:r>
               <w:t>Bit</w:t>
             </w:r>
@@ -3680,7 +3925,7 @@
           </w:tcPr>
           <w:p>
             <w:r>
-              <w:t>If set position and velocity are in global coordinates. If clear they are in local coordinates.</w:t>
+              <w:t>Selects the coordinate frame of the position and velocity fields. Clear (the usual case): local X/Y/Z in metres. Set: global latitude/longitude. See Coordinate frame.</w:t>
             </w:r>
           </w:p>
         </w:tc>
@@ -3737,7 +3982,7 @@
           </w:p>
         </w:tc>
       </w:tr>
-      <w:bookmarkEnd w:id="13"/>
+      <w:bookmarkEnd w:id="17"/>
       <w:tr>
         <w:tc>
           <w:tcPr>
@@ -4201,19 +4446,7 @@
               <w:rPr>
                 <w:color w:val="0070C0"/>
               </w:rPr>
-              <w:t>Output</w:t>
-            </w:r>
-            <w:r>
-              <w:rPr>
-                <w:color w:val="0070C0"/>
-              </w:rPr>
-              <w:t xml:space="preserve"> Basic</w:t>
-            </w:r>
-            <w:r>
-              <w:rPr>
-                <w:color w:val="0070C0"/>
-              </w:rPr>
-              <w:t xml:space="preserve"> FIZ data</w:t>
+              <w:t>DEPRECATED. Basic FIZ data. New implementations should use FIZ_EXTENDED (bit 15) instead. See note 4.</w:t>
             </w:r>
           </w:p>
         </w:tc>
@@ -4512,7 +4745,7 @@
               <w:rPr>
                 <w:color w:val="0070C0"/>
               </w:rPr>
-              <w:t>Output Extended FIZ data</w:t>
+              <w:t>Extended FIZ data. This is the current FIZ format and should be used in preference to FIZ_DATA.</w:t>
             </w:r>
           </w:p>
         </w:tc>
@@ -4580,12 +4813,12 @@
     <w:p>
       <w:pPr>
         <w:sectPr>
-          <w:headerReference w:type="even" r:id="rId8"/>
-          <w:headerReference w:type="default" r:id="rId9"/>
-          <w:footerReference w:type="even" r:id="rId10"/>
-          <w:footerReference w:type="default" r:id="rId11"/>
-          <w:headerReference w:type="first" r:id="rId12"/>
-          <w:footerReference w:type="first" r:id="rId13"/>
+          <w:headerReference w:type="even" r:id="rId9"/>
+          <w:headerReference w:type="default" r:id="rId10"/>
+          <w:footerReference w:type="even" r:id="rId11"/>
+          <w:footerReference w:type="default" r:id="rId12"/>
+          <w:headerReference w:type="first" r:id="rId13"/>
+          <w:footerReference w:type="first" r:id="rId14"/>
           <w:pgSz w:w="11906" w:h="16838"/>
           <w:pgMar w:top="1440" w:right="1440" w:bottom="1440" w:left="1440" w:header="708" w:footer="708" w:gutter="0"/>
           <w:cols w:space="708"/>
@@ -4598,14 +4831,14 @@
       <w:pPr>
         <w:pStyle w:val="Heading3"/>
       </w:pPr>
-      <w:bookmarkStart w:id="14" w:name="_Toc177630138"/>
+      <w:bookmarkStart w:id="18" w:name="_Toc240447990"/>
       <w:r>
         <w:t>Details of o</w:t>
       </w:r>
       <w:r>
         <w:t>utput fields</w:t>
       </w:r>
-      <w:bookmarkEnd w:id="14"/>
+      <w:bookmarkEnd w:id="18"/>
     </w:p>
     <w:p>
       <w:r>
@@ -4689,27 +4922,14 @@
       <w:r>
         <w:t xml:space="preserve">Table </w:t>
       </w:r>
-      <w:r>
-        <w:fldChar w:fldCharType="begin"/>
-      </w:r>
-      <w:r>
-        <w:instrText xml:space="preserve"> SEQ Table \* ARABIC </w:instrText>
-      </w:r>
-      <w:r>
-        <w:fldChar w:fldCharType="separate"/>
-      </w:r>
-      <w:r>
-        <w:rPr>
-          <w:noProof/>
-        </w:rPr>
-        <w:t>2</w:t>
-      </w:r>
-      <w:r>
-        <w:rPr>
-          <w:noProof/>
-        </w:rPr>
-        <w:fldChar w:fldCharType="end"/>
-      </w:r>
+      <w:fldSimple w:instr=" SEQ Table \* ARABIC ">
+        <w:r>
+          <w:rPr>
+            <w:noProof/>
+          </w:rPr>
+          <w:t>2</w:t>
+        </w:r>
+      </w:fldSimple>
       <w:r>
         <w:t xml:space="preserve"> VIPS Output field details</w:t>
       </w:r>
@@ -4725,11 +4945,11 @@
         <w:tblLook w:val="04A0" w:firstRow="1" w:lastRow="0" w:firstColumn="1" w:lastColumn="0" w:noHBand="0" w:noVBand="1"/>
       </w:tblPr>
       <w:tblGrid>
-        <w:gridCol w:w="1899"/>
+        <w:gridCol w:w="2019"/>
         <w:gridCol w:w="573"/>
-        <w:gridCol w:w="2092"/>
-        <w:gridCol w:w="6794"/>
-        <w:gridCol w:w="2570"/>
+        <w:gridCol w:w="1907"/>
+        <w:gridCol w:w="7034"/>
+        <w:gridCol w:w="2395"/>
       </w:tblGrid>
       <w:tr>
         <w:tc>
@@ -5185,15 +5405,7 @@
           </w:tcPr>
           <w:p>
             <w:r>
-              <w:t xml:space="preserve">Time since midnight UTC in </w:t>
-            </w:r>
-            <w:proofErr w:type="spellStart"/>
-            <w:r>
-              <w:t>ms</w:t>
-            </w:r>
-            <w:proofErr w:type="spellEnd"/>
-            <w:r>
-              <w:t>.</w:t>
+              <w:t>Time since midnight UTC in ms.</w:t>
             </w:r>
           </w:p>
         </w:tc>
@@ -5224,7 +5436,7 @@
           </w:tcPr>
           <w:p>
             <w:r>
-              <w:t>Latitude / X location</w:t>
+              <w:t>X location / Latitude</w:t>
             </w:r>
           </w:p>
         </w:tc>
@@ -5249,13 +5461,8 @@
             <w:vAlign w:val="center"/>
           </w:tcPr>
           <w:p>
-            <w:proofErr w:type="gramStart"/>
-            <w:r>
-              <w:t>64 bit</w:t>
-            </w:r>
-            <w:proofErr w:type="gramEnd"/>
-            <w:r>
-              <w:t xml:space="preserve"> double precision float</w:t>
+            <w:r>
+              <w:t>64 bit double precision float</w:t>
             </w:r>
           </w:p>
         </w:tc>
@@ -5271,48 +5478,39 @@
               </w:rPr>
             </w:pPr>
             <w:r>
+              <w:t>Normally the position on the local grid in metres, relative to the site origin: X, Y and Z respectively.</w:t>
+            </w:r>
+            <w:r>
               <w:rPr>
                 <w:color w:val="FF0000"/>
               </w:rPr>
-              <w:t xml:space="preserve">If GLOBAL bit is set in </w:t>
-            </w:r>
-            <w:proofErr w:type="gramStart"/>
+              <w:t xml:space="preserve"> </w:t>
+            </w:r>
             <w:r>
               <w:rPr>
                 <w:color w:val="FF0000"/>
               </w:rPr>
-              <w:t>options mask</w:t>
-            </w:r>
-            <w:proofErr w:type="gramEnd"/>
+              <w:br/>
+            </w:r>
             <w:r>
               <w:rPr>
                 <w:color w:val="FF0000"/>
               </w:rPr>
-              <w:t xml:space="preserve"> then these fields contain the Latitude and Longitude in degrees and height above the ellipsoid in meters to WGS 84.</w:t>
-            </w:r>
-          </w:p>
-          <w:p>
-            <w:pPr>
+              <w:t>If the GLOBAL bit is set in the options mask</w:t>
+            </w:r>
+            <w:r>
               <w:rPr>
                 <w:color w:val="FF0000"/>
               </w:rPr>
-            </w:pPr>
-            <w:r>
-              <w:t>If</w:t>
-            </w:r>
-            <w:r>
-              <w:t xml:space="preserve"> the GLOBAL bit is </w:t>
-            </w:r>
-            <w:proofErr w:type="gramStart"/>
-            <w:r>
-              <w:t>clear</w:t>
-            </w:r>
-            <w:proofErr w:type="gramEnd"/>
-            <w:r>
-              <w:t xml:space="preserve"> then they contain the location in meters to the local grid. </w:t>
-            </w:r>
-          </w:p>
-          <w:p/>
+              <w:t xml:space="preserve"> (Automotive only, not Airpixel)</w:t>
+            </w:r>
+            <w:r>
+              <w:rPr>
+                <w:color w:val="FF0000"/>
+              </w:rPr>
+              <w:t xml:space="preserve"> these become latitude in degrees, longitude in degrees, and height above the WGS 84 ellipsoid in metres. See the Coordinate frame section.</w:t>
+            </w:r>
+          </w:p>
         </w:tc>
         <w:tc>
           <w:tcPr>
@@ -5341,7 +5539,7 @@
           </w:tcPr>
           <w:p>
             <w:r>
-              <w:t>Longitude / Y location</w:t>
+              <w:t>Y location / Longitude</w:t>
             </w:r>
           </w:p>
         </w:tc>
@@ -5402,8 +5600,7 @@
           </w:tcPr>
           <w:p>
             <w:r>
-              <w:lastRenderedPageBreak/>
-              <w:t>Altitude / Z location</w:t>
+              <w:t>Z location / Altitude</w:t>
             </w:r>
           </w:p>
         </w:tc>
@@ -5433,13 +5630,8 @@
             <w:vAlign w:val="center"/>
           </w:tcPr>
           <w:p>
-            <w:proofErr w:type="gramStart"/>
-            <w:r>
-              <w:t>32 bit</w:t>
-            </w:r>
-            <w:proofErr w:type="gramEnd"/>
-            <w:r>
-              <w:t xml:space="preserve"> float</w:t>
+            <w:r>
+              <w:t>32 bit float</w:t>
             </w:r>
           </w:p>
         </w:tc>
@@ -5482,6 +5674,7 @@
           </w:tcPr>
           <w:p>
             <w:r>
+              <w:lastRenderedPageBreak/>
               <w:t>Beacon count</w:t>
             </w:r>
           </w:p>
@@ -5716,11 +5909,9 @@
             <w:vAlign w:val="center"/>
           </w:tcPr>
           <w:p>
-            <w:proofErr w:type="spellStart"/>
             <w:r>
               <w:t>KFStatus</w:t>
             </w:r>
-            <w:proofErr w:type="spellEnd"/>
           </w:p>
         </w:tc>
         <w:tc>
@@ -5813,7 +6004,7 @@
                 <w:color w:val="0070C0"/>
                 <w:u w:val="single"/>
               </w:rPr>
-              <w:t>2.1.6</w:t>
+              <w:t>2.1.7</w:t>
             </w:r>
             <w:r>
               <w:rPr>
@@ -5942,13 +6133,8 @@
             <w:vAlign w:val="center"/>
           </w:tcPr>
           <w:p>
-            <w:proofErr w:type="gramStart"/>
-            <w:r>
-              <w:t>32 bit</w:t>
-            </w:r>
-            <w:proofErr w:type="gramEnd"/>
-            <w:r>
-              <w:t xml:space="preserve"> float</w:t>
+            <w:r>
+              <w:t>32 bit float</w:t>
             </w:r>
           </w:p>
         </w:tc>
@@ -6020,13 +6206,8 @@
             <w:vAlign w:val="center"/>
           </w:tcPr>
           <w:p>
-            <w:proofErr w:type="gramStart"/>
-            <w:r>
-              <w:t>32 bit</w:t>
-            </w:r>
-            <w:proofErr w:type="gramEnd"/>
-            <w:r>
-              <w:t xml:space="preserve"> float</w:t>
+            <w:r>
+              <w:t>32 bit float</w:t>
             </w:r>
           </w:p>
         </w:tc>
@@ -6098,13 +6279,8 @@
             <w:vAlign w:val="center"/>
           </w:tcPr>
           <w:p>
-            <w:proofErr w:type="gramStart"/>
-            <w:r>
-              <w:t>32 bit</w:t>
-            </w:r>
-            <w:proofErr w:type="gramEnd"/>
-            <w:r>
-              <w:t xml:space="preserve"> float</w:t>
+            <w:r>
+              <w:t>32 bit float</w:t>
             </w:r>
           </w:p>
         </w:tc>
@@ -6200,49 +6376,27 @@
                 <w:color w:val="FF0000"/>
               </w:rPr>
             </w:pPr>
-            <w:proofErr w:type="gramStart"/>
             <w:r>
               <w:rPr>
                 <w:color w:val="FF0000"/>
               </w:rPr>
-              <w:t>32 bit</w:t>
-            </w:r>
-            <w:proofErr w:type="gramEnd"/>
+              <w:t>32 bit float</w:t>
+            </w:r>
+          </w:p>
+        </w:tc>
+        <w:tc>
+          <w:tcPr>
+            <w:tcW w:w="0" w:type="auto"/>
+            <w:tcBorders>
+              <w:top w:val="single" w:sz="12" w:space="0" w:color="auto"/>
+            </w:tcBorders>
+          </w:tcPr>
+          <w:p>
             <w:r>
               <w:rPr>
                 <w:color w:val="FF0000"/>
               </w:rPr>
-              <w:t xml:space="preserve"> float</w:t>
-            </w:r>
-          </w:p>
-        </w:tc>
-        <w:tc>
-          <w:tcPr>
-            <w:tcW w:w="0" w:type="auto"/>
-            <w:tcBorders>
-              <w:top w:val="single" w:sz="12" w:space="0" w:color="auto"/>
-            </w:tcBorders>
-          </w:tcPr>
-          <w:p>
-            <w:r>
-              <w:rPr>
-                <w:color w:val="FF0000"/>
-              </w:rPr>
-              <w:t xml:space="preserve">If GLOBAL bit is set in </w:t>
-            </w:r>
-            <w:proofErr w:type="gramStart"/>
-            <w:r>
-              <w:rPr>
-                <w:color w:val="FF0000"/>
-              </w:rPr>
-              <w:t>options mask</w:t>
-            </w:r>
-            <w:proofErr w:type="gramEnd"/>
-            <w:r>
-              <w:rPr>
-                <w:color w:val="FF0000"/>
-              </w:rPr>
-              <w:t xml:space="preserve"> then horizontal speed in km/h. Otherwise velocity in the X direction in m/s</w:t>
+              <w:t>If GLOBAL bit is set in options mask then horizontal speed in km/h. Otherwise velocity in the X direction in m/s</w:t>
             </w:r>
           </w:p>
         </w:tc>
@@ -6287,16 +6441,31 @@
               <w:rPr>
                 <w:color w:val="FF0000"/>
               </w:rPr>
-              <w:t xml:space="preserve">Heading / </w:t>
-            </w:r>
-            <w:proofErr w:type="spellStart"/>
-            <w:r>
+              <w:t>Heading / Vy</w:t>
+            </w:r>
+          </w:p>
+        </w:tc>
+        <w:tc>
+          <w:tcPr>
+            <w:tcW w:w="0" w:type="auto"/>
+            <w:tcBorders>
+              <w:bottom w:val="single" w:sz="12" w:space="0" w:color="auto"/>
+            </w:tcBorders>
+            <w:vAlign w:val="center"/>
+          </w:tcPr>
+          <w:p>
+            <w:pPr>
+              <w:jc w:val="center"/>
               <w:rPr>
                 <w:color w:val="FF0000"/>
               </w:rPr>
-              <w:t>Vy</w:t>
-            </w:r>
-            <w:proofErr w:type="spellEnd"/>
+            </w:pPr>
+            <w:r>
+              <w:rPr>
+                <w:color w:val="FF0000"/>
+              </w:rPr>
+              <w:t>4</w:t>
+            </w:r>
           </w:p>
         </w:tc>
         <w:tc>
@@ -6309,7 +6478,6 @@
           </w:tcPr>
           <w:p>
             <w:pPr>
-              <w:jc w:val="center"/>
               <w:rPr>
                 <w:color w:val="FF0000"/>
               </w:rPr>
@@ -6318,7 +6486,7 @@
               <w:rPr>
                 <w:color w:val="FF0000"/>
               </w:rPr>
-              <w:t>4</w:t>
+              <w:t>32 bit float</w:t>
             </w:r>
           </w:p>
         </w:tc>
@@ -6328,7 +6496,6 @@
             <w:tcBorders>
               <w:bottom w:val="single" w:sz="12" w:space="0" w:color="auto"/>
             </w:tcBorders>
-            <w:vAlign w:val="center"/>
           </w:tcPr>
           <w:p>
             <w:pPr>
@@ -6336,68 +6503,11 @@
                 <w:color w:val="FF0000"/>
               </w:rPr>
             </w:pPr>
-            <w:proofErr w:type="gramStart"/>
             <w:r>
               <w:rPr>
                 <w:color w:val="FF0000"/>
               </w:rPr>
-              <w:t>32 bit</w:t>
-            </w:r>
-            <w:proofErr w:type="gramEnd"/>
-            <w:r>
-              <w:rPr>
-                <w:color w:val="FF0000"/>
-              </w:rPr>
-              <w:t xml:space="preserve"> float</w:t>
-            </w:r>
-          </w:p>
-        </w:tc>
-        <w:tc>
-          <w:tcPr>
-            <w:tcW w:w="0" w:type="auto"/>
-            <w:tcBorders>
-              <w:bottom w:val="single" w:sz="12" w:space="0" w:color="auto"/>
-            </w:tcBorders>
-          </w:tcPr>
-          <w:p>
-            <w:pPr>
-              <w:rPr>
-                <w:color w:val="FF0000"/>
-              </w:rPr>
-            </w:pPr>
-            <w:r>
-              <w:rPr>
-                <w:color w:val="FF0000"/>
-              </w:rPr>
-              <w:t xml:space="preserve">If GLOBAL bit is set in </w:t>
-            </w:r>
-            <w:proofErr w:type="gramStart"/>
-            <w:r>
-              <w:rPr>
-                <w:color w:val="FF0000"/>
-              </w:rPr>
-              <w:t>options mask</w:t>
-            </w:r>
-            <w:proofErr w:type="gramEnd"/>
-            <w:r>
-              <w:rPr>
-                <w:color w:val="FF0000"/>
-              </w:rPr>
-              <w:t xml:space="preserve"> then compass heading in degrees. </w:t>
-            </w:r>
-            <w:proofErr w:type="gramStart"/>
-            <w:r>
-              <w:rPr>
-                <w:color w:val="FF0000"/>
-              </w:rPr>
-              <w:t>Otherwise</w:t>
-            </w:r>
-            <w:proofErr w:type="gramEnd"/>
-            <w:r>
-              <w:rPr>
-                <w:color w:val="FF0000"/>
-              </w:rPr>
-              <w:t xml:space="preserve"> velocity in the Y direction in m/s</w:t>
+              <w:t>If GLOBAL bit is set in options mask then compass heading in degrees. Otherwise velocity in the Y direction in m/s</w:t>
             </w:r>
           </w:p>
         </w:tc>
@@ -6437,7 +6547,6 @@
               <w:rPr>
                 <w:color w:val="FF0000"/>
               </w:rPr>
-              <w:lastRenderedPageBreak/>
               <w:t>Vertical velocity</w:t>
             </w:r>
           </w:p>
@@ -6481,19 +6590,11 @@
                 <w:color w:val="FF0000"/>
               </w:rPr>
             </w:pPr>
-            <w:proofErr w:type="gramStart"/>
             <w:r>
               <w:rPr>
                 <w:color w:val="FF0000"/>
               </w:rPr>
-              <w:t>32 bit</w:t>
-            </w:r>
-            <w:proofErr w:type="gramEnd"/>
-            <w:r>
-              <w:rPr>
-                <w:color w:val="FF0000"/>
-              </w:rPr>
-              <w:t xml:space="preserve"> float</w:t>
+              <w:t>32 bit float</w:t>
             </w:r>
           </w:p>
         </w:tc>
@@ -6557,6 +6658,7 @@
           </w:tcPr>
           <w:p>
             <w:r>
+              <w:lastRenderedPageBreak/>
               <w:t>Position uncertainty</w:t>
             </w:r>
           </w:p>
@@ -6588,15 +6690,7 @@
           </w:tcPr>
           <w:p>
             <w:r>
-              <w:t xml:space="preserve">3x IEEE </w:t>
-            </w:r>
-            <w:proofErr w:type="gramStart"/>
-            <w:r>
-              <w:t>32 bit</w:t>
-            </w:r>
-            <w:proofErr w:type="gramEnd"/>
-            <w:r>
-              <w:t xml:space="preserve"> float</w:t>
+              <w:t>3x IEEE 32 bit float</w:t>
             </w:r>
           </w:p>
         </w:tc>
@@ -6608,13 +6702,8 @@
             </w:tcBorders>
           </w:tcPr>
           <w:p>
-            <w:proofErr w:type="gramStart"/>
-            <w:r>
-              <w:t>X,Y</w:t>
-            </w:r>
-            <w:proofErr w:type="gramEnd"/>
-            <w:r>
-              <w:t>,Z standard deviation  (m)</w:t>
+            <w:r>
+              <w:t>X,Y,Z standard deviation  (m)</w:t>
             </w:r>
           </w:p>
         </w:tc>
@@ -6673,33 +6762,17 @@
           </w:tcPr>
           <w:p>
             <w:r>
-              <w:t xml:space="preserve">3x IEEE </w:t>
-            </w:r>
-            <w:proofErr w:type="gramStart"/>
-            <w:r>
-              <w:t>32 bit</w:t>
-            </w:r>
-            <w:proofErr w:type="gramEnd"/>
-            <w:r>
-              <w:t xml:space="preserve"> float</w:t>
-            </w:r>
-          </w:p>
-        </w:tc>
-        <w:tc>
-          <w:tcPr>
-            <w:tcW w:w="0" w:type="auto"/>
-          </w:tcPr>
-          <w:p>
-            <w:r>
-              <w:t>Roll, Pitch, Yaw standard deviations (</w:t>
-            </w:r>
-            <w:proofErr w:type="spellStart"/>
-            <w:r>
-              <w:t>deg</w:t>
-            </w:r>
-            <w:proofErr w:type="spellEnd"/>
-            <w:r>
-              <w:t>)</w:t>
+              <w:t>3x IEEE 32 bit float</w:t>
+            </w:r>
+          </w:p>
+        </w:tc>
+        <w:tc>
+          <w:tcPr>
+            <w:tcW w:w="0" w:type="auto"/>
+          </w:tcPr>
+          <w:p>
+            <w:r>
+              <w:t>Roll, Pitch, Yaw standard deviations (deg)</w:t>
             </w:r>
           </w:p>
         </w:tc>
@@ -6764,15 +6837,7 @@
           </w:tcPr>
           <w:p>
             <w:r>
-              <w:t xml:space="preserve">3x IEEE </w:t>
-            </w:r>
-            <w:proofErr w:type="gramStart"/>
-            <w:r>
-              <w:t>32 bit</w:t>
-            </w:r>
-            <w:proofErr w:type="gramEnd"/>
-            <w:r>
-              <w:t xml:space="preserve"> float</w:t>
+              <w:t>3x IEEE 32 bit float</w:t>
             </w:r>
           </w:p>
         </w:tc>
@@ -6784,13 +6849,8 @@
             </w:tcBorders>
           </w:tcPr>
           <w:p>
-            <w:proofErr w:type="gramStart"/>
-            <w:r>
-              <w:t>X,Y</w:t>
-            </w:r>
-            <w:proofErr w:type="gramEnd"/>
-            <w:r>
-              <w:t xml:space="preserve">,Z Velocity standard deviations in m/s </w:t>
+            <w:r>
+              <w:t xml:space="preserve">X,Y,Z Velocity standard deviations in m/s </w:t>
             </w:r>
           </w:p>
         </w:tc>
@@ -7501,7 +7561,6 @@
               <w:rPr>
                 <w:color w:val="0070C0"/>
               </w:rPr>
-              <w:lastRenderedPageBreak/>
               <w:t>In Airpixel, this represents Camera ID</w:t>
             </w:r>
           </w:p>
@@ -7546,7 +7605,8 @@
               <w:rPr>
                 <w:color w:val="0070C0"/>
               </w:rPr>
-              <w:t>Focus Distance</w:t>
+              <w:lastRenderedPageBreak/>
+              <w:t>Focus Distance (deprecated)</w:t>
             </w:r>
           </w:p>
         </w:tc>
@@ -7612,21 +7672,7 @@
               <w:rPr>
                 <w:color w:val="0070C0"/>
               </w:rPr>
-              <w:t xml:space="preserve">Focus distance </w:t>
-            </w:r>
-            <w:proofErr w:type="gramStart"/>
-            <w:r>
-              <w:rPr>
-                <w:color w:val="0070C0"/>
-              </w:rPr>
-              <w:t>in</w:t>
-            </w:r>
-            <w:proofErr w:type="gramEnd"/>
-            <w:r>
-              <w:rPr>
-                <w:color w:val="0070C0"/>
-              </w:rPr>
-              <w:t xml:space="preserve"> mm or raw encoder count (lens dependant) </w:t>
+              <w:t xml:space="preserve">Focus distance in mm or raw encoder count (lens dependant) </w:t>
             </w:r>
             <w:r>
               <w:rPr>
@@ -7703,12 +7749,12 @@
                 <w:color w:val="0070C0"/>
               </w:rPr>
             </w:pPr>
-            <w:bookmarkStart w:id="15" w:name="_Hlk177550209"/>
-            <w:r>
-              <w:rPr>
-                <w:color w:val="0070C0"/>
-              </w:rPr>
-              <w:t>Iris</w:t>
+            <w:bookmarkStart w:id="19" w:name="_Hlk177550209"/>
+            <w:r>
+              <w:rPr>
+                <w:color w:val="0070C0"/>
+              </w:rPr>
+              <w:t>Iris (deprecated)</w:t>
             </w:r>
           </w:p>
         </w:tc>
@@ -7812,7 +7858,7 @@
               <w:rPr>
                 <w:color w:val="0070C0"/>
               </w:rPr>
-              <w:t>Focus length (zoom)</w:t>
+              <w:t>Focus length (zoom) (deprecated)</w:t>
             </w:r>
           </w:p>
         </w:tc>
@@ -7906,7 +7952,7 @@
           </w:p>
         </w:tc>
       </w:tr>
-      <w:bookmarkEnd w:id="15"/>
+      <w:bookmarkEnd w:id="19"/>
       <w:tr>
         <w:tc>
           <w:tcPr>
@@ -7950,15 +7996,7 @@
           </w:tcPr>
           <w:p>
             <w:r>
-              <w:t xml:space="preserve">2x IEEE 64 bit double + 1 x IEEE </w:t>
-            </w:r>
-            <w:proofErr w:type="gramStart"/>
-            <w:r>
-              <w:t>32 bit</w:t>
-            </w:r>
-            <w:proofErr w:type="gramEnd"/>
-            <w:r>
-              <w:t xml:space="preserve"> float</w:t>
+              <w:t>2x IEEE 64 bit double + 1 x IEEE 32 bit float</w:t>
             </w:r>
           </w:p>
         </w:tc>
@@ -8038,15 +8076,7 @@
           </w:tcPr>
           <w:p>
             <w:r>
-              <w:t xml:space="preserve">IEEE </w:t>
-            </w:r>
-            <w:proofErr w:type="gramStart"/>
-            <w:r>
-              <w:t>32 bit</w:t>
-            </w:r>
-            <w:proofErr w:type="gramEnd"/>
-            <w:r>
-              <w:t xml:space="preserve"> float</w:t>
+              <w:t>IEEE 32 bit float</w:t>
             </w:r>
           </w:p>
         </w:tc>
@@ -8140,15 +8170,7 @@
           </w:tcPr>
           <w:p>
             <w:r>
-              <w:t xml:space="preserve">List of beacon IDs (VIPS) used in position calculation in no </w:t>
-            </w:r>
-            <w:proofErr w:type="gramStart"/>
-            <w:r>
-              <w:t>particular order</w:t>
-            </w:r>
-            <w:proofErr w:type="gramEnd"/>
-            <w:r>
-              <w:t>. Always padded to 12 values with 0’s for unused beacons.</w:t>
+              <w:t>List of beacon IDs (VIPS) used in position calculation in no particular order. Always padded to 12 values with 0’s for unused beacons.</w:t>
             </w:r>
           </w:p>
         </w:tc>
@@ -8240,16 +8262,8 @@
               <w:rPr>
                 <w:color w:val="0070C0"/>
               </w:rPr>
-              <w:t xml:space="preserve">uint8_t </w:t>
-            </w:r>
-            <w:proofErr w:type="spellStart"/>
-            <w:r>
-              <w:rPr>
-                <w:color w:val="0070C0"/>
-              </w:rPr>
-              <w:t>enum</w:t>
-            </w:r>
-            <w:proofErr w:type="spellEnd"/>
+              <w:t>uint8_t enum</w:t>
+            </w:r>
           </w:p>
         </w:tc>
         <w:tc>
@@ -8276,19 +8290,7 @@
               <w:rPr>
                 <w:color w:val="0070C0"/>
               </w:rPr>
-              <w:t xml:space="preserve"/>
-            </w:r>
-            <w:r>
-              <w:rPr>
-                <w:color w:val="0070C0"/>
-              </w:rPr>
               <w:br/>
-            </w:r>
-            <w:r>
-              <w:rPr>
-                <w:color w:val="0070C0"/>
-              </w:rPr>
-              <w:t/>
             </w:r>
           </w:p>
         </w:tc>
@@ -8313,29 +8315,14 @@
               <w:rPr>
                 <w:color w:val="0070C0"/>
               </w:rPr>
-              <w:t xml:space="preserve">Bit VCU_STATUS </w:t>
-            </w:r>
-            <w:proofErr w:type="gramStart"/>
-            <w:r>
-              <w:rPr>
-                <w:color w:val="0070C0"/>
-              </w:rPr>
-              <w:t>set</w:t>
+              <w:t>Bit VCU_STATUS set</w:t>
             </w:r>
             <w:r>
               <w:rPr>
                 <w:color w:val="0070C0"/>
                 <w:vertAlign w:val="superscript"/>
               </w:rPr>
-              <w:t>(</w:t>
-            </w:r>
-            <w:proofErr w:type="gramEnd"/>
-            <w:r>
-              <w:rPr>
-                <w:color w:val="0070C0"/>
-                <w:vertAlign w:val="superscript"/>
-              </w:rPr>
-              <w:t>2)</w:t>
+              <w:t>(2)</w:t>
             </w:r>
           </w:p>
         </w:tc>
@@ -8408,16 +8395,8 @@
               <w:rPr>
                 <w:color w:val="0070C0"/>
               </w:rPr>
-              <w:t xml:space="preserve">uint8_t </w:t>
-            </w:r>
-            <w:proofErr w:type="spellStart"/>
-            <w:r>
-              <w:rPr>
-                <w:color w:val="0070C0"/>
-              </w:rPr>
-              <w:t>enum</w:t>
-            </w:r>
-            <w:proofErr w:type="spellEnd"/>
+              <w:t>uint8_t enum</w:t>
+            </w:r>
           </w:p>
         </w:tc>
         <w:tc>
@@ -8693,19 +8672,7 @@
               <w:rPr>
                 <w:color w:val="0070C0"/>
               </w:rPr>
-              <w:t xml:space="preserve">16: Backup-Battery Unavailable (charge too low or fault)</w:t>
-            </w:r>
-            <w:r>
-              <w:rPr>
-                <w:color w:val="0070C0"/>
-              </w:rPr>
-              <w:t/>
-            </w:r>
-            <w:r>
-              <w:rPr>
-                <w:color w:val="0070C0"/>
-              </w:rPr>
-              <w:t/>
+              <w:t>16: Backup-Battery Unavailable (charge too low or fault)</w:t>
             </w:r>
           </w:p>
           <w:p>
@@ -8912,15 +8879,7 @@
           </w:tcPr>
           <w:p>
             <w:r>
-              <w:t xml:space="preserve">4 x IEEE </w:t>
-            </w:r>
-            <w:proofErr w:type="gramStart"/>
-            <w:r>
-              <w:t>32 bit</w:t>
-            </w:r>
-            <w:proofErr w:type="gramEnd"/>
-            <w:r>
-              <w:t xml:space="preserve"> float</w:t>
+              <w:t>4 x IEEE 32 bit float</w:t>
             </w:r>
           </w:p>
         </w:tc>
@@ -8934,23 +8893,7 @@
           </w:tcPr>
           <w:p>
             <w:r>
-              <w:t xml:space="preserve">Orientation as a Quaternion x, </w:t>
-            </w:r>
-            <w:proofErr w:type="spellStart"/>
-            <w:r>
-              <w:t>i</w:t>
-            </w:r>
-            <w:proofErr w:type="spellEnd"/>
-            <w:r>
-              <w:t xml:space="preserve">, j </w:t>
-            </w:r>
-            <w:proofErr w:type="gramStart"/>
-            <w:r>
-              <w:t>&amp;  k</w:t>
-            </w:r>
-            <w:proofErr w:type="gramEnd"/>
-            <w:r>
-              <w:t xml:space="preserve"> values</w:t>
+              <w:t>Orientation as a Quaternion x, i, j &amp;  k values</w:t>
             </w:r>
           </w:p>
         </w:tc>
@@ -9832,7 +9775,7 @@
         <w:rPr>
           <w:color w:val="0070C0"/>
         </w:rPr>
-        <w:t xml:space="preserve">4) ‘FIZ_DATA’ field will slowly be deprecated in favour of ‘FIZ_EXTENDED’ field, however both are required to be supported in Virtual Production until at least 2026. </w:t>
+        <w:t>The 'FIZ_DATA' field is DEPRECATED. It is superseded by 'FIZ_EXTENDED', which carries the same three values at higher precision, signals whether each one is calibrated or a raw encoder count, and adds the telephoto multiplier. New implementations should use 'FIZ_EXTENDED' only. 'FIZ_DATA' remains in the protocol, and is still emitted by some units, so existing receivers do not need to be changed; a receiver that wants to work with all units should read 'FIZ_EXTENDED' when the bit is present and fall back to 'FIZ_DATA' otherwise.</w:t>
       </w:r>
     </w:p>
     <w:p>
@@ -9866,40 +9809,27 @@
         <w:pStyle w:val="Caption"/>
         <w:keepNext/>
       </w:pPr>
-      <w:bookmarkStart w:id="16" w:name="_Ref112321867"/>
+      <w:bookmarkStart w:id="20" w:name="_Ref112321867"/>
       <w:r>
         <w:t xml:space="preserve">Table </w:t>
       </w:r>
-      <w:r>
-        <w:fldChar w:fldCharType="begin"/>
-      </w:r>
-      <w:r>
-        <w:instrText xml:space="preserve"> SEQ Table \* ARABIC </w:instrText>
-      </w:r>
-      <w:r>
-        <w:fldChar w:fldCharType="separate"/>
-      </w:r>
-      <w:r>
-        <w:rPr>
-          <w:noProof/>
-        </w:rPr>
-        <w:t>3</w:t>
-      </w:r>
-      <w:r>
-        <w:rPr>
-          <w:noProof/>
-        </w:rPr>
-        <w:fldChar w:fldCharType="end"/>
-      </w:r>
-      <w:bookmarkEnd w:id="16"/>
+      <w:fldSimple w:instr=" SEQ Table \* ARABIC ">
+        <w:r>
+          <w:rPr>
+            <w:noProof/>
+          </w:rPr>
+          <w:t>3</w:t>
+        </w:r>
+      </w:fldSimple>
+      <w:bookmarkEnd w:id="20"/>
       <w:r>
         <w:t xml:space="preserve"> </w:t>
       </w:r>
-      <w:bookmarkStart w:id="17" w:name="_Ref112321859"/>
+      <w:bookmarkStart w:id="21" w:name="_Ref112321859"/>
       <w:r>
         <w:t>Reliability Flag values</w:t>
       </w:r>
-      <w:bookmarkEnd w:id="17"/>
+      <w:bookmarkEnd w:id="21"/>
     </w:p>
     <w:tbl>
       <w:tblPr>
@@ -10065,13 +9995,8 @@
             <w:r>
               <w:t xml:space="preserve">Set if the position is outside the bounding box or had insufficient beacons. Assuming beacon count is not zero the output will still be a best estimate </w:t>
             </w:r>
-            <w:proofErr w:type="gramStart"/>
-            <w:r>
-              <w:t>available</w:t>
-            </w:r>
-            <w:proofErr w:type="gramEnd"/>
-            <w:r>
-              <w:t xml:space="preserve"> but the user should switch to alternative positioning systems if available.</w:t>
+            <w:r>
+              <w:t>available but the user should switch to alternative positioning systems if available.</w:t>
             </w:r>
           </w:p>
         </w:tc>
@@ -10086,15 +10011,15 @@
       <w:pPr>
         <w:pStyle w:val="Heading3"/>
       </w:pPr>
-      <w:bookmarkStart w:id="18" w:name="_Kalman_Filter_Status"/>
-      <w:bookmarkStart w:id="19" w:name="_Ref177629954"/>
-      <w:bookmarkStart w:id="20" w:name="_Toc177630139"/>
-      <w:bookmarkEnd w:id="18"/>
+      <w:bookmarkStart w:id="22" w:name="_Kalman_Filter_Status"/>
+      <w:bookmarkStart w:id="23" w:name="_Ref177629954"/>
+      <w:bookmarkStart w:id="24" w:name="_Toc240447991"/>
+      <w:bookmarkEnd w:id="22"/>
       <w:r>
         <w:t>Kalman Filter Status</w:t>
       </w:r>
-      <w:bookmarkEnd w:id="19"/>
-      <w:bookmarkEnd w:id="20"/>
+      <w:bookmarkEnd w:id="23"/>
+      <w:bookmarkEnd w:id="24"/>
     </w:p>
     <w:p>
       <w:r>
@@ -10283,15 +10208,7 @@
         <w:t>data</w:t>
       </w:r>
       <w:r>
-        <w:t xml:space="preserve">, either from VIPS or GNSS. This is normal during </w:t>
-      </w:r>
-      <w:proofErr w:type="gramStart"/>
-      <w:r>
-        <w:t>start-up, but</w:t>
-      </w:r>
-      <w:proofErr w:type="gramEnd"/>
-      <w:r>
-        <w:t xml:space="preserve"> may indicate a fault if this status persists.</w:t>
+        <w:t>, either from VIPS or GNSS. This is normal during start-up, but may indicate a fault if this status persists.</w:t>
       </w:r>
     </w:p>
     <w:p>
@@ -10594,13 +10511,13 @@
       <w:pPr>
         <w:pStyle w:val="Heading3"/>
       </w:pPr>
-      <w:bookmarkStart w:id="21" w:name="_Toc177630140"/>
-      <w:bookmarkStart w:id="22" w:name="_Ref177631325"/>
+      <w:bookmarkStart w:id="25" w:name="_Ref177631325"/>
+      <w:bookmarkStart w:id="26" w:name="_Toc240447992"/>
       <w:r>
         <w:t>Checksum</w:t>
       </w:r>
-      <w:bookmarkEnd w:id="21"/>
-      <w:bookmarkEnd w:id="22"/>
+      <w:bookmarkEnd w:id="25"/>
+      <w:bookmarkEnd w:id="26"/>
     </w:p>
     <w:p>
       <w:r>
@@ -10611,11 +10528,11 @@
       <w:pPr>
         <w:pStyle w:val="Heading3"/>
       </w:pPr>
-      <w:bookmarkStart w:id="23" w:name="_Toc177630141"/>
+      <w:bookmarkStart w:id="27" w:name="_Toc240447993"/>
       <w:r>
         <w:t>Example data</w:t>
       </w:r>
-      <w:bookmarkEnd w:id="23"/>
+      <w:bookmarkEnd w:id="27"/>
     </w:p>
     <w:p>
       <w:r>
@@ -10769,15 +10686,7 @@
         <w:t xml:space="preserve">50 5F 00 00 </w:t>
       </w:r>
       <w:r>
-        <w:t xml:space="preserve">– Time = 0x00005F50 = 24,400 = 24 seconds, 400 </w:t>
-      </w:r>
-      <w:proofErr w:type="spellStart"/>
-      <w:r>
-        <w:t>ms</w:t>
-      </w:r>
-      <w:proofErr w:type="spellEnd"/>
-      <w:r>
-        <w:t xml:space="preserve"> after midnight.</w:t>
+        <w:t>– Time = 0x00005F50 = 24,400 = 24 seconds, 400 ms after midnight.</w:t>
       </w:r>
     </w:p>
     <w:p>
@@ -10853,15 +10762,7 @@
         <w:t>35 02</w:t>
       </w:r>
       <w:r>
-        <w:t xml:space="preserve"> </w:t>
-      </w:r>
-      <w:proofErr w:type="gramStart"/>
-      <w:r>
-        <w:t>–  Kalman</w:t>
-      </w:r>
-      <w:proofErr w:type="gramEnd"/>
-      <w:r>
-        <w:t xml:space="preserve"> filter status = 0x0235, ready for motion (0x0234 after masking with 0xE634)</w:t>
+        <w:t xml:space="preserve"> –  Kalman filter status = 0x0235, ready for motion (0x0234 after masking with 0xE634)</w:t>
       </w:r>
     </w:p>
     <w:p>
@@ -10931,29 +10832,21 @@
       <w:pPr>
         <w:pStyle w:val="Heading2"/>
       </w:pPr>
-      <w:bookmarkStart w:id="24" w:name="_Ref97549062"/>
-      <w:bookmarkStart w:id="25" w:name="_Toc177630142"/>
+      <w:bookmarkStart w:id="28" w:name="_Ref97549062"/>
+      <w:bookmarkStart w:id="29" w:name="_Toc240447994"/>
       <w:r>
         <w:lastRenderedPageBreak/>
         <w:t>NMEA output mode</w:t>
       </w:r>
-      <w:bookmarkEnd w:id="24"/>
-      <w:bookmarkEnd w:id="25"/>
+      <w:bookmarkEnd w:id="28"/>
+      <w:bookmarkEnd w:id="29"/>
     </w:p>
     <w:p>
       <w:r>
         <w:t xml:space="preserve">In NMEA output mode the </w:t>
       </w:r>
       <w:r>
-        <w:t>"</w:t>
-      </w:r>
-      <w:proofErr w:type="spellStart"/>
-      <w:r>
-        <w:t>BinaryOutput</w:t>
-      </w:r>
-      <w:proofErr w:type="spellEnd"/>
-      <w:r>
-        <w:t>"</w:t>
+        <w:t>"BinaryOutput"</w:t>
       </w:r>
       <w:r>
         <w:t xml:space="preserve"> entry in the setup JSON file is used to select which </w:t>
@@ -11084,23 +10977,15 @@
     <w:p/>
     <w:p>
       <w:r>
-        <w:t xml:space="preserve">NMEA messages give a far lower data density than Racelogic binary messages and so only one message can be output at 100Hz. If more messages are enabled than is possible with the user selected output </w:t>
-      </w:r>
-      <w:proofErr w:type="gramStart"/>
-      <w:r>
-        <w:t>rate</w:t>
-      </w:r>
-      <w:proofErr w:type="gramEnd"/>
-      <w:r>
-        <w:t xml:space="preserve"> then the output rate will automatically be decreased to the point where the messages can be reliably output. </w:t>
+        <w:t xml:space="preserve">NMEA messages give a far lower data density than Racelogic binary messages and so only one message can be output at 100Hz. If more messages are enabled than is possible with the user selected output rate then the output rate will automatically be decreased to the point where the messages can be reliably output. </w:t>
       </w:r>
     </w:p>
     <w:p>
       <w:pPr>
         <w:pStyle w:val="Heading1"/>
       </w:pPr>
-      <w:bookmarkStart w:id="26" w:name="_Ref97549070"/>
-      <w:bookmarkStart w:id="27" w:name="_Toc177630143"/>
+      <w:bookmarkStart w:id="30" w:name="_Ref97549070"/>
+      <w:bookmarkStart w:id="31" w:name="_Toc240447995"/>
       <w:r>
         <w:lastRenderedPageBreak/>
         <w:t>Operation</w:t>
@@ -11108,28 +10993,12 @@
       <w:r>
         <w:t xml:space="preserve"> options</w:t>
       </w:r>
-      <w:bookmarkEnd w:id="26"/>
-      <w:bookmarkEnd w:id="27"/>
+      <w:bookmarkEnd w:id="30"/>
+      <w:bookmarkEnd w:id="31"/>
     </w:p>
     <w:p>
       <w:r>
-        <w:t xml:space="preserve">There are </w:t>
-      </w:r>
-      <w:proofErr w:type="gramStart"/>
-      <w:r>
-        <w:t>a number of</w:t>
-      </w:r>
-      <w:proofErr w:type="gramEnd"/>
-      <w:r>
-        <w:t xml:space="preserve"> options to control how the VIPS system will operate. Normally these can be set from the VIPS site setup </w:t>
-      </w:r>
-      <w:proofErr w:type="gramStart"/>
-      <w:r>
-        <w:t>software</w:t>
-      </w:r>
-      <w:proofErr w:type="gramEnd"/>
-      <w:r>
-        <w:t xml:space="preserve"> but they can also be set directly. See section </w:t>
+        <w:t xml:space="preserve">There are a number of options to control how the VIPS system will operate. Normally these can be set from the VIPS site setup software but they can also be set directly. See section </w:t>
       </w:r>
       <w:r>
         <w:fldChar w:fldCharType="begin"/>
@@ -11141,7 +11010,7 @@
         <w:fldChar w:fldCharType="separate"/>
       </w:r>
       <w:r>
-        <w:t>3.2</w:t>
+        <w:t>4.2</w:t>
       </w:r>
       <w:r>
         <w:fldChar w:fldCharType="end"/>
@@ -11374,11 +11243,11 @@
       <w:pPr>
         <w:pStyle w:val="Heading2"/>
       </w:pPr>
-      <w:bookmarkStart w:id="28" w:name="_Toc177630144"/>
+      <w:bookmarkStart w:id="32" w:name="_Toc240447996"/>
       <w:r>
         <w:t>Blocked beacon detection</w:t>
       </w:r>
-      <w:bookmarkEnd w:id="28"/>
+      <w:bookmarkEnd w:id="32"/>
     </w:p>
     <w:p>
       <w:r>
@@ -11430,13 +11299,8 @@
       <w:r>
         <w:t xml:space="preserve">to instead edit the ping table </w:t>
       </w:r>
-      <w:proofErr w:type="gramStart"/>
-      <w:r>
-        <w:t>in order to</w:t>
-      </w:r>
-      <w:proofErr w:type="gramEnd"/>
-      <w:r>
-        <w:t xml:space="preserve"> </w:t>
+      <w:r>
+        <w:t xml:space="preserve">in order to </w:t>
       </w:r>
       <w:r>
         <w:t xml:space="preserve">avoid </w:t>
@@ -11449,23 +11313,15 @@
       <w:pPr>
         <w:pStyle w:val="Heading2"/>
       </w:pPr>
-      <w:bookmarkStart w:id="29" w:name="_Toc177630145"/>
+      <w:bookmarkStart w:id="33" w:name="_Toc240447997"/>
       <w:r>
         <w:t>Elevation correction</w:t>
       </w:r>
-      <w:bookmarkEnd w:id="29"/>
+      <w:bookmarkEnd w:id="33"/>
     </w:p>
     <w:p>
       <w:r>
-        <w:t xml:space="preserve">This 2 bit option allows different methods to compensate for variations seen when passing directly </w:t>
-      </w:r>
-      <w:proofErr w:type="gramStart"/>
-      <w:r>
-        <w:t>underneath  or</w:t>
-      </w:r>
-      <w:proofErr w:type="gramEnd"/>
-      <w:r>
-        <w:t xml:space="preserve"> close to a beacon. If the beacons are</w:t>
+        <w:t>This 2 bit option allows different methods to compensate for variations seen when passing directly underneath  or close to a beacon. If the beacons are</w:t>
       </w:r>
       <w:r>
         <w:t xml:space="preserve"> all</w:t>
@@ -11654,498 +11510,406 @@
       <w:pPr>
         <w:pStyle w:val="Heading2"/>
       </w:pPr>
-      <w:bookmarkStart w:id="30" w:name="_Toc177630146"/>
+      <w:bookmarkStart w:id="34" w:name="_Toc240447998"/>
       <w:r>
         <w:t>Disable low pass filter</w:t>
-      </w:r>
-      <w:bookmarkEnd w:id="30"/>
-    </w:p>
-    <w:p>
-      <w:r>
-        <w:t>When operating without a Kalman filter VIPS defaults to passing the output position and velocity through a 5Hz Butterworth low pass filter. This option can be used to disable that filter</w:t>
-      </w:r>
-      <w:r>
-        <w:t xml:space="preserve"> if required</w:t>
-      </w:r>
-      <w:r>
-        <w:t>.</w:t>
-      </w:r>
-    </w:p>
-    <w:p>
-      <w:pPr>
-        <w:pStyle w:val="Heading2"/>
-      </w:pPr>
-      <w:bookmarkStart w:id="31" w:name="_Toc177630147"/>
-      <w:r>
-        <w:t>Force VIPS mode</w:t>
-      </w:r>
-      <w:bookmarkEnd w:id="31"/>
-    </w:p>
-    <w:p>
-      <w:r>
-        <w:t xml:space="preserve">Only applicable when in VB3i </w:t>
-      </w:r>
-      <w:r>
-        <w:t xml:space="preserve">indoor/outdoor </w:t>
-      </w:r>
-      <w:r>
-        <w:t xml:space="preserve">or ADMA </w:t>
-      </w:r>
-      <w:r>
-        <w:t>mode. This option forces the system to only ever use VIPS even if set to indoor/outdoor mode. This should be used when GPS is only being used as a time source and never used for positioning.</w:t>
-      </w:r>
-    </w:p>
-    <w:p>
-      <w:pPr>
-        <w:pStyle w:val="Heading2"/>
-      </w:pPr>
-      <w:bookmarkStart w:id="32" w:name="_Toc177630148"/>
-      <w:r>
-        <w:lastRenderedPageBreak/>
-        <w:t>Disable fine grain sync</w:t>
-      </w:r>
-      <w:bookmarkEnd w:id="32"/>
-    </w:p>
-    <w:p>
-      <w:r>
-        <w:t>Only applicable</w:t>
-      </w:r>
-      <w:r>
-        <w:t xml:space="preserve"> when </w:t>
-      </w:r>
-      <w:r>
-        <w:t xml:space="preserve">in multi-rover mode. Normally when </w:t>
-      </w:r>
-      <w:r>
-        <w:t xml:space="preserve">running in multi-rover mode the system will attempt to </w:t>
-      </w:r>
-      <w:r>
-        <w:t>synchronise the internal clocks between rovers. If the PPS is from a reliable external source (e.g. a VB3i in indoor/outdoor mode) then it is better to disable this and trust the PPS for cross unit synchronisation.</w:t>
-      </w:r>
-    </w:p>
-    <w:p>
-      <w:pPr>
-        <w:pStyle w:val="Heading2"/>
-      </w:pPr>
-      <w:bookmarkStart w:id="33" w:name="_Toc177630149"/>
-      <w:r>
-        <w:t>Studio LED mode</w:t>
-      </w:r>
-      <w:bookmarkEnd w:id="33"/>
-    </w:p>
-    <w:p>
-      <w:r>
-        <w:t xml:space="preserve">Beacon only. When enabled the beacon will disable its LED 30 seconds after first seeing a rover. The LED will </w:t>
-      </w:r>
-      <w:r>
-        <w:t xml:space="preserve">then </w:t>
-      </w:r>
-      <w:r>
-        <w:t xml:space="preserve">remain off until the </w:t>
-      </w:r>
-      <w:r>
-        <w:t xml:space="preserve">unit is </w:t>
-      </w:r>
-      <w:r>
-        <w:t>next reset</w:t>
-      </w:r>
-      <w:r>
-        <w:t xml:space="preserve"> or power cycled</w:t>
-      </w:r>
-      <w:r>
-        <w:t>.</w:t>
-      </w:r>
-    </w:p>
-    <w:p>
-      <w:pPr>
-        <w:pStyle w:val="Heading2"/>
-      </w:pPr>
-      <w:bookmarkStart w:id="34" w:name="_Toc177630150"/>
-      <w:r>
-        <w:t>Single Sided Fallback.</w:t>
       </w:r>
       <w:bookmarkEnd w:id="34"/>
     </w:p>
     <w:p>
       <w:r>
-        <w:t>Required Beacon F/W 1.0.2, Rover radio F/W 1.2.14, Wearable MM F/W 1.????.</w:t>
-      </w:r>
-      <w:r>
-        <w:br/>
-      </w:r>
-      <w:r>
-        <w:t xml:space="preserve">Under normal operation VIPS uses double sided two way ranging. While this provides the best possible accuracy it requires 4 radio messages to produce a range, if any of these 4 are lost </w:t>
-      </w:r>
-      <w:r>
-        <w:t xml:space="preserve">due to interference </w:t>
-      </w:r>
-      <w:r>
-        <w:t>then the range measurement fails.</w:t>
-      </w:r>
-      <w:r>
-        <w:t xml:space="preserve"> Single sided ranging allows the rover to calculate a range from just the first two of these messages. </w:t>
-      </w:r>
-      <w:r>
-        <w:br/>
-      </w:r>
-      <w:r>
-        <w:t xml:space="preserve">When enabled if the system has insufficient information to calculate a </w:t>
-      </w:r>
-      <w:proofErr w:type="gramStart"/>
-      <w:r>
-        <w:t>double sided</w:t>
-      </w:r>
-      <w:proofErr w:type="gramEnd"/>
-      <w:r>
-        <w:t xml:space="preserve"> range it will fall back to a single sided calculation. This will increase the number of measurements available to the position calculation engine in the event of intermittent jamming and </w:t>
-      </w:r>
-      <w:r>
-        <w:t>multi-rover systems</w:t>
-      </w:r>
-      <w:r>
-        <w:t xml:space="preserve">. </w:t>
-      </w:r>
-      <w:proofErr w:type="gramStart"/>
-      <w:r>
-        <w:t>However</w:t>
-      </w:r>
-      <w:proofErr w:type="gramEnd"/>
-      <w:r>
-        <w:t xml:space="preserve"> this method of ranging </w:t>
-      </w:r>
-      <w:r>
-        <w:t xml:space="preserve">can </w:t>
-      </w:r>
-      <w:r>
-        <w:t xml:space="preserve">result in a slight increase in measurement noise </w:t>
-      </w:r>
-      <w:r>
-        <w:t xml:space="preserve">in some situations </w:t>
-      </w:r>
-      <w:r>
-        <w:t xml:space="preserve">and so may not be suitable for every application. </w:t>
+        <w:t>When operating without a Kalman filter VIPS defaults to passing the output position and velocity through a 5Hz Butterworth low pass filter. This option can be used to disable that filter</w:t>
+      </w:r>
+      <w:r>
+        <w:t xml:space="preserve"> if required</w:t>
+      </w:r>
+      <w:r>
+        <w:t>.</w:t>
       </w:r>
     </w:p>
     <w:p>
-      <w:r>
-        <w:t>Note that for Radio FW 1.2.14-1.2.15 this bit was used to enable single sided. From 1.2.16 this was swapped to single sided being enabled as default and this bit being used to disable it.</w:t>
-      </w:r>
-    </w:p>
-    <w:p>
       <w:pPr>
         <w:pStyle w:val="Heading2"/>
       </w:pPr>
-      <w:bookmarkStart w:id="35" w:name="_Toc177630151"/>
-      <w:proofErr w:type="spellStart"/>
-      <w:r>
-        <w:t>GeoFence</w:t>
-      </w:r>
-      <w:proofErr w:type="spellEnd"/>
-      <w:r>
-        <w:t xml:space="preserve"> Size</w:t>
+      <w:bookmarkStart w:id="35" w:name="_Toc240447999"/>
+      <w:r>
+        <w:t>Force VIPS mode</w:t>
       </w:r>
       <w:bookmarkEnd w:id="35"/>
     </w:p>
     <w:p>
       <w:r>
-        <w:t xml:space="preserve">Requires position engine </w:t>
-      </w:r>
-      <w:r>
-        <w:t>1.5.48</w:t>
-      </w:r>
-      <w:r>
-        <w:t xml:space="preserve"> or later.</w:t>
+        <w:t xml:space="preserve">Only applicable when in VB3i </w:t>
+      </w:r>
+      <w:r>
+        <w:t xml:space="preserve">indoor/outdoor </w:t>
+      </w:r>
+      <w:r>
+        <w:t xml:space="preserve">or ADMA </w:t>
+      </w:r>
+      <w:r>
+        <w:t>mode. This option forces the system to only ever use VIPS even if set to indoor/outdoor mode. This should be used when GPS is only being used as a time source and never used for positioning.</w:t>
       </w:r>
     </w:p>
     <w:p>
-      <w:r>
-        <w:t xml:space="preserve">As default VIPS implements a basic geofence around the covered area. If the rover passes outside of this </w:t>
-      </w:r>
-      <w:proofErr w:type="gramStart"/>
-      <w:r>
-        <w:t>fence</w:t>
-      </w:r>
-      <w:proofErr w:type="gramEnd"/>
-      <w:r>
-        <w:t xml:space="preserve"> then the output is flagged as do not use. This will impact the reliability flags section of the serial message, the CAN output and the VB3i when in indoor/outdoor mode. Note, other than a VB3i in indoor/outdoor mode this will not have any addition impact on the system operation, it will still attempt to operate as normal. This is purely intended as an indicator to the user equipment that the rover is leaving the covered area.</w:t>
-      </w:r>
-      <w:r>
-        <w:br/>
-        <w:t>This fence defaults to 10m outside of the beacon covered area.</w:t>
-      </w:r>
-      <w:r>
-        <w:br/>
-        <w:t>Th</w:t>
-      </w:r>
-      <w:r>
-        <w:t>e</w:t>
-      </w:r>
-      <w:r>
-        <w:t xml:space="preserve"> size is set as 10 – the value of this </w:t>
-      </w:r>
-      <w:proofErr w:type="gramStart"/>
-      <w:r>
-        <w:t>4 bit</w:t>
-      </w:r>
-      <w:proofErr w:type="gramEnd"/>
-      <w:r>
-        <w:t xml:space="preserve"> field allowing the user to reduce the size of this fence by up to 15 meters and thus placing it inside the covered area if desired.</w:t>
-      </w:r>
-    </w:p>
-    <w:p>
-      <w:r>
-        <w:t xml:space="preserve">In all cases a </w:t>
-      </w:r>
-      <w:proofErr w:type="gramStart"/>
-      <w:r>
-        <w:t>1 meter</w:t>
-      </w:r>
-      <w:proofErr w:type="gramEnd"/>
-      <w:r>
-        <w:t xml:space="preserve"> hysteresis is applied, the rover must move 1 meter further in to the site to clear the flag.</w:t>
-      </w:r>
-    </w:p>
-    <w:p>
-      <w:pPr>
-        <w:pStyle w:val="Heading1"/>
-      </w:pPr>
-      <w:bookmarkStart w:id="36" w:name="_Toc177630152"/>
+      <w:pPr>
+        <w:pStyle w:val="Heading2"/>
+      </w:pPr>
+      <w:bookmarkStart w:id="36" w:name="_Toc240448000"/>
       <w:r>
         <w:lastRenderedPageBreak/>
-        <w:t>Manual c</w:t>
-      </w:r>
-      <w:r>
-        <w:t>onfigur</w:t>
-      </w:r>
-      <w:r>
-        <w:t>ation of</w:t>
-      </w:r>
-      <w:r>
-        <w:t xml:space="preserve"> VIPS options</w:t>
+        <w:t>Disable fine grain sync</w:t>
       </w:r>
       <w:bookmarkEnd w:id="36"/>
     </w:p>
     <w:p>
       <w:r>
-        <w:t xml:space="preserve">Most VIPS options can be configured from within the VIPS Site setup software. </w:t>
-      </w:r>
-      <w:proofErr w:type="gramStart"/>
-      <w:r>
-        <w:t>However</w:t>
-      </w:r>
-      <w:proofErr w:type="gramEnd"/>
-      <w:r>
-        <w:t xml:space="preserve"> some newer or less common combinations and options may not be fully supported by the software. It is possible to manually force a </w:t>
-      </w:r>
-      <w:r>
-        <w:t xml:space="preserve">specific </w:t>
-      </w:r>
-      <w:r>
-        <w:t xml:space="preserve">configuration by editing the setup </w:t>
-      </w:r>
-      <w:r>
-        <w:t>JSON</w:t>
-      </w:r>
-      <w:r>
-        <w:t xml:space="preserve"> file in a text editor. When this modified </w:t>
-      </w:r>
-      <w:r>
-        <w:t>JSON</w:t>
-      </w:r>
-      <w:r>
-        <w:t xml:space="preserve"> file is loading into site setup the user set values will be maintained unless the configuration is</w:t>
-      </w:r>
-      <w:r>
-        <w:t xml:space="preserve"> later </w:t>
-      </w:r>
-      <w:r>
-        <w:t>changed in the user interface.</w:t>
+        <w:t>Only applicable</w:t>
+      </w:r>
+      <w:r>
+        <w:t xml:space="preserve"> when </w:t>
+      </w:r>
+      <w:r>
+        <w:t xml:space="preserve">in multi-rover mode. Normally when </w:t>
+      </w:r>
+      <w:r>
+        <w:t xml:space="preserve">running in multi-rover mode the system will attempt to </w:t>
+      </w:r>
+      <w:r>
+        <w:t>synchronise the internal clocks between rovers. If the PPS is from a reliable external source (e.g. a VB3i in indoor/outdoor mode) then it is better to disable this and trust the PPS for cross unit synchronisation.</w:t>
       </w:r>
     </w:p>
     <w:p>
-      <w:r>
-        <w:t xml:space="preserve">There are two different configuration options that may be modified by the user, the output format and the operating mode options. </w:t>
-      </w:r>
-      <w:r>
-        <w:t>When editing these values ensure that only the required value is changed and that no other file contents, including commas at the ends of lines, are changed.</w:t>
-      </w:r>
+      <w:pPr>
+        <w:pStyle w:val="Heading2"/>
+      </w:pPr>
+      <w:bookmarkStart w:id="37" w:name="_Toc240448001"/>
+      <w:r>
+        <w:t>Studio LED mode</w:t>
+      </w:r>
+      <w:bookmarkEnd w:id="37"/>
     </w:p>
     <w:p>
+      <w:r>
+        <w:t xml:space="preserve">Beacon only. When enabled the beacon will disable its LED 30 seconds after first seeing a rover. The LED will </w:t>
+      </w:r>
+      <w:r>
+        <w:t xml:space="preserve">then </w:t>
+      </w:r>
+      <w:r>
+        <w:t xml:space="preserve">remain off until the </w:t>
+      </w:r>
+      <w:r>
+        <w:t xml:space="preserve">unit is </w:t>
+      </w:r>
+      <w:r>
+        <w:t>next reset</w:t>
+      </w:r>
+      <w:r>
+        <w:t xml:space="preserve"> or power cycled</w:t>
+      </w:r>
+      <w:r>
+        <w:t>.</w:t>
+      </w:r>
+    </w:p>
+    <w:p>
       <w:pPr>
         <w:pStyle w:val="Heading2"/>
       </w:pPr>
-      <w:bookmarkStart w:id="37" w:name="_Ref97548984"/>
-      <w:bookmarkStart w:id="38" w:name="_Toc177630153"/>
-      <w:r>
-        <w:t>Output format</w:t>
-      </w:r>
-      <w:bookmarkEnd w:id="37"/>
+      <w:bookmarkStart w:id="38" w:name="_Toc240448002"/>
+      <w:r>
+        <w:t>Single Sided Fallback.</w:t>
+      </w:r>
       <w:bookmarkEnd w:id="38"/>
     </w:p>
     <w:p>
       <w:r>
-        <w:t>This setting is found under “</w:t>
-      </w:r>
-      <w:proofErr w:type="spellStart"/>
-      <w:r>
-        <w:t>BinaryOutput</w:t>
-      </w:r>
-      <w:proofErr w:type="spellEnd"/>
-      <w:r>
-        <w:t xml:space="preserve">” in the </w:t>
-      </w:r>
-      <w:r>
-        <w:t>JSON</w:t>
-      </w:r>
-      <w:r>
-        <w:t xml:space="preserve"> file. It controls the desired VIPS binary or NMEA output options.</w:t>
+        <w:t>Required Beacon F/W 1.0.2, Rover radio F/W 1.2.14, Wearable MM F/W 1.????.</w:t>
+      </w:r>
+      <w:r>
+        <w:br/>
+      </w:r>
+      <w:r>
+        <w:t xml:space="preserve">Under normal operation VIPS uses double sided two way ranging. While this provides the best possible accuracy it requires 4 radio messages to produce a range, if any of these 4 are lost </w:t>
+      </w:r>
+      <w:r>
+        <w:t xml:space="preserve">due to interference </w:t>
+      </w:r>
+      <w:r>
+        <w:t>then the range measurement fails.</w:t>
+      </w:r>
+      <w:r>
+        <w:t xml:space="preserve"> Single sided ranging allows the rover to calculate a range from just the first two of these messages. </w:t>
+      </w:r>
+      <w:r>
+        <w:br/>
+      </w:r>
+      <w:r>
+        <w:t xml:space="preserve">When enabled if the system has insufficient information to calculate a double sided range it will fall back to a single sided calculation. This will increase the number of measurements available to the position calculation engine in the event of intermittent jamming and </w:t>
+      </w:r>
+      <w:r>
+        <w:t>multi-rover systems</w:t>
+      </w:r>
+      <w:r>
+        <w:t xml:space="preserve">. </w:t>
+      </w:r>
+      <w:r>
+        <w:t xml:space="preserve">However this method of ranging </w:t>
+      </w:r>
+      <w:r>
+        <w:t xml:space="preserve">can </w:t>
+      </w:r>
+      <w:r>
+        <w:t xml:space="preserve">result in a slight increase in measurement noise </w:t>
+      </w:r>
+      <w:r>
+        <w:t xml:space="preserve">in some situations </w:t>
+      </w:r>
+      <w:r>
+        <w:t xml:space="preserve">and so may not be suitable for every application. </w:t>
       </w:r>
     </w:p>
     <w:p>
       <w:r>
-        <w:t xml:space="preserve">In binary output mode the value set here will be used as the requested options mask as detailed in section </w:t>
-      </w:r>
-      <w:r>
-        <w:fldChar w:fldCharType="begin"/>
-      </w:r>
-      <w:r>
-        <w:instrText xml:space="preserve"> REF _Ref97549053 \r \h </w:instrText>
-      </w:r>
-      <w:r>
-        <w:fldChar w:fldCharType="separate"/>
-      </w:r>
-      <w:r>
-        <w:t>1.1</w:t>
-      </w:r>
-      <w:r>
-        <w:fldChar w:fldCharType="end"/>
-      </w:r>
-      <w:r>
-        <w:t xml:space="preserve">. The </w:t>
-      </w:r>
-      <w:r>
-        <w:t xml:space="preserve">options </w:t>
-      </w:r>
-      <w:r>
-        <w:t>value i</w:t>
-      </w:r>
-      <w:r>
-        <w:t>n</w:t>
-      </w:r>
-      <w:r>
-        <w:t xml:space="preserve"> the output message will normally be </w:t>
-      </w:r>
-      <w:r>
-        <w:t xml:space="preserve">the same as </w:t>
-      </w:r>
-      <w:r>
-        <w:t xml:space="preserve">the option set </w:t>
-      </w:r>
-      <w:r>
-        <w:t>h</w:t>
-      </w:r>
-      <w:r>
-        <w:t xml:space="preserve">ere unless an invalid combination of options has been selected. For </w:t>
-      </w:r>
-      <w:proofErr w:type="gramStart"/>
-      <w:r>
-        <w:t>example</w:t>
-      </w:r>
-      <w:proofErr w:type="gramEnd"/>
-      <w:r>
-        <w:t xml:space="preserve"> orientation channels will only be output if the Kalman filter is also enabled.</w:t>
-      </w:r>
-      <w:r>
-        <w:t xml:space="preserve"> The user should always parse a message based on the options field it contains not the value requested in the JSON file.</w:t>
+        <w:t>Note that for Radio FW 1.2.14-1.2.15 this bit was used to enable single sided. From 1.2.16 this was swapped to single sided being enabled as default and this bit being used to disable it.</w:t>
       </w:r>
     </w:p>
     <w:p>
-      <w:r>
-        <w:t xml:space="preserve">In NMEA mode this value sets which NMEA messages are output as detailed in section </w:t>
-      </w:r>
-      <w:r>
-        <w:fldChar w:fldCharType="begin"/>
-      </w:r>
-      <w:r>
-        <w:instrText xml:space="preserve"> REF _Ref97549062 \r \h </w:instrText>
-      </w:r>
-      <w:r>
-        <w:fldChar w:fldCharType="separate"/>
-      </w:r>
-      <w:r>
-        <w:t>1.2</w:t>
-      </w:r>
-      <w:r>
-        <w:fldChar w:fldCharType="end"/>
-      </w:r>
+      <w:pPr>
+        <w:pStyle w:val="Heading2"/>
+      </w:pPr>
+      <w:bookmarkStart w:id="39" w:name="_Toc240448003"/>
+      <w:r>
+        <w:t>GeoFence Size</w:t>
+      </w:r>
+      <w:bookmarkEnd w:id="39"/>
     </w:p>
     <w:p>
-      <w:pPr>
-        <w:pStyle w:val="Heading2"/>
-      </w:pPr>
-      <w:bookmarkStart w:id="39" w:name="_Ref97549028"/>
-      <w:bookmarkStart w:id="40" w:name="_Toc177630154"/>
-      <w:r>
-        <w:t>Operating Options</w:t>
-      </w:r>
-      <w:bookmarkEnd w:id="39"/>
+      <w:r>
+        <w:t xml:space="preserve">Requires position engine </w:t>
+      </w:r>
+      <w:r>
+        <w:t>1.5.48</w:t>
+      </w:r>
+      <w:r>
+        <w:t xml:space="preserve"> or later.</w:t>
+      </w:r>
+    </w:p>
+    <w:p>
+      <w:r>
+        <w:t>As default VIPS implements a basic geofence around the covered area. If the rover passes outside of this fence then the output is flagged as do not use. This will impact the reliability flags section of the serial message, the CAN output and the VB3i when in indoor/outdoor mode. Note, other than a VB3i in indoor/outdoor mode this will not have any addition impact on the system operation, it will still attempt to operate as normal. This is purely intended as an indicator to the user equipment that the rover is leaving the covered area.</w:t>
+      </w:r>
+      <w:r>
+        <w:br/>
+        <w:t>This fence defaults to 10m outside of the beacon covered area.</w:t>
+      </w:r>
+      <w:r>
+        <w:br/>
+        <w:t>Th</w:t>
+      </w:r>
+      <w:r>
+        <w:t>e</w:t>
+      </w:r>
+      <w:r>
+        <w:t xml:space="preserve"> size is set as 10 – the value of this 4 bit field allowing the user to reduce the size of this fence by up to 15 meters and thus placing it inside the covered area if desired.</w:t>
+      </w:r>
+    </w:p>
+    <w:p>
+      <w:r>
+        <w:t>In all cases a 1 meter hysteresis is applied, the rover must move 1 meter further in to the site to clear the flag.</w:t>
+      </w:r>
+    </w:p>
+    <w:p>
+      <w:pPr>
+        <w:pStyle w:val="Heading1"/>
+      </w:pPr>
+      <w:bookmarkStart w:id="40" w:name="_Toc240448004"/>
+      <w:r>
+        <w:lastRenderedPageBreak/>
+        <w:t>Manual c</w:t>
+      </w:r>
+      <w:r>
+        <w:t>onfigur</w:t>
+      </w:r>
+      <w:r>
+        <w:t>ation of</w:t>
+      </w:r>
+      <w:r>
+        <w:t xml:space="preserve"> VIPS options</w:t>
+      </w:r>
       <w:bookmarkEnd w:id="40"/>
     </w:p>
     <w:p>
       <w:r>
-        <w:t xml:space="preserve">This setting controls </w:t>
-      </w:r>
-      <w:proofErr w:type="gramStart"/>
-      <w:r>
-        <w:t>a number of</w:t>
-      </w:r>
-      <w:proofErr w:type="gramEnd"/>
-      <w:r>
-        <w:t xml:space="preserve"> options used to control the operation of the VIPS system. As with the output format settings these can normally be set from the </w:t>
-      </w:r>
-      <w:proofErr w:type="gramStart"/>
-      <w:r>
-        <w:t>UI</w:t>
-      </w:r>
-      <w:proofErr w:type="gramEnd"/>
-      <w:r>
-        <w:t xml:space="preserve"> but the selection can also be manually forced by changing the .</w:t>
-      </w:r>
-      <w:proofErr w:type="spellStart"/>
-      <w:r>
-        <w:t>json</w:t>
-      </w:r>
-      <w:proofErr w:type="spellEnd"/>
-      <w:r>
-        <w:t xml:space="preserve"> file. </w:t>
+        <w:t xml:space="preserve">Most VIPS options can be configured from within the VIPS Site setup software. However some newer or less common combinations and options may not be fully supported by the software. It is possible to manually force a </w:t>
+      </w:r>
+      <w:r>
+        <w:t xml:space="preserve">specific </w:t>
+      </w:r>
+      <w:r>
+        <w:t xml:space="preserve">configuration by editing the setup </w:t>
+      </w:r>
+      <w:r>
+        <w:t>JSON</w:t>
+      </w:r>
+      <w:r>
+        <w:t xml:space="preserve"> file in a text editor. When this modified </w:t>
+      </w:r>
+      <w:r>
+        <w:t>JSON</w:t>
+      </w:r>
+      <w:r>
+        <w:t xml:space="preserve"> file is loading into site setup the user set values will be maintained unless the configuration is</w:t>
+      </w:r>
+      <w:r>
+        <w:t xml:space="preserve"> later </w:t>
+      </w:r>
+      <w:r>
+        <w:t>changed in the user interface.</w:t>
       </w:r>
     </w:p>
     <w:p>
       <w:r>
-        <w:t>This value can be found in the JSON file under “</w:t>
-      </w:r>
-      <w:r>
-        <w:t>Options</w:t>
-      </w:r>
-      <w:r>
-        <w:t xml:space="preserve">” within the </w:t>
-      </w:r>
-      <w:r>
-        <w:t>"</w:t>
-      </w:r>
-      <w:proofErr w:type="spellStart"/>
-      <w:r>
-        <w:t>SystemConfiguration</w:t>
-      </w:r>
-      <w:proofErr w:type="spellEnd"/>
-      <w:r>
-        <w:t>"</w:t>
-      </w:r>
-      <w:r>
-        <w:t xml:space="preserve"> section of the file.</w:t>
+        <w:t xml:space="preserve">There are two different configuration options that may be modified by the user, the output format and the operating mode options. </w:t>
+      </w:r>
+      <w:r>
+        <w:t>When editing these values ensure that only the required value is changed and that no other file contents, including commas at the ends of lines, are changed.</w:t>
       </w:r>
     </w:p>
     <w:p>
+      <w:pPr>
+        <w:pStyle w:val="Heading2"/>
+      </w:pPr>
+      <w:bookmarkStart w:id="41" w:name="_Ref97548984"/>
+      <w:bookmarkStart w:id="42" w:name="_Toc240448005"/>
+      <w:r>
+        <w:t>Output format</w:t>
+      </w:r>
+      <w:bookmarkEnd w:id="41"/>
+      <w:bookmarkEnd w:id="42"/>
+    </w:p>
+    <w:p>
+      <w:r>
+        <w:t>This setting is found under “</w:t>
+      </w:r>
+      <w:r>
+        <w:t>BinaryOutput</w:t>
+      </w:r>
+      <w:r>
+        <w:t xml:space="preserve">” in the </w:t>
+      </w:r>
+      <w:r>
+        <w:t>JSON</w:t>
+      </w:r>
+      <w:r>
+        <w:t xml:space="preserve"> file. It controls the desired VIPS binary or NMEA output options.</w:t>
+      </w:r>
+    </w:p>
+    <w:p>
+      <w:r>
+        <w:t xml:space="preserve">In binary output mode the value set here will be used as the requested options mask as detailed in section </w:t>
+      </w:r>
+      <w:r>
+        <w:fldChar w:fldCharType="begin"/>
+      </w:r>
+      <w:r>
+        <w:instrText xml:space="preserve"> REF _Ref97549053 \r \h </w:instrText>
+      </w:r>
+      <w:r>
+        <w:fldChar w:fldCharType="separate"/>
+      </w:r>
+      <w:r>
+        <w:t>2.1</w:t>
+      </w:r>
+      <w:r>
+        <w:fldChar w:fldCharType="end"/>
+      </w:r>
+      <w:r>
+        <w:t xml:space="preserve">. The </w:t>
+      </w:r>
+      <w:r>
+        <w:t xml:space="preserve">options </w:t>
+      </w:r>
+      <w:r>
+        <w:t>value i</w:t>
+      </w:r>
+      <w:r>
+        <w:t>n</w:t>
+      </w:r>
+      <w:r>
+        <w:t xml:space="preserve"> the output message will normally be </w:t>
+      </w:r>
+      <w:r>
+        <w:t xml:space="preserve">the same as </w:t>
+      </w:r>
+      <w:r>
+        <w:t xml:space="preserve">the option set </w:t>
+      </w:r>
+      <w:r>
+        <w:t>h</w:t>
+      </w:r>
+      <w:r>
+        <w:t>ere unless an invalid combination of options has been selected. For example orientation channels will only be output if the Kalman filter is also enabled.</w:t>
+      </w:r>
+      <w:r>
+        <w:t xml:space="preserve"> The user should always parse a message based on the options field it contains not the value requested in the JSON file.</w:t>
+      </w:r>
+    </w:p>
+    <w:p>
+      <w:r>
+        <w:t xml:space="preserve">In NMEA mode this value sets which NMEA messages are output as detailed in section </w:t>
+      </w:r>
+      <w:r>
+        <w:fldChar w:fldCharType="begin"/>
+      </w:r>
+      <w:r>
+        <w:instrText xml:space="preserve"> REF _Ref97549062 \r \h </w:instrText>
+      </w:r>
+      <w:r>
+        <w:fldChar w:fldCharType="separate"/>
+      </w:r>
+      <w:r>
+        <w:t>2.2</w:t>
+      </w:r>
+      <w:r>
+        <w:fldChar w:fldCharType="end"/>
+      </w:r>
+    </w:p>
+    <w:p>
+      <w:pPr>
+        <w:pStyle w:val="Heading2"/>
+      </w:pPr>
+      <w:bookmarkStart w:id="43" w:name="_Ref97549028"/>
+      <w:bookmarkStart w:id="44" w:name="_Toc240448006"/>
+      <w:r>
+        <w:t>Operating Options</w:t>
+      </w:r>
+      <w:bookmarkEnd w:id="43"/>
+      <w:bookmarkEnd w:id="44"/>
+    </w:p>
+    <w:p>
+      <w:r>
+        <w:t xml:space="preserve">This setting controls a number of options used to control the operation of the VIPS system. As with the output format settings these can normally be set from the UI but the selection can also be manually forced by changing the .json file. </w:t>
+      </w:r>
+    </w:p>
+    <w:p>
+      <w:r>
+        <w:t>This value can be found in the JSON file under “</w:t>
+      </w:r>
+      <w:r>
+        <w:t>Options</w:t>
+      </w:r>
+      <w:r>
+        <w:t xml:space="preserve">” within the </w:t>
+      </w:r>
+      <w:r>
+        <w:t>"SystemConfiguration"</w:t>
+      </w:r>
+      <w:r>
+        <w:t xml:space="preserve"> section of the file.</w:t>
+      </w:r>
+    </w:p>
+    <w:p>
       <w:r>
         <w:t xml:space="preserve">Details of the available options are given in section </w:t>
       </w:r>
@@ -12159,7 +11923,7 @@
         <w:fldChar w:fldCharType="separate"/>
       </w:r>
       <w:r>
-        <w:t>2</w:t>
+        <w:t>3</w:t>
       </w:r>
       <w:r>
         <w:fldChar w:fldCharType="end"/>
@@ -12179,7 +11943,7 @@
 </file>
 
 <file path=word/endnotes.xml><?xml version="1.0" encoding="utf-8"?>
-<w:endnotes xmlns:wpc="http://schemas.microsoft.com/office/word/2010/wordprocessingCanvas" xmlns:cx="http://schemas.microsoft.com/office/drawing/2014/chartex" xmlns:cx1="http://schemas.microsoft.com/office/drawing/2015/9/8/chartex" xmlns:cx2="http://schemas.microsoft.com/office/drawing/2015/10/21/chartex" xmlns:cx3="http://schemas.microsoft.com/office/drawing/2016/5/9/chartex" xmlns:cx4="http://schemas.microsoft.com/office/drawing/2016/5/10/chartex" xmlns:cx5="http://schemas.microsoft.com/office/drawing/2016/5/11/chartex" xmlns:cx6="http://schemas.microsoft.com/office/drawing/2016/5/12/chartex" xmlns:cx7="http://schemas.microsoft.com/office/drawing/2016/5/13/chartex" xmlns:cx8="http://schemas.microsoft.com/office/drawing/2016/5/14/chartex" xmlns:mc="http://schemas.openxmlformats.org/markup-compatibility/2006" xmlns:aink="http://schemas.microsoft.com/office/drawing/2016/ink" xmlns:am3d="http://schemas.microsoft.com/office/drawing/2017/model3d" xmlns:o="urn:schemas-microsoft-com:office:office" xmlns:oel="http://schemas.microsoft.com/office/2019/extlst" xmlns:r="http://schemas.openxmlformats.org/officeDocument/2006/relationships" xmlns:m="http://schemas.openxmlformats.org/officeDocument/2006/math" xmlns:v="urn:schemas-microsoft-com:vml" xmlns:wp14="http://schemas.microsoft.com/office/word/2010/wordprocessingDrawing" xmlns:wp="http://schemas.openxmlformats.org/drawingml/2006/wordprocessingDrawing" xmlns:w10="urn:schemas-microsoft-com:office:word" xmlns:w="http://schemas.openxmlformats.org/wordprocessingml/2006/main" xmlns:w14="http://schemas.microsoft.com/office/word/2010/wordml" xmlns:w15="http://schemas.microsoft.com/office/word/2012/wordml" xmlns:w16cex="http://schemas.microsoft.com/office/word/2018/wordml/cex" xmlns:w16cid="http://schemas.microsoft.com/office/word/2016/wordml/cid" xmlns:w16="http://schemas.microsoft.com/office/word/2018/wordml" xmlns:w16du="http://schemas.microsoft.com/office/word/2023/wordml/word16du" xmlns:w16sdtdh="http://schemas.microsoft.com/office/word/2020/wordml/sdtdatahash" xmlns:w16se="http://schemas.microsoft.com/office/word/2015/wordml/symex" xmlns:wpg="http://schemas.microsoft.com/office/word/2010/wordprocessingGroup" xmlns:wpi="http://schemas.microsoft.com/office/word/2010/wordprocessingInk" xmlns:wne="http://schemas.microsoft.com/office/word/2006/wordml" xmlns:wps="http://schemas.microsoft.com/office/word/2010/wordprocessingShape" mc:Ignorable="w14 w15 w16se w16cid w16 w16cex w16sdtdh w16du wp14">
+<w:endnotes xmlns:wpc="http://schemas.microsoft.com/office/word/2010/wordprocessingCanvas" xmlns:cx="http://schemas.microsoft.com/office/drawing/2014/chartex" xmlns:cx1="http://schemas.microsoft.com/office/drawing/2015/9/8/chartex" xmlns:cx2="http://schemas.microsoft.com/office/drawing/2015/10/21/chartex" xmlns:cx3="http://schemas.microsoft.com/office/drawing/2016/5/9/chartex" xmlns:cx4="http://schemas.microsoft.com/office/drawing/2016/5/10/chartex" xmlns:cx5="http://schemas.microsoft.com/office/drawing/2016/5/11/chartex" xmlns:cx6="http://schemas.microsoft.com/office/drawing/2016/5/12/chartex" xmlns:cx7="http://schemas.microsoft.com/office/drawing/2016/5/13/chartex" xmlns:cx8="http://schemas.microsoft.com/office/drawing/2016/5/14/chartex" xmlns:mc="http://schemas.openxmlformats.org/markup-compatibility/2006" xmlns:aink="http://schemas.microsoft.com/office/drawing/2016/ink" xmlns:am3d="http://schemas.microsoft.com/office/drawing/2017/model3d" xmlns:o="urn:schemas-microsoft-com:office:office" xmlns:oel="http://schemas.microsoft.com/office/2019/extlst" xmlns:r="http://schemas.openxmlformats.org/officeDocument/2006/relationships" xmlns:m="http://schemas.openxmlformats.org/officeDocument/2006/math" xmlns:v="urn:schemas-microsoft-com:vml" xmlns:wp14="http://schemas.microsoft.com/office/word/2010/wordprocessingDrawing" xmlns:wp="http://schemas.openxmlformats.org/drawingml/2006/wordprocessingDrawing" xmlns:w10="urn:schemas-microsoft-com:office:word" xmlns:w="http://schemas.openxmlformats.org/wordprocessingml/2006/main" xmlns:w14="http://schemas.microsoft.com/office/word/2010/wordml" xmlns:w15="http://schemas.microsoft.com/office/word/2012/wordml" xmlns:w16cex="http://schemas.microsoft.com/office/word/2018/wordml/cex" xmlns:w16cid="http://schemas.microsoft.com/office/word/2016/wordml/cid" xmlns:w16="http://schemas.microsoft.com/office/word/2018/wordml" xmlns:w16du="http://schemas.microsoft.com/office/word/2023/wordml/word16du" xmlns:w16sdtdh="http://schemas.microsoft.com/office/word/2020/wordml/sdtdatahash" xmlns:w16sdtfl="http://schemas.microsoft.com/office/word/2024/wordml/sdtformatlock" xmlns:w16se="http://schemas.microsoft.com/office/word/2015/wordml/symex" xmlns:wpg="http://schemas.microsoft.com/office/word/2010/wordprocessingGroup" xmlns:wpi="http://schemas.microsoft.com/office/word/2010/wordprocessingInk" xmlns:wne="http://schemas.microsoft.com/office/word/2006/wordml" xmlns:wps="http://schemas.microsoft.com/office/word/2010/wordprocessingShape" mc:Ignorable="w14 w15 w16se w16cid w16 w16cex w16sdtdh w16sdtfl w16du wp14">
   <w:endnote w:type="separator" w:id="-1">
     <w:p>
       <w:pPr>
@@ -12204,7 +11968,7 @@
 </file>
 
 <file path=word/footer1.xml><?xml version="1.0" encoding="utf-8"?>
-<w:ftr xmlns:wpc="http://schemas.microsoft.com/office/word/2010/wordprocessingCanvas" xmlns:cx="http://schemas.microsoft.com/office/drawing/2014/chartex" xmlns:cx1="http://schemas.microsoft.com/office/drawing/2015/9/8/chartex" xmlns:cx2="http://schemas.microsoft.com/office/drawing/2015/10/21/chartex" xmlns:cx3="http://schemas.microsoft.com/office/drawing/2016/5/9/chartex" xmlns:cx4="http://schemas.microsoft.com/office/drawing/2016/5/10/chartex" xmlns:cx5="http://schemas.microsoft.com/office/drawing/2016/5/11/chartex" xmlns:cx6="http://schemas.microsoft.com/office/drawing/2016/5/12/chartex" xmlns:cx7="http://schemas.microsoft.com/office/drawing/2016/5/13/chartex" xmlns:cx8="http://schemas.microsoft.com/office/drawing/2016/5/14/chartex" xmlns:mc="http://schemas.openxmlformats.org/markup-compatibility/2006" xmlns:aink="http://schemas.microsoft.com/office/drawing/2016/ink" xmlns:am3d="http://schemas.microsoft.com/office/drawing/2017/model3d" xmlns:o="urn:schemas-microsoft-com:office:office" xmlns:oel="http://schemas.microsoft.com/office/2019/extlst" xmlns:r="http://schemas.openxmlformats.org/officeDocument/2006/relationships" xmlns:m="http://schemas.openxmlformats.org/officeDocument/2006/math" xmlns:v="urn:schemas-microsoft-com:vml" xmlns:wp14="http://schemas.microsoft.com/office/word/2010/wordprocessingDrawing" xmlns:wp="http://schemas.openxmlformats.org/drawingml/2006/wordprocessingDrawing" xmlns:w10="urn:schemas-microsoft-com:office:word" xmlns:w="http://schemas.openxmlformats.org/wordprocessingml/2006/main" xmlns:w14="http://schemas.microsoft.com/office/word/2010/wordml" xmlns:w15="http://schemas.microsoft.com/office/word/2012/wordml" xmlns:w16cex="http://schemas.microsoft.com/office/word/2018/wordml/cex" xmlns:w16cid="http://schemas.microsoft.com/office/word/2016/wordml/cid" xmlns:w16="http://schemas.microsoft.com/office/word/2018/wordml" xmlns:w16du="http://schemas.microsoft.com/office/word/2023/wordml/word16du" xmlns:w16sdtdh="http://schemas.microsoft.com/office/word/2020/wordml/sdtdatahash" xmlns:w16se="http://schemas.microsoft.com/office/word/2015/wordml/symex" xmlns:wpg="http://schemas.microsoft.com/office/word/2010/wordprocessingGroup" xmlns:wpi="http://schemas.microsoft.com/office/word/2010/wordprocessingInk" xmlns:wne="http://schemas.microsoft.com/office/word/2006/wordml" xmlns:wps="http://schemas.microsoft.com/office/word/2010/wordprocessingShape" mc:Ignorable="w14 w15 w16se w16cid w16 w16cex w16sdtdh w16du wp14">
+<w:ftr xmlns:wpc="http://schemas.microsoft.com/office/word/2010/wordprocessingCanvas" xmlns:cx="http://schemas.microsoft.com/office/drawing/2014/chartex" xmlns:cx1="http://schemas.microsoft.com/office/drawing/2015/9/8/chartex" xmlns:cx2="http://schemas.microsoft.com/office/drawing/2015/10/21/chartex" xmlns:cx3="http://schemas.microsoft.com/office/drawing/2016/5/9/chartex" xmlns:cx4="http://schemas.microsoft.com/office/drawing/2016/5/10/chartex" xmlns:cx5="http://schemas.microsoft.com/office/drawing/2016/5/11/chartex" xmlns:cx6="http://schemas.microsoft.com/office/drawing/2016/5/12/chartex" xmlns:cx7="http://schemas.microsoft.com/office/drawing/2016/5/13/chartex" xmlns:cx8="http://schemas.microsoft.com/office/drawing/2016/5/14/chartex" xmlns:mc="http://schemas.openxmlformats.org/markup-compatibility/2006" xmlns:aink="http://schemas.microsoft.com/office/drawing/2016/ink" xmlns:am3d="http://schemas.microsoft.com/office/drawing/2017/model3d" xmlns:o="urn:schemas-microsoft-com:office:office" xmlns:oel="http://schemas.microsoft.com/office/2019/extlst" xmlns:r="http://schemas.openxmlformats.org/officeDocument/2006/relationships" xmlns:m="http://schemas.openxmlformats.org/officeDocument/2006/math" xmlns:v="urn:schemas-microsoft-com:vml" xmlns:wp14="http://schemas.microsoft.com/office/word/2010/wordprocessingDrawing" xmlns:wp="http://schemas.openxmlformats.org/drawingml/2006/wordprocessingDrawing" xmlns:w10="urn:schemas-microsoft-com:office:word" xmlns:w="http://schemas.openxmlformats.org/wordprocessingml/2006/main" xmlns:w14="http://schemas.microsoft.com/office/word/2010/wordml" xmlns:w15="http://schemas.microsoft.com/office/word/2012/wordml" xmlns:w16cex="http://schemas.microsoft.com/office/word/2018/wordml/cex" xmlns:w16cid="http://schemas.microsoft.com/office/word/2016/wordml/cid" xmlns:w16="http://schemas.microsoft.com/office/word/2018/wordml" xmlns:w16du="http://schemas.microsoft.com/office/word/2023/wordml/word16du" xmlns:w16sdtdh="http://schemas.microsoft.com/office/word/2020/wordml/sdtdatahash" xmlns:w16sdtfl="http://schemas.microsoft.com/office/word/2024/wordml/sdtformatlock" xmlns:w16se="http://schemas.microsoft.com/office/word/2015/wordml/symex" xmlns:wpg="http://schemas.microsoft.com/office/word/2010/wordprocessingGroup" xmlns:wpi="http://schemas.microsoft.com/office/word/2010/wordprocessingInk" xmlns:wne="http://schemas.microsoft.com/office/word/2006/wordml" xmlns:wps="http://schemas.microsoft.com/office/word/2010/wordprocessingShape" mc:Ignorable="w14 w15 w16se w16cid w16 w16cex w16sdtdh w16sdtfl w16du wp14">
   <w:p>
     <w:pPr>
       <w:pStyle w:val="Footer"/>
@@ -12214,7 +11978,7 @@
 </file>
 
 <file path=word/footer2.xml><?xml version="1.0" encoding="utf-8"?>
-<w:ftr xmlns:wpc="http://schemas.microsoft.com/office/word/2010/wordprocessingCanvas" xmlns:cx="http://schemas.microsoft.com/office/drawing/2014/chartex" xmlns:cx1="http://schemas.microsoft.com/office/drawing/2015/9/8/chartex" xmlns:cx2="http://schemas.microsoft.com/office/drawing/2015/10/21/chartex" xmlns:cx3="http://schemas.microsoft.com/office/drawing/2016/5/9/chartex" xmlns:cx4="http://schemas.microsoft.com/office/drawing/2016/5/10/chartex" xmlns:cx5="http://schemas.microsoft.com/office/drawing/2016/5/11/chartex" xmlns:cx6="http://schemas.microsoft.com/office/drawing/2016/5/12/chartex" xmlns:cx7="http://schemas.microsoft.com/office/drawing/2016/5/13/chartex" xmlns:cx8="http://schemas.microsoft.com/office/drawing/2016/5/14/chartex" xmlns:mc="http://schemas.openxmlformats.org/markup-compatibility/2006" xmlns:aink="http://schemas.microsoft.com/office/drawing/2016/ink" xmlns:am3d="http://schemas.microsoft.com/office/drawing/2017/model3d" xmlns:o="urn:schemas-microsoft-com:office:office" xmlns:oel="http://schemas.microsoft.com/office/2019/extlst" xmlns:r="http://schemas.openxmlformats.org/officeDocument/2006/relationships" xmlns:m="http://schemas.openxmlformats.org/officeDocument/2006/math" xmlns:v="urn:schemas-microsoft-com:vml" xmlns:wp14="http://schemas.microsoft.com/office/word/2010/wordprocessingDrawing" xmlns:wp="http://schemas.openxmlformats.org/drawingml/2006/wordprocessingDrawing" xmlns:w10="urn:schemas-microsoft-com:office:word" xmlns:w="http://schemas.openxmlformats.org/wordprocessingml/2006/main" xmlns:w14="http://schemas.microsoft.com/office/word/2010/wordml" xmlns:w15="http://schemas.microsoft.com/office/word/2012/wordml" xmlns:w16cex="http://schemas.microsoft.com/office/word/2018/wordml/cex" xmlns:w16cid="http://schemas.microsoft.com/office/word/2016/wordml/cid" xmlns:w16="http://schemas.microsoft.com/office/word/2018/wordml" xmlns:w16du="http://schemas.microsoft.com/office/word/2023/wordml/word16du" xmlns:w16sdtdh="http://schemas.microsoft.com/office/word/2020/wordml/sdtdatahash" xmlns:w16se="http://schemas.microsoft.com/office/word/2015/wordml/symex" xmlns:wpg="http://schemas.microsoft.com/office/word/2010/wordprocessingGroup" xmlns:wpi="http://schemas.microsoft.com/office/word/2010/wordprocessingInk" xmlns:wne="http://schemas.microsoft.com/office/word/2006/wordml" xmlns:wps="http://schemas.microsoft.com/office/word/2010/wordprocessingShape" mc:Ignorable="w14 w15 w16se w16cid w16 w16cex w16sdtdh w16du wp14">
+<w:ftr xmlns:wpc="http://schemas.microsoft.com/office/word/2010/wordprocessingCanvas" xmlns:cx="http://schemas.microsoft.com/office/drawing/2014/chartex" xmlns:cx1="http://schemas.microsoft.com/office/drawing/2015/9/8/chartex" xmlns:cx2="http://schemas.microsoft.com/office/drawing/2015/10/21/chartex" xmlns:cx3="http://schemas.microsoft.com/office/drawing/2016/5/9/chartex" xmlns:cx4="http://schemas.microsoft.com/office/drawing/2016/5/10/chartex" xmlns:cx5="http://schemas.microsoft.com/office/drawing/2016/5/11/chartex" xmlns:cx6="http://schemas.microsoft.com/office/drawing/2016/5/12/chartex" xmlns:cx7="http://schemas.microsoft.com/office/drawing/2016/5/13/chartex" xmlns:cx8="http://schemas.microsoft.com/office/drawing/2016/5/14/chartex" xmlns:mc="http://schemas.openxmlformats.org/markup-compatibility/2006" xmlns:aink="http://schemas.microsoft.com/office/drawing/2016/ink" xmlns:am3d="http://schemas.microsoft.com/office/drawing/2017/model3d" xmlns:o="urn:schemas-microsoft-com:office:office" xmlns:oel="http://schemas.microsoft.com/office/2019/extlst" xmlns:r="http://schemas.openxmlformats.org/officeDocument/2006/relationships" xmlns:m="http://schemas.openxmlformats.org/officeDocument/2006/math" xmlns:v="urn:schemas-microsoft-com:vml" xmlns:wp14="http://schemas.microsoft.com/office/word/2010/wordprocessingDrawing" xmlns:wp="http://schemas.openxmlformats.org/drawingml/2006/wordprocessingDrawing" xmlns:w10="urn:schemas-microsoft-com:office:word" xmlns:w="http://schemas.openxmlformats.org/wordprocessingml/2006/main" xmlns:w14="http://schemas.microsoft.com/office/word/2010/wordml" xmlns:w15="http://schemas.microsoft.com/office/word/2012/wordml" xmlns:w16cex="http://schemas.microsoft.com/office/word/2018/wordml/cex" xmlns:w16cid="http://schemas.microsoft.com/office/word/2016/wordml/cid" xmlns:w16="http://schemas.microsoft.com/office/word/2018/wordml" xmlns:w16du="http://schemas.microsoft.com/office/word/2023/wordml/word16du" xmlns:w16sdtdh="http://schemas.microsoft.com/office/word/2020/wordml/sdtdatahash" xmlns:w16sdtfl="http://schemas.microsoft.com/office/word/2024/wordml/sdtformatlock" xmlns:w16se="http://schemas.microsoft.com/office/word/2015/wordml/symex" xmlns:wpg="http://schemas.microsoft.com/office/word/2010/wordprocessingGroup" xmlns:wpi="http://schemas.microsoft.com/office/word/2010/wordprocessingInk" xmlns:wne="http://schemas.microsoft.com/office/word/2006/wordml" xmlns:wps="http://schemas.microsoft.com/office/word/2010/wordprocessingShape" mc:Ignorable="w14 w15 w16se w16cid w16 w16cex w16sdtdh w16sdtfl w16du wp14">
   <w:p>
     <w:pPr>
       <w:pStyle w:val="Footer"/>
@@ -12232,7 +11996,7 @@
       <w:rPr>
         <w:noProof/>
       </w:rPr>
-      <w:t>19/09/2024</w:t>
+      <w:t>16/09/2026</w:t>
     </w:r>
     <w:r>
       <w:fldChar w:fldCharType="end"/>
@@ -12266,7 +12030,7 @@
 </file>
 
 <file path=word/footer3.xml><?xml version="1.0" encoding="utf-8"?>
-<w:ftr xmlns:wpc="http://schemas.microsoft.com/office/word/2010/wordprocessingCanvas" xmlns:cx="http://schemas.microsoft.com/office/drawing/2014/chartex" xmlns:cx1="http://schemas.microsoft.com/office/drawing/2015/9/8/chartex" xmlns:cx2="http://schemas.microsoft.com/office/drawing/2015/10/21/chartex" xmlns:cx3="http://schemas.microsoft.com/office/drawing/2016/5/9/chartex" xmlns:cx4="http://schemas.microsoft.com/office/drawing/2016/5/10/chartex" xmlns:cx5="http://schemas.microsoft.com/office/drawing/2016/5/11/chartex" xmlns:cx6="http://schemas.microsoft.com/office/drawing/2016/5/12/chartex" xmlns:cx7="http://schemas.microsoft.com/office/drawing/2016/5/13/chartex" xmlns:cx8="http://schemas.microsoft.com/office/drawing/2016/5/14/chartex" xmlns:mc="http://schemas.openxmlformats.org/markup-compatibility/2006" xmlns:aink="http://schemas.microsoft.com/office/drawing/2016/ink" xmlns:am3d="http://schemas.microsoft.com/office/drawing/2017/model3d" xmlns:o="urn:schemas-microsoft-com:office:office" xmlns:oel="http://schemas.microsoft.com/office/2019/extlst" xmlns:r="http://schemas.openxmlformats.org/officeDocument/2006/relationships" xmlns:m="http://schemas.openxmlformats.org/officeDocument/2006/math" xmlns:v="urn:schemas-microsoft-com:vml" xmlns:wp14="http://schemas.microsoft.com/office/word/2010/wordprocessingDrawing" xmlns:wp="http://schemas.openxmlformats.org/drawingml/2006/wordprocessingDrawing" xmlns:w10="urn:schemas-microsoft-com:office:word" xmlns:w="http://schemas.openxmlformats.org/wordprocessingml/2006/main" xmlns:w14="http://schemas.microsoft.com/office/word/2010/wordml" xmlns:w15="http://schemas.microsoft.com/office/word/2012/wordml" xmlns:w16cex="http://schemas.microsoft.com/office/word/2018/wordml/cex" xmlns:w16cid="http://schemas.microsoft.com/office/word/2016/wordml/cid" xmlns:w16="http://schemas.microsoft.com/office/word/2018/wordml" xmlns:w16du="http://schemas.microsoft.com/office/word/2023/wordml/word16du" xmlns:w16sdtdh="http://schemas.microsoft.com/office/word/2020/wordml/sdtdatahash" xmlns:w16se="http://schemas.microsoft.com/office/word/2015/wordml/symex" xmlns:wpg="http://schemas.microsoft.com/office/word/2010/wordprocessingGroup" xmlns:wpi="http://schemas.microsoft.com/office/word/2010/wordprocessingInk" xmlns:wne="http://schemas.microsoft.com/office/word/2006/wordml" xmlns:wps="http://schemas.microsoft.com/office/word/2010/wordprocessingShape" mc:Ignorable="w14 w15 w16se w16cid w16 w16cex w16sdtdh w16du wp14">
+<w:ftr xmlns:wpc="http://schemas.microsoft.com/office/word/2010/wordprocessingCanvas" xmlns:cx="http://schemas.microsoft.com/office/drawing/2014/chartex" xmlns:cx1="http://schemas.microsoft.com/office/drawing/2015/9/8/chartex" xmlns:cx2="http://schemas.microsoft.com/office/drawing/2015/10/21/chartex" xmlns:cx3="http://schemas.microsoft.com/office/drawing/2016/5/9/chartex" xmlns:cx4="http://schemas.microsoft.com/office/drawing/2016/5/10/chartex" xmlns:cx5="http://schemas.microsoft.com/office/drawing/2016/5/11/chartex" xmlns:cx6="http://schemas.microsoft.com/office/drawing/2016/5/12/chartex" xmlns:cx7="http://schemas.microsoft.com/office/drawing/2016/5/13/chartex" xmlns:cx8="http://schemas.microsoft.com/office/drawing/2016/5/14/chartex" xmlns:mc="http://schemas.openxmlformats.org/markup-compatibility/2006" xmlns:aink="http://schemas.microsoft.com/office/drawing/2016/ink" xmlns:am3d="http://schemas.microsoft.com/office/drawing/2017/model3d" xmlns:o="urn:schemas-microsoft-com:office:office" xmlns:oel="http://schemas.microsoft.com/office/2019/extlst" xmlns:r="http://schemas.openxmlformats.org/officeDocument/2006/relationships" xmlns:m="http://schemas.openxmlformats.org/officeDocument/2006/math" xmlns:v="urn:schemas-microsoft-com:vml" xmlns:wp14="http://schemas.microsoft.com/office/word/2010/wordprocessingDrawing" xmlns:wp="http://schemas.openxmlformats.org/drawingml/2006/wordprocessingDrawing" xmlns:w10="urn:schemas-microsoft-com:office:word" xmlns:w="http://schemas.openxmlformats.org/wordprocessingml/2006/main" xmlns:w14="http://schemas.microsoft.com/office/word/2010/wordml" xmlns:w15="http://schemas.microsoft.com/office/word/2012/wordml" xmlns:w16cex="http://schemas.microsoft.com/office/word/2018/wordml/cex" xmlns:w16cid="http://schemas.microsoft.com/office/word/2016/wordml/cid" xmlns:w16="http://schemas.microsoft.com/office/word/2018/wordml" xmlns:w16du="http://schemas.microsoft.com/office/word/2023/wordml/word16du" xmlns:w16sdtdh="http://schemas.microsoft.com/office/word/2020/wordml/sdtdatahash" xmlns:w16sdtfl="http://schemas.microsoft.com/office/word/2024/wordml/sdtformatlock" xmlns:w16se="http://schemas.microsoft.com/office/word/2015/wordml/symex" xmlns:wpg="http://schemas.microsoft.com/office/word/2010/wordprocessingGroup" xmlns:wpi="http://schemas.microsoft.com/office/word/2010/wordprocessingInk" xmlns:wne="http://schemas.microsoft.com/office/word/2006/wordml" xmlns:wps="http://schemas.microsoft.com/office/word/2010/wordprocessingShape" mc:Ignorable="w14 w15 w16se w16cid w16 w16cex w16sdtdh w16sdtfl w16du wp14">
   <w:p>
     <w:pPr>
       <w:pStyle w:val="Footer"/>
@@ -12276,7 +12040,7 @@
 </file>
 
 <file path=word/footnotes.xml><?xml version="1.0" encoding="utf-8"?>
-<w:footnotes xmlns:wpc="http://schemas.microsoft.com/office/word/2010/wordprocessingCanvas" xmlns:cx="http://schemas.microsoft.com/office/drawing/2014/chartex" xmlns:cx1="http://schemas.microsoft.com/office/drawing/2015/9/8/chartex" xmlns:cx2="http://schemas.microsoft.com/office/drawing/2015/10/21/chartex" xmlns:cx3="http://schemas.microsoft.com/office/drawing/2016/5/9/chartex" xmlns:cx4="http://schemas.microsoft.com/office/drawing/2016/5/10/chartex" xmlns:cx5="http://schemas.microsoft.com/office/drawing/2016/5/11/chartex" xmlns:cx6="http://schemas.microsoft.com/office/drawing/2016/5/12/chartex" xmlns:cx7="http://schemas.microsoft.com/office/drawing/2016/5/13/chartex" xmlns:cx8="http://schemas.microsoft.com/office/drawing/2016/5/14/chartex" xmlns:mc="http://schemas.openxmlformats.org/markup-compatibility/2006" xmlns:aink="http://schemas.microsoft.com/office/drawing/2016/ink" xmlns:am3d="http://schemas.microsoft.com/office/drawing/2017/model3d" xmlns:o="urn:schemas-microsoft-com:office:office" xmlns:oel="http://schemas.microsoft.com/office/2019/extlst" xmlns:r="http://schemas.openxmlformats.org/officeDocument/2006/relationships" xmlns:m="http://schemas.openxmlformats.org/officeDocument/2006/math" xmlns:v="urn:schemas-microsoft-com:vml" xmlns:wp14="http://schemas.microsoft.com/office/word/2010/wordprocessingDrawing" xmlns:wp="http://schemas.openxmlformats.org/drawingml/2006/wordprocessingDrawing" xmlns:w10="urn:schemas-microsoft-com:office:word" xmlns:w="http://schemas.openxmlformats.org/wordprocessingml/2006/main" xmlns:w14="http://schemas.microsoft.com/office/word/2010/wordml" xmlns:w15="http://schemas.microsoft.com/office/word/2012/wordml" xmlns:w16cex="http://schemas.microsoft.com/office/word/2018/wordml/cex" xmlns:w16cid="http://schemas.microsoft.com/office/word/2016/wordml/cid" xmlns:w16="http://schemas.microsoft.com/office/word/2018/wordml" xmlns:w16du="http://schemas.microsoft.com/office/word/2023/wordml/word16du" xmlns:w16sdtdh="http://schemas.microsoft.com/office/word/2020/wordml/sdtdatahash" xmlns:w16se="http://schemas.microsoft.com/office/word/2015/wordml/symex" xmlns:wpg="http://schemas.microsoft.com/office/word/2010/wordprocessingGroup" xmlns:wpi="http://schemas.microsoft.com/office/word/2010/wordprocessingInk" xmlns:wne="http://schemas.microsoft.com/office/word/2006/wordml" xmlns:wps="http://schemas.microsoft.com/office/word/2010/wordprocessingShape" mc:Ignorable="w14 w15 w16se w16cid w16 w16cex w16sdtdh w16du wp14">
+<w:footnotes xmlns:wpc="http://schemas.microsoft.com/office/word/2010/wordprocessingCanvas" xmlns:cx="http://schemas.microsoft.com/office/drawing/2014/chartex" xmlns:cx1="http://schemas.microsoft.com/office/drawing/2015/9/8/chartex" xmlns:cx2="http://schemas.microsoft.com/office/drawing/2015/10/21/chartex" xmlns:cx3="http://schemas.microsoft.com/office/drawing/2016/5/9/chartex" xmlns:cx4="http://schemas.microsoft.com/office/drawing/2016/5/10/chartex" xmlns:cx5="http://schemas.microsoft.com/office/drawing/2016/5/11/chartex" xmlns:cx6="http://schemas.microsoft.com/office/drawing/2016/5/12/chartex" xmlns:cx7="http://schemas.microsoft.com/office/drawing/2016/5/13/chartex" xmlns:cx8="http://schemas.microsoft.com/office/drawing/2016/5/14/chartex" xmlns:mc="http://schemas.openxmlformats.org/markup-compatibility/2006" xmlns:aink="http://schemas.microsoft.com/office/drawing/2016/ink" xmlns:am3d="http://schemas.microsoft.com/office/drawing/2017/model3d" xmlns:o="urn:schemas-microsoft-com:office:office" xmlns:oel="http://schemas.microsoft.com/office/2019/extlst" xmlns:r="http://schemas.openxmlformats.org/officeDocument/2006/relationships" xmlns:m="http://schemas.openxmlformats.org/officeDocument/2006/math" xmlns:v="urn:schemas-microsoft-com:vml" xmlns:wp14="http://schemas.microsoft.com/office/word/2010/wordprocessingDrawing" xmlns:wp="http://schemas.openxmlformats.org/drawingml/2006/wordprocessingDrawing" xmlns:w10="urn:schemas-microsoft-com:office:word" xmlns:w="http://schemas.openxmlformats.org/wordprocessingml/2006/main" xmlns:w14="http://schemas.microsoft.com/office/word/2010/wordml" xmlns:w15="http://schemas.microsoft.com/office/word/2012/wordml" xmlns:w16cex="http://schemas.microsoft.com/office/word/2018/wordml/cex" xmlns:w16cid="http://schemas.microsoft.com/office/word/2016/wordml/cid" xmlns:w16="http://schemas.microsoft.com/office/word/2018/wordml" xmlns:w16du="http://schemas.microsoft.com/office/word/2023/wordml/word16du" xmlns:w16sdtdh="http://schemas.microsoft.com/office/word/2020/wordml/sdtdatahash" xmlns:w16sdtfl="http://schemas.microsoft.com/office/word/2024/wordml/sdtformatlock" xmlns:w16se="http://schemas.microsoft.com/office/word/2015/wordml/symex" xmlns:wpg="http://schemas.microsoft.com/office/word/2010/wordprocessingGroup" xmlns:wpi="http://schemas.microsoft.com/office/word/2010/wordprocessingInk" xmlns:wne="http://schemas.microsoft.com/office/word/2006/wordml" xmlns:wps="http://schemas.microsoft.com/office/word/2010/wordprocessingShape" mc:Ignorable="w14 w15 w16se w16cid w16 w16cex w16sdtdh w16sdtfl w16du wp14">
   <w:footnote w:type="separator" w:id="-1">
     <w:p>
       <w:pPr>
@@ -12301,7 +12065,7 @@
 </file>
 
 <file path=word/header1.xml><?xml version="1.0" encoding="utf-8"?>
-<w:hdr xmlns:wpc="http://schemas.microsoft.com/office/word/2010/wordprocessingCanvas" xmlns:cx="http://schemas.microsoft.com/office/drawing/2014/chartex" xmlns:cx1="http://schemas.microsoft.com/office/drawing/2015/9/8/chartex" xmlns:cx2="http://schemas.microsoft.com/office/drawing/2015/10/21/chartex" xmlns:cx3="http://schemas.microsoft.com/office/drawing/2016/5/9/chartex" xmlns:cx4="http://schemas.microsoft.com/office/drawing/2016/5/10/chartex" xmlns:cx5="http://schemas.microsoft.com/office/drawing/2016/5/11/chartex" xmlns:cx6="http://schemas.microsoft.com/office/drawing/2016/5/12/chartex" xmlns:cx7="http://schemas.microsoft.com/office/drawing/2016/5/13/chartex" xmlns:cx8="http://schemas.microsoft.com/office/drawing/2016/5/14/chartex" xmlns:mc="http://schemas.openxmlformats.org/markup-compatibility/2006" xmlns:aink="http://schemas.microsoft.com/office/drawing/2016/ink" xmlns:am3d="http://schemas.microsoft.com/office/drawing/2017/model3d" xmlns:o="urn:schemas-microsoft-com:office:office" xmlns:oel="http://schemas.microsoft.com/office/2019/extlst" xmlns:r="http://schemas.openxmlformats.org/officeDocument/2006/relationships" xmlns:m="http://schemas.openxmlformats.org/officeDocument/2006/math" xmlns:v="urn:schemas-microsoft-com:vml" xmlns:wp14="http://schemas.microsoft.com/office/word/2010/wordprocessingDrawing" xmlns:wp="http://schemas.openxmlformats.org/drawingml/2006/wordprocessingDrawing" xmlns:w10="urn:schemas-microsoft-com:office:word" xmlns:w="http://schemas.openxmlformats.org/wordprocessingml/2006/main" xmlns:w14="http://schemas.microsoft.com/office/word/2010/wordml" xmlns:w15="http://schemas.microsoft.com/office/word/2012/wordml" xmlns:w16cex="http://schemas.microsoft.com/office/word/2018/wordml/cex" xmlns:w16cid="http://schemas.microsoft.com/office/word/2016/wordml/cid" xmlns:w16="http://schemas.microsoft.com/office/word/2018/wordml" xmlns:w16du="http://schemas.microsoft.com/office/word/2023/wordml/word16du" xmlns:w16sdtdh="http://schemas.microsoft.com/office/word/2020/wordml/sdtdatahash" xmlns:w16se="http://schemas.microsoft.com/office/word/2015/wordml/symex" xmlns:wpg="http://schemas.microsoft.com/office/word/2010/wordprocessingGroup" xmlns:wpi="http://schemas.microsoft.com/office/word/2010/wordprocessingInk" xmlns:wne="http://schemas.microsoft.com/office/word/2006/wordml" xmlns:wps="http://schemas.microsoft.com/office/word/2010/wordprocessingShape" mc:Ignorable="w14 w15 w16se w16cid w16 w16cex w16sdtdh w16du wp14">
+<w:hdr xmlns:wpc="http://schemas.microsoft.com/office/word/2010/wordprocessingCanvas" xmlns:cx="http://schemas.microsoft.com/office/drawing/2014/chartex" xmlns:cx1="http://schemas.microsoft.com/office/drawing/2015/9/8/chartex" xmlns:cx2="http://schemas.microsoft.com/office/drawing/2015/10/21/chartex" xmlns:cx3="http://schemas.microsoft.com/office/drawing/2016/5/9/chartex" xmlns:cx4="http://schemas.microsoft.com/office/drawing/2016/5/10/chartex" xmlns:cx5="http://schemas.microsoft.com/office/drawing/2016/5/11/chartex" xmlns:cx6="http://schemas.microsoft.com/office/drawing/2016/5/12/chartex" xmlns:cx7="http://schemas.microsoft.com/office/drawing/2016/5/13/chartex" xmlns:cx8="http://schemas.microsoft.com/office/drawing/2016/5/14/chartex" xmlns:mc="http://schemas.openxmlformats.org/markup-compatibility/2006" xmlns:aink="http://schemas.microsoft.com/office/drawing/2016/ink" xmlns:am3d="http://schemas.microsoft.com/office/drawing/2017/model3d" xmlns:o="urn:schemas-microsoft-com:office:office" xmlns:oel="http://schemas.microsoft.com/office/2019/extlst" xmlns:r="http://schemas.openxmlformats.org/officeDocument/2006/relationships" xmlns:m="http://schemas.openxmlformats.org/officeDocument/2006/math" xmlns:v="urn:schemas-microsoft-com:vml" xmlns:wp14="http://schemas.microsoft.com/office/word/2010/wordprocessingDrawing" xmlns:wp="http://schemas.openxmlformats.org/drawingml/2006/wordprocessingDrawing" xmlns:w10="urn:schemas-microsoft-com:office:word" xmlns:w="http://schemas.openxmlformats.org/wordprocessingml/2006/main" xmlns:w14="http://schemas.microsoft.com/office/word/2010/wordml" xmlns:w15="http://schemas.microsoft.com/office/word/2012/wordml" xmlns:w16cex="http://schemas.microsoft.com/office/word/2018/wordml/cex" xmlns:w16cid="http://schemas.microsoft.com/office/word/2016/wordml/cid" xmlns:w16="http://schemas.microsoft.com/office/word/2018/wordml" xmlns:w16du="http://schemas.microsoft.com/office/word/2023/wordml/word16du" xmlns:w16sdtdh="http://schemas.microsoft.com/office/word/2020/wordml/sdtdatahash" xmlns:w16sdtfl="http://schemas.microsoft.com/office/word/2024/wordml/sdtformatlock" xmlns:w16se="http://schemas.microsoft.com/office/word/2015/wordml/symex" xmlns:wpg="http://schemas.microsoft.com/office/word/2010/wordprocessingGroup" xmlns:wpi="http://schemas.microsoft.com/office/word/2010/wordprocessingInk" xmlns:wne="http://schemas.microsoft.com/office/word/2006/wordml" xmlns:wps="http://schemas.microsoft.com/office/word/2010/wordprocessingShape" mc:Ignorable="w14 w15 w16se w16cid w16 w16cex w16sdtdh w16sdtfl w16du wp14">
   <w:p>
     <w:pPr>
       <w:pStyle w:val="Header"/>
@@ -12311,7 +12075,7 @@
 </file>
 
 <file path=word/header2.xml><?xml version="1.0" encoding="utf-8"?>
-<w:hdr xmlns:wpc="http://schemas.microsoft.com/office/word/2010/wordprocessingCanvas" xmlns:cx="http://schemas.microsoft.com/office/drawing/2014/chartex" xmlns:cx1="http://schemas.microsoft.com/office/drawing/2015/9/8/chartex" xmlns:cx2="http://schemas.microsoft.com/office/drawing/2015/10/21/chartex" xmlns:cx3="http://schemas.microsoft.com/office/drawing/2016/5/9/chartex" xmlns:cx4="http://schemas.microsoft.com/office/drawing/2016/5/10/chartex" xmlns:cx5="http://schemas.microsoft.com/office/drawing/2016/5/11/chartex" xmlns:cx6="http://schemas.microsoft.com/office/drawing/2016/5/12/chartex" xmlns:cx7="http://schemas.microsoft.com/office/drawing/2016/5/13/chartex" xmlns:cx8="http://schemas.microsoft.com/office/drawing/2016/5/14/chartex" xmlns:mc="http://schemas.openxmlformats.org/markup-compatibility/2006" xmlns:aink="http://schemas.microsoft.com/office/drawing/2016/ink" xmlns:am3d="http://schemas.microsoft.com/office/drawing/2017/model3d" xmlns:o="urn:schemas-microsoft-com:office:office" xmlns:oel="http://schemas.microsoft.com/office/2019/extlst" xmlns:r="http://schemas.openxmlformats.org/officeDocument/2006/relationships" xmlns:m="http://schemas.openxmlformats.org/officeDocument/2006/math" xmlns:v="urn:schemas-microsoft-com:vml" xmlns:wp14="http://schemas.microsoft.com/office/word/2010/wordprocessingDrawing" xmlns:wp="http://schemas.openxmlformats.org/drawingml/2006/wordprocessingDrawing" xmlns:w10="urn:schemas-microsoft-com:office:word" xmlns:w="http://schemas.openxmlformats.org/wordprocessingml/2006/main" xmlns:w14="http://schemas.microsoft.com/office/word/2010/wordml" xmlns:w15="http://schemas.microsoft.com/office/word/2012/wordml" xmlns:w16cex="http://schemas.microsoft.com/office/word/2018/wordml/cex" xmlns:w16cid="http://schemas.microsoft.com/office/word/2016/wordml/cid" xmlns:w16="http://schemas.microsoft.com/office/word/2018/wordml" xmlns:w16du="http://schemas.microsoft.com/office/word/2023/wordml/word16du" xmlns:w16sdtdh="http://schemas.microsoft.com/office/word/2020/wordml/sdtdatahash" xmlns:w16se="http://schemas.microsoft.com/office/word/2015/wordml/symex" xmlns:wpg="http://schemas.microsoft.com/office/word/2010/wordprocessingGroup" xmlns:wpi="http://schemas.microsoft.com/office/word/2010/wordprocessingInk" xmlns:wne="http://schemas.microsoft.com/office/word/2006/wordml" xmlns:wps="http://schemas.microsoft.com/office/word/2010/wordprocessingShape" mc:Ignorable="w14 w15 w16se w16cid w16 w16cex w16sdtdh w16du wp14">
+<w:hdr xmlns:wpc="http://schemas.microsoft.com/office/word/2010/wordprocessingCanvas" xmlns:cx="http://schemas.microsoft.com/office/drawing/2014/chartex" xmlns:cx1="http://schemas.microsoft.com/office/drawing/2015/9/8/chartex" xmlns:cx2="http://schemas.microsoft.com/office/drawing/2015/10/21/chartex" xmlns:cx3="http://schemas.microsoft.com/office/drawing/2016/5/9/chartex" xmlns:cx4="http://schemas.microsoft.com/office/drawing/2016/5/10/chartex" xmlns:cx5="http://schemas.microsoft.com/office/drawing/2016/5/11/chartex" xmlns:cx6="http://schemas.microsoft.com/office/drawing/2016/5/12/chartex" xmlns:cx7="http://schemas.microsoft.com/office/drawing/2016/5/13/chartex" xmlns:cx8="http://schemas.microsoft.com/office/drawing/2016/5/14/chartex" xmlns:mc="http://schemas.openxmlformats.org/markup-compatibility/2006" xmlns:aink="http://schemas.microsoft.com/office/drawing/2016/ink" xmlns:am3d="http://schemas.microsoft.com/office/drawing/2017/model3d" xmlns:o="urn:schemas-microsoft-com:office:office" xmlns:oel="http://schemas.microsoft.com/office/2019/extlst" xmlns:r="http://schemas.openxmlformats.org/officeDocument/2006/relationships" xmlns:m="http://schemas.openxmlformats.org/officeDocument/2006/math" xmlns:v="urn:schemas-microsoft-com:vml" xmlns:wp14="http://schemas.microsoft.com/office/word/2010/wordprocessingDrawing" xmlns:wp="http://schemas.openxmlformats.org/drawingml/2006/wordprocessingDrawing" xmlns:w10="urn:schemas-microsoft-com:office:word" xmlns:w="http://schemas.openxmlformats.org/wordprocessingml/2006/main" xmlns:w14="http://schemas.microsoft.com/office/word/2010/wordml" xmlns:w15="http://schemas.microsoft.com/office/word/2012/wordml" xmlns:w16cex="http://schemas.microsoft.com/office/word/2018/wordml/cex" xmlns:w16cid="http://schemas.microsoft.com/office/word/2016/wordml/cid" xmlns:w16="http://schemas.microsoft.com/office/word/2018/wordml" xmlns:w16du="http://schemas.microsoft.com/office/word/2023/wordml/word16du" xmlns:w16sdtdh="http://schemas.microsoft.com/office/word/2020/wordml/sdtdatahash" xmlns:w16sdtfl="http://schemas.microsoft.com/office/word/2024/wordml/sdtformatlock" xmlns:w16se="http://schemas.microsoft.com/office/word/2015/wordml/symex" xmlns:wpg="http://schemas.microsoft.com/office/word/2010/wordprocessingGroup" xmlns:wpi="http://schemas.microsoft.com/office/word/2010/wordprocessingInk" xmlns:wne="http://schemas.microsoft.com/office/word/2006/wordml" xmlns:wps="http://schemas.microsoft.com/office/word/2010/wordprocessingShape" mc:Ignorable="w14 w15 w16se w16cid w16 w16cex w16sdtdh w16sdtfl w16du wp14">
   <w:p>
     <w:pPr>
       <w:pStyle w:val="Header"/>
@@ -12325,7 +12089,7 @@
 </file>
 
 <file path=word/header3.xml><?xml version="1.0" encoding="utf-8"?>
-<w:hdr xmlns:wpc="http://schemas.microsoft.com/office/word/2010/wordprocessingCanvas" xmlns:cx="http://schemas.microsoft.com/office/drawing/2014/chartex" xmlns:cx1="http://schemas.microsoft.com/office/drawing/2015/9/8/chartex" xmlns:cx2="http://schemas.microsoft.com/office/drawing/2015/10/21/chartex" xmlns:cx3="http://schemas.microsoft.com/office/drawing/2016/5/9/chartex" xmlns:cx4="http://schemas.microsoft.com/office/drawing/2016/5/10/chartex" xmlns:cx5="http://schemas.microsoft.com/office/drawing/2016/5/11/chartex" xmlns:cx6="http://schemas.microsoft.com/office/drawing/2016/5/12/chartex" xmlns:cx7="http://schemas.microsoft.com/office/drawing/2016/5/13/chartex" xmlns:cx8="http://schemas.microsoft.com/office/drawing/2016/5/14/chartex" xmlns:mc="http://schemas.openxmlformats.org/markup-compatibility/2006" xmlns:aink="http://schemas.microsoft.com/office/drawing/2016/ink" xmlns:am3d="http://schemas.microsoft.com/office/drawing/2017/model3d" xmlns:o="urn:schemas-microsoft-com:office:office" xmlns:oel="http://schemas.microsoft.com/office/2019/extlst" xmlns:r="http://schemas.openxmlformats.org/officeDocument/2006/relationships" xmlns:m="http://schemas.openxmlformats.org/officeDocument/2006/math" xmlns:v="urn:schemas-microsoft-com:vml" xmlns:wp14="http://schemas.microsoft.com/office/word/2010/wordprocessingDrawing" xmlns:wp="http://schemas.openxmlformats.org/drawingml/2006/wordprocessingDrawing" xmlns:w10="urn:schemas-microsoft-com:office:word" xmlns:w="http://schemas.openxmlformats.org/wordprocessingml/2006/main" xmlns:w14="http://schemas.microsoft.com/office/word/2010/wordml" xmlns:w15="http://schemas.microsoft.com/office/word/2012/wordml" xmlns:w16cex="http://schemas.microsoft.com/office/word/2018/wordml/cex" xmlns:w16cid="http://schemas.microsoft.com/office/word/2016/wordml/cid" xmlns:w16="http://schemas.microsoft.com/office/word/2018/wordml" xmlns:w16du="http://schemas.microsoft.com/office/word/2023/wordml/word16du" xmlns:w16sdtdh="http://schemas.microsoft.com/office/word/2020/wordml/sdtdatahash" xmlns:w16se="http://schemas.microsoft.com/office/word/2015/wordml/symex" xmlns:wpg="http://schemas.microsoft.com/office/word/2010/wordprocessingGroup" xmlns:wpi="http://schemas.microsoft.com/office/word/2010/wordprocessingInk" xmlns:wne="http://schemas.microsoft.com/office/word/2006/wordml" xmlns:wps="http://schemas.microsoft.com/office/word/2010/wordprocessingShape" mc:Ignorable="w14 w15 w16se w16cid w16 w16cex w16sdtdh w16du wp14">
+<w:hdr xmlns:wpc="http://schemas.microsoft.com/office/word/2010/wordprocessingCanvas" xmlns:cx="http://schemas.microsoft.com/office/drawing/2014/chartex" xmlns:cx1="http://schemas.microsoft.com/office/drawing/2015/9/8/chartex" xmlns:cx2="http://schemas.microsoft.com/office/drawing/2015/10/21/chartex" xmlns:cx3="http://schemas.microsoft.com/office/drawing/2016/5/9/chartex" xmlns:cx4="http://schemas.microsoft.com/office/drawing/2016/5/10/chartex" xmlns:cx5="http://schemas.microsoft.com/office/drawing/2016/5/11/chartex" xmlns:cx6="http://schemas.microsoft.com/office/drawing/2016/5/12/chartex" xmlns:cx7="http://schemas.microsoft.com/office/drawing/2016/5/13/chartex" xmlns:cx8="http://schemas.microsoft.com/office/drawing/2016/5/14/chartex" xmlns:mc="http://schemas.openxmlformats.org/markup-compatibility/2006" xmlns:aink="http://schemas.microsoft.com/office/drawing/2016/ink" xmlns:am3d="http://schemas.microsoft.com/office/drawing/2017/model3d" xmlns:o="urn:schemas-microsoft-com:office:office" xmlns:oel="http://schemas.microsoft.com/office/2019/extlst" xmlns:r="http://schemas.openxmlformats.org/officeDocument/2006/relationships" xmlns:m="http://schemas.openxmlformats.org/officeDocument/2006/math" xmlns:v="urn:schemas-microsoft-com:vml" xmlns:wp14="http://schemas.microsoft.com/office/word/2010/wordprocessingDrawing" xmlns:wp="http://schemas.openxmlformats.org/drawingml/2006/wordprocessingDrawing" xmlns:w10="urn:schemas-microsoft-com:office:word" xmlns:w="http://schemas.openxmlformats.org/wordprocessingml/2006/main" xmlns:w14="http://schemas.microsoft.com/office/word/2010/wordml" xmlns:w15="http://schemas.microsoft.com/office/word/2012/wordml" xmlns:w16cex="http://schemas.microsoft.com/office/word/2018/wordml/cex" xmlns:w16cid="http://schemas.microsoft.com/office/word/2016/wordml/cid" xmlns:w16="http://schemas.microsoft.com/office/word/2018/wordml" xmlns:w16du="http://schemas.microsoft.com/office/word/2023/wordml/word16du" xmlns:w16sdtdh="http://schemas.microsoft.com/office/word/2020/wordml/sdtdatahash" xmlns:w16sdtfl="http://schemas.microsoft.com/office/word/2024/wordml/sdtformatlock" xmlns:w16se="http://schemas.microsoft.com/office/word/2015/wordml/symex" xmlns:wpg="http://schemas.microsoft.com/office/word/2010/wordprocessingGroup" xmlns:wpi="http://schemas.microsoft.com/office/word/2010/wordprocessingInk" xmlns:wne="http://schemas.microsoft.com/office/word/2006/wordml" xmlns:wps="http://schemas.microsoft.com/office/word/2010/wordprocessingShape" mc:Ignorable="w14 w15 w16se w16cid w16 w16cex w16sdtdh w16sdtfl w16du wp14">
   <w:p>
     <w:pPr>
       <w:pStyle w:val="Header"/>
@@ -12335,7 +12099,7 @@
 </file>
 
 <file path=word/numbering.xml><?xml version="1.0" encoding="utf-8"?>
-<w:numbering xmlns:wpc="http://schemas.microsoft.com/office/word/2010/wordprocessingCanvas" xmlns:cx="http://schemas.microsoft.com/office/drawing/2014/chartex" xmlns:cx1="http://schemas.microsoft.com/office/drawing/2015/9/8/chartex" xmlns:cx2="http://schemas.microsoft.com/office/drawing/2015/10/21/chartex" xmlns:cx3="http://schemas.microsoft.com/office/drawing/2016/5/9/chartex" xmlns:cx4="http://schemas.microsoft.com/office/drawing/2016/5/10/chartex" xmlns:cx5="http://schemas.microsoft.com/office/drawing/2016/5/11/chartex" xmlns:cx6="http://schemas.microsoft.com/office/drawing/2016/5/12/chartex" xmlns:cx7="http://schemas.microsoft.com/office/drawing/2016/5/13/chartex" xmlns:cx8="http://schemas.microsoft.com/office/drawing/2016/5/14/chartex" xmlns:mc="http://schemas.openxmlformats.org/markup-compatibility/2006" xmlns:aink="http://schemas.microsoft.com/office/drawing/2016/ink" xmlns:am3d="http://schemas.microsoft.com/office/drawing/2017/model3d" xmlns:o="urn:schemas-microsoft-com:office:office" xmlns:oel="http://schemas.microsoft.com/office/2019/extlst" xmlns:r="http://schemas.openxmlformats.org/officeDocument/2006/relationships" xmlns:m="http://schemas.openxmlformats.org/officeDocument/2006/math" xmlns:v="urn:schemas-microsoft-com:vml" xmlns:wp14="http://schemas.microsoft.com/office/word/2010/wordprocessingDrawing" xmlns:wp="http://schemas.openxmlformats.org/drawingml/2006/wordprocessingDrawing" xmlns:w10="urn:schemas-microsoft-com:office:word" xmlns:w="http://schemas.openxmlformats.org/wordprocessingml/2006/main" xmlns:w14="http://schemas.microsoft.com/office/word/2010/wordml" xmlns:w15="http://schemas.microsoft.com/office/word/2012/wordml" xmlns:w16cex="http://schemas.microsoft.com/office/word/2018/wordml/cex" xmlns:w16cid="http://schemas.microsoft.com/office/word/2016/wordml/cid" xmlns:w16="http://schemas.microsoft.com/office/word/2018/wordml" xmlns:w16du="http://schemas.microsoft.com/office/word/2023/wordml/word16du" xmlns:w16sdtdh="http://schemas.microsoft.com/office/word/2020/wordml/sdtdatahash" xmlns:w16se="http://schemas.microsoft.com/office/word/2015/wordml/symex" xmlns:wpg="http://schemas.microsoft.com/office/word/2010/wordprocessingGroup" xmlns:wpi="http://schemas.microsoft.com/office/word/2010/wordprocessingInk" xmlns:wne="http://schemas.microsoft.com/office/word/2006/wordml" xmlns:wps="http://schemas.microsoft.com/office/word/2010/wordprocessingShape" mc:Ignorable="w14 w15 w16se w16cid w16 w16cex w16sdtdh w16du wp14">
+<w:numbering xmlns:wpc="http://schemas.microsoft.com/office/word/2010/wordprocessingCanvas" xmlns:cx="http://schemas.microsoft.com/office/drawing/2014/chartex" xmlns:cx1="http://schemas.microsoft.com/office/drawing/2015/9/8/chartex" xmlns:cx2="http://schemas.microsoft.com/office/drawing/2015/10/21/chartex" xmlns:cx3="http://schemas.microsoft.com/office/drawing/2016/5/9/chartex" xmlns:cx4="http://schemas.microsoft.com/office/drawing/2016/5/10/chartex" xmlns:cx5="http://schemas.microsoft.com/office/drawing/2016/5/11/chartex" xmlns:cx6="http://schemas.microsoft.com/office/drawing/2016/5/12/chartex" xmlns:cx7="http://schemas.microsoft.com/office/drawing/2016/5/13/chartex" xmlns:cx8="http://schemas.microsoft.com/office/drawing/2016/5/14/chartex" xmlns:mc="http://schemas.openxmlformats.org/markup-compatibility/2006" xmlns:aink="http://schemas.microsoft.com/office/drawing/2016/ink" xmlns:am3d="http://schemas.microsoft.com/office/drawing/2017/model3d" xmlns:o="urn:schemas-microsoft-com:office:office" xmlns:oel="http://schemas.microsoft.com/office/2019/extlst" xmlns:r="http://schemas.openxmlformats.org/officeDocument/2006/relationships" xmlns:m="http://schemas.openxmlformats.org/officeDocument/2006/math" xmlns:v="urn:schemas-microsoft-com:vml" xmlns:wp14="http://schemas.microsoft.com/office/word/2010/wordprocessingDrawing" xmlns:wp="http://schemas.openxmlformats.org/drawingml/2006/wordprocessingDrawing" xmlns:w10="urn:schemas-microsoft-com:office:word" xmlns:w="http://schemas.openxmlformats.org/wordprocessingml/2006/main" xmlns:w14="http://schemas.microsoft.com/office/word/2010/wordml" xmlns:w15="http://schemas.microsoft.com/office/word/2012/wordml" xmlns:w16cex="http://schemas.microsoft.com/office/word/2018/wordml/cex" xmlns:w16cid="http://schemas.microsoft.com/office/word/2016/wordml/cid" xmlns:w16="http://schemas.microsoft.com/office/word/2018/wordml" xmlns:w16du="http://schemas.microsoft.com/office/word/2023/wordml/word16du" xmlns:w16sdtdh="http://schemas.microsoft.com/office/word/2020/wordml/sdtdatahash" xmlns:w16sdtfl="http://schemas.microsoft.com/office/word/2024/wordml/sdtformatlock" xmlns:w16se="http://schemas.microsoft.com/office/word/2015/wordml/symex" xmlns:wpg="http://schemas.microsoft.com/office/word/2010/wordprocessingGroup" xmlns:wpi="http://schemas.microsoft.com/office/word/2010/wordprocessingInk" xmlns:wne="http://schemas.microsoft.com/office/word/2006/wordml" xmlns:wps="http://schemas.microsoft.com/office/word/2010/wordprocessingShape" mc:Ignorable="w14 w15 w16se w16cid w16 w16cex w16sdtdh w16sdtfl w16du wp14">
   <w:abstractNum w:abstractNumId="0" w15:restartNumberingAfterBreak="0">
     <w:nsid w:val="07085D32"/>
     <w:multiLevelType w:val="multilevel"/>
@@ -12839,7 +12603,7 @@
       <w:lvlText w:val="%1.%2."/>
       <w:lvlJc w:val="left"/>
       <w:pPr>
-        <w:ind w:left="792" w:hanging="432"/>
+        <w:ind w:left="432" w:hanging="432"/>
       </w:pPr>
     </w:lvl>
     <w:lvl w:ilvl="2">
@@ -12849,7 +12613,7 @@
       <w:lvlText w:val="%1.%2.%3."/>
       <w:lvlJc w:val="left"/>
       <w:pPr>
-        <w:ind w:left="1224" w:hanging="504"/>
+        <w:ind w:left="504" w:hanging="504"/>
       </w:pPr>
     </w:lvl>
     <w:lvl w:ilvl="3">
@@ -12858,7 +12622,7 @@
       <w:lvlText w:val="%1.%2.%3.%4."/>
       <w:lvlJc w:val="left"/>
       <w:pPr>
-        <w:ind w:left="1728" w:hanging="648"/>
+        <w:ind w:left="648" w:hanging="648"/>
       </w:pPr>
     </w:lvl>
     <w:lvl w:ilvl="4">
@@ -12867,7 +12631,7 @@
       <w:lvlText w:val="%1.%2.%3.%4.%5."/>
       <w:lvlJc w:val="left"/>
       <w:pPr>
-        <w:ind w:left="2232" w:hanging="792"/>
+        <w:ind w:left="792" w:hanging="792"/>
       </w:pPr>
     </w:lvl>
     <w:lvl w:ilvl="5">
@@ -12876,7 +12640,7 @@
       <w:lvlText w:val="%1.%2.%3.%4.%5.%6."/>
       <w:lvlJc w:val="left"/>
       <w:pPr>
-        <w:ind w:left="2736" w:hanging="936"/>
+        <w:ind w:left="936" w:hanging="936"/>
       </w:pPr>
     </w:lvl>
     <w:lvl w:ilvl="6">
@@ -12885,7 +12649,7 @@
       <w:lvlText w:val="%1.%2.%3.%4.%5.%6.%7."/>
       <w:lvlJc w:val="left"/>
       <w:pPr>
-        <w:ind w:left="3240" w:hanging="1080"/>
+        <w:ind w:left="1080" w:hanging="1080"/>
       </w:pPr>
     </w:lvl>
     <w:lvl w:ilvl="7">
@@ -12894,7 +12658,7 @@
       <w:lvlText w:val="%1.%2.%3.%4.%5.%6.%7.%8."/>
       <w:lvlJc w:val="left"/>
       <w:pPr>
-        <w:ind w:left="3744" w:hanging="1224"/>
+        <w:ind w:left="1224" w:hanging="1224"/>
       </w:pPr>
     </w:lvl>
     <w:lvl w:ilvl="8">
@@ -12903,7 +12667,7 @@
       <w:lvlText w:val="%1.%2.%3.%4.%5.%6.%7.%8.%9."/>
       <w:lvlJc w:val="left"/>
       <w:pPr>
-        <w:ind w:left="4320" w:hanging="1440"/>
+        <w:ind w:left="1440" w:hanging="1440"/>
       </w:pPr>
     </w:lvl>
   </w:abstractNum>
@@ -13276,7 +13040,7 @@
       <w:lvlText w:val="%1.%2."/>
       <w:lvlJc w:val="left"/>
       <w:pPr>
-        <w:ind w:left="792" w:hanging="432"/>
+        <w:ind w:left="432" w:hanging="432"/>
       </w:pPr>
     </w:lvl>
     <w:lvl w:ilvl="2">
@@ -13285,7 +13049,7 @@
       <w:lvlText w:val="%1.%2.%3."/>
       <w:lvlJc w:val="left"/>
       <w:pPr>
-        <w:ind w:left="1224" w:hanging="504"/>
+        <w:ind w:left="504" w:hanging="504"/>
       </w:pPr>
     </w:lvl>
     <w:lvl w:ilvl="3">
@@ -13294,7 +13058,7 @@
       <w:lvlText w:val="%1.%2.%3.%4."/>
       <w:lvlJc w:val="left"/>
       <w:pPr>
-        <w:ind w:left="1728" w:hanging="648"/>
+        <w:ind w:left="648" w:hanging="648"/>
       </w:pPr>
     </w:lvl>
     <w:lvl w:ilvl="4">
@@ -13303,7 +13067,7 @@
       <w:lvlText w:val="%1.%2.%3.%4.%5."/>
       <w:lvlJc w:val="left"/>
       <w:pPr>
-        <w:ind w:left="2232" w:hanging="792"/>
+        <w:ind w:left="792" w:hanging="792"/>
       </w:pPr>
     </w:lvl>
     <w:lvl w:ilvl="5">
@@ -13312,7 +13076,7 @@
       <w:lvlText w:val="%1.%2.%3.%4.%5.%6."/>
       <w:lvlJc w:val="left"/>
       <w:pPr>
-        <w:ind w:left="2736" w:hanging="936"/>
+        <w:ind w:left="936" w:hanging="936"/>
       </w:pPr>
     </w:lvl>
     <w:lvl w:ilvl="6">
@@ -13321,7 +13085,7 @@
       <w:lvlText w:val="%1.%2.%3.%4.%5.%6.%7."/>
       <w:lvlJc w:val="left"/>
       <w:pPr>
-        <w:ind w:left="3240" w:hanging="1080"/>
+        <w:ind w:left="1080" w:hanging="1080"/>
       </w:pPr>
     </w:lvl>
     <w:lvl w:ilvl="7">
@@ -13330,7 +13094,7 @@
       <w:lvlText w:val="%1.%2.%3.%4.%5.%6.%7.%8."/>
       <w:lvlJc w:val="left"/>
       <w:pPr>
-        <w:ind w:left="3744" w:hanging="1224"/>
+        <w:ind w:left="1224" w:hanging="1224"/>
       </w:pPr>
     </w:lvl>
     <w:lvl w:ilvl="8">
@@ -13339,7 +13103,7 @@
       <w:lvlText w:val="%1.%2.%3.%4.%5.%6.%7.%8.%9."/>
       <w:lvlJc w:val="left"/>
       <w:pPr>
-        <w:ind w:left="4320" w:hanging="1440"/>
+        <w:ind w:left="1440" w:hanging="1440"/>
       </w:pPr>
     </w:lvl>
   </w:abstractNum>
@@ -14468,7 +14232,7 @@
 </file>
 
 <file path=word/styles.xml><?xml version="1.0" encoding="utf-8"?>
-<w:styles xmlns:mc="http://schemas.openxmlformats.org/markup-compatibility/2006" xmlns:r="http://schemas.openxmlformats.org/officeDocument/2006/relationships" xmlns:w="http://schemas.openxmlformats.org/wordprocessingml/2006/main" xmlns:w14="http://schemas.microsoft.com/office/word/2010/wordml" xmlns:w15="http://schemas.microsoft.com/office/word/2012/wordml" xmlns:w16cex="http://schemas.microsoft.com/office/word/2018/wordml/cex" xmlns:w16cid="http://schemas.microsoft.com/office/word/2016/wordml/cid" xmlns:w16="http://schemas.microsoft.com/office/word/2018/wordml" xmlns:w16du="http://schemas.microsoft.com/office/word/2023/wordml/word16du" xmlns:w16sdtdh="http://schemas.microsoft.com/office/word/2020/wordml/sdtdatahash" xmlns:w16se="http://schemas.microsoft.com/office/word/2015/wordml/symex" mc:Ignorable="w14 w15 w16se w16cid w16 w16cex w16sdtdh w16du">
+<w:styles xmlns:mc="http://schemas.openxmlformats.org/markup-compatibility/2006" xmlns:r="http://schemas.openxmlformats.org/officeDocument/2006/relationships" xmlns:w="http://schemas.openxmlformats.org/wordprocessingml/2006/main" xmlns:w14="http://schemas.microsoft.com/office/word/2010/wordml" xmlns:w15="http://schemas.microsoft.com/office/word/2012/wordml" xmlns:w16cex="http://schemas.microsoft.com/office/word/2018/wordml/cex" xmlns:w16cid="http://schemas.microsoft.com/office/word/2016/wordml/cid" xmlns:w16="http://schemas.microsoft.com/office/word/2018/wordml" xmlns:w16du="http://schemas.microsoft.com/office/word/2023/wordml/word16du" xmlns:w16sdtdh="http://schemas.microsoft.com/office/word/2020/wordml/sdtdatahash" xmlns:w16sdtfl="http://schemas.microsoft.com/office/word/2024/wordml/sdtformatlock" xmlns:w16se="http://schemas.microsoft.com/office/word/2015/wordml/symex" mc:Ignorable="w14 w15 w16se w16cid w16 w16cex w16sdtdh w16sdtfl w16du">
   <w:docDefaults>
     <w:rPrDefault>
       <w:rPr>

</xml_diff>

<commit_message>
Docs: add Forwards compatibility section with parser rules and a worked example (rev 1.7)
</commit_message>
<xml_diff>
--- a/docs/VIPS+Airpixel output end user documentation.docx
+++ b/docs/VIPS+Airpixel output end user documentation.docx
@@ -73,7 +73,7 @@
           <w:r>
             <w:fldChar w:fldCharType="separate"/>
           </w:r>
-          <w:hyperlink w:anchor="_Toc240447979" w:history="1">
+          <w:hyperlink w:anchor="_Toc241063175" w:history="1">
             <w:r>
               <w:rPr>
                 <w:rStyle w:val="Hyperlink"/>
@@ -119,7 +119,7 @@
                 <w:noProof/>
                 <w:webHidden/>
               </w:rPr>
-              <w:instrText xml:space="preserve"> PAGEREF _Toc240447979 \h </w:instrText>
+              <w:instrText xml:space="preserve"> PAGEREF _Toc241063175 \h </w:instrText>
             </w:r>
             <w:r>
               <w:rPr>
@@ -167,7 +167,7 @@
               <w14:ligatures w14:val="standardContextual"/>
             </w:rPr>
           </w:pPr>
-          <w:hyperlink w:anchor="_Toc240447980" w:history="1">
+          <w:hyperlink w:anchor="_Toc241063176" w:history="1">
             <w:r>
               <w:rPr>
                 <w:rStyle w:val="Hyperlink"/>
@@ -213,7 +213,7 @@
                 <w:noProof/>
                 <w:webHidden/>
               </w:rPr>
-              <w:instrText xml:space="preserve"> PAGEREF _Toc240447980 \h </w:instrText>
+              <w:instrText xml:space="preserve"> PAGEREF _Toc241063176 \h </w:instrText>
             </w:r>
             <w:r>
               <w:rPr>
@@ -261,7 +261,7 @@
               <w14:ligatures w14:val="standardContextual"/>
             </w:rPr>
           </w:pPr>
-          <w:hyperlink w:anchor="_Toc240447981" w:history="1">
+          <w:hyperlink w:anchor="_Toc241063177" w:history="1">
             <w:r>
               <w:rPr>
                 <w:rStyle w:val="Hyperlink"/>
@@ -307,7 +307,7 @@
                 <w:noProof/>
                 <w:webHidden/>
               </w:rPr>
-              <w:instrText xml:space="preserve"> PAGEREF _Toc240447981 \h </w:instrText>
+              <w:instrText xml:space="preserve"> PAGEREF _Toc241063177 \h </w:instrText>
             </w:r>
             <w:r>
               <w:rPr>
@@ -355,7 +355,7 @@
               <w14:ligatures w14:val="standardContextual"/>
             </w:rPr>
           </w:pPr>
-          <w:hyperlink w:anchor="_Toc240447985" w:history="1">
+          <w:hyperlink w:anchor="_Toc241063181" w:history="1">
             <w:r>
               <w:rPr>
                 <w:rStyle w:val="Hyperlink"/>
@@ -401,7 +401,7 @@
                 <w:noProof/>
                 <w:webHidden/>
               </w:rPr>
-              <w:instrText xml:space="preserve"> PAGEREF _Toc240447985 \h </w:instrText>
+              <w:instrText xml:space="preserve"> PAGEREF _Toc241063181 \h </w:instrText>
             </w:r>
             <w:r>
               <w:rPr>
@@ -449,7 +449,7 @@
               <w14:ligatures w14:val="standardContextual"/>
             </w:rPr>
           </w:pPr>
-          <w:hyperlink w:anchor="_Toc240447986" w:history="1">
+          <w:hyperlink w:anchor="_Toc241063182" w:history="1">
             <w:r>
               <w:rPr>
                 <w:rStyle w:val="Hyperlink"/>
@@ -495,7 +495,7 @@
                 <w:noProof/>
                 <w:webHidden/>
               </w:rPr>
-              <w:instrText xml:space="preserve"> PAGEREF _Toc240447986 \h </w:instrText>
+              <w:instrText xml:space="preserve"> PAGEREF _Toc241063182 \h </w:instrText>
             </w:r>
             <w:r>
               <w:rPr>
@@ -543,7 +543,7 @@
               <w14:ligatures w14:val="standardContextual"/>
             </w:rPr>
           </w:pPr>
-          <w:hyperlink w:anchor="_Toc240447987" w:history="1">
+          <w:hyperlink w:anchor="_Toc241063183" w:history="1">
             <w:r>
               <w:rPr>
                 <w:rStyle w:val="Hyperlink"/>
@@ -589,7 +589,7 @@
                 <w:noProof/>
                 <w:webHidden/>
               </w:rPr>
-              <w:instrText xml:space="preserve"> PAGEREF _Toc240447987 \h </w:instrText>
+              <w:instrText xml:space="preserve"> PAGEREF _Toc241063183 \h </w:instrText>
             </w:r>
             <w:r>
               <w:rPr>
@@ -637,7 +637,7 @@
               <w14:ligatures w14:val="standardContextual"/>
             </w:rPr>
           </w:pPr>
-          <w:hyperlink w:anchor="_Toc240447988" w:history="1">
+          <w:hyperlink w:anchor="_Toc241063184" w:history="1">
             <w:r>
               <w:rPr>
                 <w:rStyle w:val="Hyperlink"/>
@@ -683,7 +683,7 @@
                 <w:noProof/>
                 <w:webHidden/>
               </w:rPr>
-              <w:instrText xml:space="preserve"> PAGEREF _Toc240447988 \h </w:instrText>
+              <w:instrText xml:space="preserve"> PAGEREF _Toc241063184 \h </w:instrText>
             </w:r>
             <w:r>
               <w:rPr>
@@ -731,7 +731,7 @@
               <w14:ligatures w14:val="standardContextual"/>
             </w:rPr>
           </w:pPr>
-          <w:hyperlink w:anchor="_Toc240447989" w:history="1">
+          <w:hyperlink w:anchor="_Toc241063185" w:history="1">
             <w:r>
               <w:rPr>
                 <w:rStyle w:val="Hyperlink"/>
@@ -756,7 +756,7 @@
                 <w:rStyle w:val="Hyperlink"/>
                 <w:noProof/>
               </w:rPr>
-              <w:t>Options mask</w:t>
+              <w:t>Forwards compatibility</w:t>
             </w:r>
             <w:r>
               <w:rPr>
@@ -777,7 +777,7 @@
                 <w:noProof/>
                 <w:webHidden/>
               </w:rPr>
-              <w:instrText xml:space="preserve"> PAGEREF _Toc240447989 \h </w:instrText>
+              <w:instrText xml:space="preserve"> PAGEREF _Toc241063185 \h </w:instrText>
             </w:r>
             <w:r>
               <w:rPr>
@@ -825,7 +825,7 @@
               <w14:ligatures w14:val="standardContextual"/>
             </w:rPr>
           </w:pPr>
-          <w:hyperlink w:anchor="_Toc240447990" w:history="1">
+          <w:hyperlink w:anchor="_Toc241063186" w:history="1">
             <w:r>
               <w:rPr>
                 <w:rStyle w:val="Hyperlink"/>
@@ -850,7 +850,7 @@
                 <w:rStyle w:val="Hyperlink"/>
                 <w:noProof/>
               </w:rPr>
-              <w:t>Details of output fields</w:t>
+              <w:t>Options mask</w:t>
             </w:r>
             <w:r>
               <w:rPr>
@@ -871,7 +871,7 @@
                 <w:noProof/>
                 <w:webHidden/>
               </w:rPr>
-              <w:instrText xml:space="preserve"> PAGEREF _Toc240447990 \h </w:instrText>
+              <w:instrText xml:space="preserve"> PAGEREF _Toc241063186 \h </w:instrText>
             </w:r>
             <w:r>
               <w:rPr>
@@ -891,7 +891,7 @@
                 <w:noProof/>
                 <w:webHidden/>
               </w:rPr>
-              <w:t>6</w:t>
+              <w:t>5</w:t>
             </w:r>
             <w:r>
               <w:rPr>
@@ -919,7 +919,7 @@
               <w14:ligatures w14:val="standardContextual"/>
             </w:rPr>
           </w:pPr>
-          <w:hyperlink w:anchor="_Toc240447991" w:history="1">
+          <w:hyperlink w:anchor="_Toc241063187" w:history="1">
             <w:r>
               <w:rPr>
                 <w:rStyle w:val="Hyperlink"/>
@@ -944,7 +944,7 @@
                 <w:rStyle w:val="Hyperlink"/>
                 <w:noProof/>
               </w:rPr>
-              <w:t>Kalman Filter Status</w:t>
+              <w:t>Details of output fields</w:t>
             </w:r>
             <w:r>
               <w:rPr>
@@ -965,7 +965,7 @@
                 <w:noProof/>
                 <w:webHidden/>
               </w:rPr>
-              <w:instrText xml:space="preserve"> PAGEREF _Toc240447991 \h </w:instrText>
+              <w:instrText xml:space="preserve"> PAGEREF _Toc241063187 \h </w:instrText>
             </w:r>
             <w:r>
               <w:rPr>
@@ -985,7 +985,7 @@
                 <w:noProof/>
                 <w:webHidden/>
               </w:rPr>
-              <w:t>12</w:t>
+              <w:t>7</w:t>
             </w:r>
             <w:r>
               <w:rPr>
@@ -1013,7 +1013,7 @@
               <w14:ligatures w14:val="standardContextual"/>
             </w:rPr>
           </w:pPr>
-          <w:hyperlink w:anchor="_Toc240447992" w:history="1">
+          <w:hyperlink w:anchor="_Toc241063188" w:history="1">
             <w:r>
               <w:rPr>
                 <w:rStyle w:val="Hyperlink"/>
@@ -1038,7 +1038,7 @@
                 <w:rStyle w:val="Hyperlink"/>
                 <w:noProof/>
               </w:rPr>
-              <w:t>Checksum</w:t>
+              <w:t>Kalman Filter Status</w:t>
             </w:r>
             <w:r>
               <w:rPr>
@@ -1059,7 +1059,7 @@
                 <w:noProof/>
                 <w:webHidden/>
               </w:rPr>
-              <w:instrText xml:space="preserve"> PAGEREF _Toc240447992 \h </w:instrText>
+              <w:instrText xml:space="preserve"> PAGEREF _Toc241063188 \h </w:instrText>
             </w:r>
             <w:r>
               <w:rPr>
@@ -1107,7 +1107,7 @@
               <w14:ligatures w14:val="standardContextual"/>
             </w:rPr>
           </w:pPr>
-          <w:hyperlink w:anchor="_Toc240447993" w:history="1">
+          <w:hyperlink w:anchor="_Toc241063189" w:history="1">
             <w:r>
               <w:rPr>
                 <w:rStyle w:val="Hyperlink"/>
@@ -1132,6 +1132,100 @@
                 <w:rStyle w:val="Hyperlink"/>
                 <w:noProof/>
               </w:rPr>
+              <w:t>Checksum</w:t>
+            </w:r>
+            <w:r>
+              <w:rPr>
+                <w:noProof/>
+                <w:webHidden/>
+              </w:rPr>
+              <w:tab/>
+            </w:r>
+            <w:r>
+              <w:rPr>
+                <w:noProof/>
+                <w:webHidden/>
+              </w:rPr>
+              <w:fldChar w:fldCharType="begin"/>
+            </w:r>
+            <w:r>
+              <w:rPr>
+                <w:noProof/>
+                <w:webHidden/>
+              </w:rPr>
+              <w:instrText xml:space="preserve"> PAGEREF _Toc241063189 \h </w:instrText>
+            </w:r>
+            <w:r>
+              <w:rPr>
+                <w:noProof/>
+                <w:webHidden/>
+              </w:rPr>
+            </w:r>
+            <w:r>
+              <w:rPr>
+                <w:noProof/>
+                <w:webHidden/>
+              </w:rPr>
+              <w:fldChar w:fldCharType="separate"/>
+            </w:r>
+            <w:r>
+              <w:rPr>
+                <w:noProof/>
+                <w:webHidden/>
+              </w:rPr>
+              <w:t>14</w:t>
+            </w:r>
+            <w:r>
+              <w:rPr>
+                <w:noProof/>
+                <w:webHidden/>
+              </w:rPr>
+              <w:fldChar w:fldCharType="end"/>
+            </w:r>
+          </w:hyperlink>
+        </w:p>
+        <w:p>
+          <w:pPr>
+            <w:pStyle w:val="TOC3"/>
+            <w:tabs>
+              <w:tab w:val="left" w:pos="1440"/>
+              <w:tab w:val="right" w:leader="dot" w:pos="9016"/>
+            </w:tabs>
+            <w:rPr>
+              <w:rFonts w:eastAsiaTheme="minorEastAsia"/>
+              <w:noProof/>
+              <w:kern w:val="2"/>
+              <w:sz w:val="24"/>
+              <w:szCs w:val="24"/>
+              <w:lang w:eastAsia="en-GB"/>
+              <w14:ligatures w14:val="standardContextual"/>
+            </w:rPr>
+          </w:pPr>
+          <w:hyperlink w:anchor="_Toc241063190" w:history="1">
+            <w:r>
+              <w:rPr>
+                <w:rStyle w:val="Hyperlink"/>
+                <w:noProof/>
+              </w:rPr>
+              <w:t>2.1.10.</w:t>
+            </w:r>
+            <w:r>
+              <w:rPr>
+                <w:rFonts w:eastAsiaTheme="minorEastAsia"/>
+                <w:noProof/>
+                <w:kern w:val="2"/>
+                <w:sz w:val="24"/>
+                <w:szCs w:val="24"/>
+                <w:lang w:eastAsia="en-GB"/>
+                <w14:ligatures w14:val="standardContextual"/>
+              </w:rPr>
+              <w:tab/>
+            </w:r>
+            <w:r>
+              <w:rPr>
+                <w:rStyle w:val="Hyperlink"/>
+                <w:noProof/>
+              </w:rPr>
               <w:t>Example data</w:t>
             </w:r>
             <w:r>
@@ -1153,7 +1247,7 @@
                 <w:noProof/>
                 <w:webHidden/>
               </w:rPr>
-              <w:instrText xml:space="preserve"> PAGEREF _Toc240447993 \h </w:instrText>
+              <w:instrText xml:space="preserve"> PAGEREF _Toc241063190 \h </w:instrText>
             </w:r>
             <w:r>
               <w:rPr>
@@ -1173,7 +1267,7 @@
                 <w:noProof/>
                 <w:webHidden/>
               </w:rPr>
-              <w:t>13</w:t>
+              <w:t>14</w:t>
             </w:r>
             <w:r>
               <w:rPr>
@@ -1201,7 +1295,7 @@
               <w14:ligatures w14:val="standardContextual"/>
             </w:rPr>
           </w:pPr>
-          <w:hyperlink w:anchor="_Toc240447994" w:history="1">
+          <w:hyperlink w:anchor="_Toc241063191" w:history="1">
             <w:r>
               <w:rPr>
                 <w:rStyle w:val="Hyperlink"/>
@@ -1247,7 +1341,7 @@
                 <w:noProof/>
                 <w:webHidden/>
               </w:rPr>
-              <w:instrText xml:space="preserve"> PAGEREF _Toc240447994 \h </w:instrText>
+              <w:instrText xml:space="preserve"> PAGEREF _Toc241063191 \h </w:instrText>
             </w:r>
             <w:r>
               <w:rPr>
@@ -1267,7 +1361,7 @@
                 <w:noProof/>
                 <w:webHidden/>
               </w:rPr>
-              <w:t>14</w:t>
+              <w:t>15</w:t>
             </w:r>
             <w:r>
               <w:rPr>
@@ -1295,7 +1389,7 @@
               <w14:ligatures w14:val="standardContextual"/>
             </w:rPr>
           </w:pPr>
-          <w:hyperlink w:anchor="_Toc240447995" w:history="1">
+          <w:hyperlink w:anchor="_Toc241063192" w:history="1">
             <w:r>
               <w:rPr>
                 <w:rStyle w:val="Hyperlink"/>
@@ -1341,7 +1435,7 @@
                 <w:noProof/>
                 <w:webHidden/>
               </w:rPr>
-              <w:instrText xml:space="preserve"> PAGEREF _Toc240447995 \h </w:instrText>
+              <w:instrText xml:space="preserve"> PAGEREF _Toc241063192 \h </w:instrText>
             </w:r>
             <w:r>
               <w:rPr>
@@ -1361,7 +1455,7 @@
                 <w:noProof/>
                 <w:webHidden/>
               </w:rPr>
-              <w:t>15</w:t>
+              <w:t>16</w:t>
             </w:r>
             <w:r>
               <w:rPr>
@@ -1389,7 +1483,7 @@
               <w14:ligatures w14:val="standardContextual"/>
             </w:rPr>
           </w:pPr>
-          <w:hyperlink w:anchor="_Toc240447996" w:history="1">
+          <w:hyperlink w:anchor="_Toc241063193" w:history="1">
             <w:r>
               <w:rPr>
                 <w:rStyle w:val="Hyperlink"/>
@@ -1435,7 +1529,7 @@
                 <w:noProof/>
                 <w:webHidden/>
               </w:rPr>
-              <w:instrText xml:space="preserve"> PAGEREF _Toc240447996 \h </w:instrText>
+              <w:instrText xml:space="preserve"> PAGEREF _Toc241063193 \h </w:instrText>
             </w:r>
             <w:r>
               <w:rPr>
@@ -1455,7 +1549,7 @@
                 <w:noProof/>
                 <w:webHidden/>
               </w:rPr>
-              <w:t>15</w:t>
+              <w:t>16</w:t>
             </w:r>
             <w:r>
               <w:rPr>
@@ -1483,7 +1577,7 @@
               <w14:ligatures w14:val="standardContextual"/>
             </w:rPr>
           </w:pPr>
-          <w:hyperlink w:anchor="_Toc240447997" w:history="1">
+          <w:hyperlink w:anchor="_Toc241063194" w:history="1">
             <w:r>
               <w:rPr>
                 <w:rStyle w:val="Hyperlink"/>
@@ -1529,7 +1623,7 @@
                 <w:noProof/>
                 <w:webHidden/>
               </w:rPr>
-              <w:instrText xml:space="preserve"> PAGEREF _Toc240447997 \h </w:instrText>
+              <w:instrText xml:space="preserve"> PAGEREF _Toc241063194 \h </w:instrText>
             </w:r>
             <w:r>
               <w:rPr>
@@ -1549,7 +1643,7 @@
                 <w:noProof/>
                 <w:webHidden/>
               </w:rPr>
-              <w:t>15</w:t>
+              <w:t>16</w:t>
             </w:r>
             <w:r>
               <w:rPr>
@@ -1577,7 +1671,7 @@
               <w14:ligatures w14:val="standardContextual"/>
             </w:rPr>
           </w:pPr>
-          <w:hyperlink w:anchor="_Toc240447998" w:history="1">
+          <w:hyperlink w:anchor="_Toc241063195" w:history="1">
             <w:r>
               <w:rPr>
                 <w:rStyle w:val="Hyperlink"/>
@@ -1623,7 +1717,7 @@
                 <w:noProof/>
                 <w:webHidden/>
               </w:rPr>
-              <w:instrText xml:space="preserve"> PAGEREF _Toc240447998 \h </w:instrText>
+              <w:instrText xml:space="preserve"> PAGEREF _Toc241063195 \h </w:instrText>
             </w:r>
             <w:r>
               <w:rPr>
@@ -1643,7 +1737,7 @@
                 <w:noProof/>
                 <w:webHidden/>
               </w:rPr>
-              <w:t>15</w:t>
+              <w:t>16</w:t>
             </w:r>
             <w:r>
               <w:rPr>
@@ -1671,7 +1765,7 @@
               <w14:ligatures w14:val="standardContextual"/>
             </w:rPr>
           </w:pPr>
-          <w:hyperlink w:anchor="_Toc240447999" w:history="1">
+          <w:hyperlink w:anchor="_Toc241063196" w:history="1">
             <w:r>
               <w:rPr>
                 <w:rStyle w:val="Hyperlink"/>
@@ -1717,7 +1811,7 @@
                 <w:noProof/>
                 <w:webHidden/>
               </w:rPr>
-              <w:instrText xml:space="preserve"> PAGEREF _Toc240447999 \h </w:instrText>
+              <w:instrText xml:space="preserve"> PAGEREF _Toc241063196 \h </w:instrText>
             </w:r>
             <w:r>
               <w:rPr>
@@ -1737,7 +1831,7 @@
                 <w:noProof/>
                 <w:webHidden/>
               </w:rPr>
-              <w:t>15</w:t>
+              <w:t>16</w:t>
             </w:r>
             <w:r>
               <w:rPr>
@@ -1765,7 +1859,7 @@
               <w14:ligatures w14:val="standardContextual"/>
             </w:rPr>
           </w:pPr>
-          <w:hyperlink w:anchor="_Toc240448000" w:history="1">
+          <w:hyperlink w:anchor="_Toc241063197" w:history="1">
             <w:r>
               <w:rPr>
                 <w:rStyle w:val="Hyperlink"/>
@@ -1811,7 +1905,7 @@
                 <w:noProof/>
                 <w:webHidden/>
               </w:rPr>
-              <w:instrText xml:space="preserve"> PAGEREF _Toc240448000 \h </w:instrText>
+              <w:instrText xml:space="preserve"> PAGEREF _Toc241063197 \h </w:instrText>
             </w:r>
             <w:r>
               <w:rPr>
@@ -1831,7 +1925,7 @@
                 <w:noProof/>
                 <w:webHidden/>
               </w:rPr>
-              <w:t>16</w:t>
+              <w:t>17</w:t>
             </w:r>
             <w:r>
               <w:rPr>
@@ -1859,7 +1953,7 @@
               <w14:ligatures w14:val="standardContextual"/>
             </w:rPr>
           </w:pPr>
-          <w:hyperlink w:anchor="_Toc240448001" w:history="1">
+          <w:hyperlink w:anchor="_Toc241063198" w:history="1">
             <w:r>
               <w:rPr>
                 <w:rStyle w:val="Hyperlink"/>
@@ -1905,7 +1999,7 @@
                 <w:noProof/>
                 <w:webHidden/>
               </w:rPr>
-              <w:instrText xml:space="preserve"> PAGEREF _Toc240448001 \h </w:instrText>
+              <w:instrText xml:space="preserve"> PAGEREF _Toc241063198 \h </w:instrText>
             </w:r>
             <w:r>
               <w:rPr>
@@ -1925,7 +2019,7 @@
                 <w:noProof/>
                 <w:webHidden/>
               </w:rPr>
-              <w:t>16</w:t>
+              <w:t>17</w:t>
             </w:r>
             <w:r>
               <w:rPr>
@@ -1953,7 +2047,7 @@
               <w14:ligatures w14:val="standardContextual"/>
             </w:rPr>
           </w:pPr>
-          <w:hyperlink w:anchor="_Toc240448002" w:history="1">
+          <w:hyperlink w:anchor="_Toc241063199" w:history="1">
             <w:r>
               <w:rPr>
                 <w:rStyle w:val="Hyperlink"/>
@@ -1999,7 +2093,7 @@
                 <w:noProof/>
                 <w:webHidden/>
               </w:rPr>
-              <w:instrText xml:space="preserve"> PAGEREF _Toc240448002 \h </w:instrText>
+              <w:instrText xml:space="preserve"> PAGEREF _Toc241063199 \h </w:instrText>
             </w:r>
             <w:r>
               <w:rPr>
@@ -2019,7 +2113,7 @@
                 <w:noProof/>
                 <w:webHidden/>
               </w:rPr>
-              <w:t>16</w:t>
+              <w:t>17</w:t>
             </w:r>
             <w:r>
               <w:rPr>
@@ -2047,7 +2141,7 @@
               <w14:ligatures w14:val="standardContextual"/>
             </w:rPr>
           </w:pPr>
-          <w:hyperlink w:anchor="_Toc240448003" w:history="1">
+          <w:hyperlink w:anchor="_Toc241063200" w:history="1">
             <w:r>
               <w:rPr>
                 <w:rStyle w:val="Hyperlink"/>
@@ -2093,7 +2187,7 @@
                 <w:noProof/>
                 <w:webHidden/>
               </w:rPr>
-              <w:instrText xml:space="preserve"> PAGEREF _Toc240448003 \h </w:instrText>
+              <w:instrText xml:space="preserve"> PAGEREF _Toc241063200 \h </w:instrText>
             </w:r>
             <w:r>
               <w:rPr>
@@ -2113,7 +2207,7 @@
                 <w:noProof/>
                 <w:webHidden/>
               </w:rPr>
-              <w:t>16</w:t>
+              <w:t>17</w:t>
             </w:r>
             <w:r>
               <w:rPr>
@@ -2141,7 +2235,7 @@
               <w14:ligatures w14:val="standardContextual"/>
             </w:rPr>
           </w:pPr>
-          <w:hyperlink w:anchor="_Toc240448004" w:history="1">
+          <w:hyperlink w:anchor="_Toc241063201" w:history="1">
             <w:r>
               <w:rPr>
                 <w:rStyle w:val="Hyperlink"/>
@@ -2187,7 +2281,7 @@
                 <w:noProof/>
                 <w:webHidden/>
               </w:rPr>
-              <w:instrText xml:space="preserve"> PAGEREF _Toc240448004 \h </w:instrText>
+              <w:instrText xml:space="preserve"> PAGEREF _Toc241063201 \h </w:instrText>
             </w:r>
             <w:r>
               <w:rPr>
@@ -2207,7 +2301,7 @@
                 <w:noProof/>
                 <w:webHidden/>
               </w:rPr>
-              <w:t>17</w:t>
+              <w:t>18</w:t>
             </w:r>
             <w:r>
               <w:rPr>
@@ -2235,7 +2329,7 @@
               <w14:ligatures w14:val="standardContextual"/>
             </w:rPr>
           </w:pPr>
-          <w:hyperlink w:anchor="_Toc240448005" w:history="1">
+          <w:hyperlink w:anchor="_Toc241063202" w:history="1">
             <w:r>
               <w:rPr>
                 <w:rStyle w:val="Hyperlink"/>
@@ -2281,7 +2375,7 @@
                 <w:noProof/>
                 <w:webHidden/>
               </w:rPr>
-              <w:instrText xml:space="preserve"> PAGEREF _Toc240448005 \h </w:instrText>
+              <w:instrText xml:space="preserve"> PAGEREF _Toc241063202 \h </w:instrText>
             </w:r>
             <w:r>
               <w:rPr>
@@ -2301,7 +2395,7 @@
                 <w:noProof/>
                 <w:webHidden/>
               </w:rPr>
-              <w:t>17</w:t>
+              <w:t>18</w:t>
             </w:r>
             <w:r>
               <w:rPr>
@@ -2329,7 +2423,7 @@
               <w14:ligatures w14:val="standardContextual"/>
             </w:rPr>
           </w:pPr>
-          <w:hyperlink w:anchor="_Toc240448006" w:history="1">
+          <w:hyperlink w:anchor="_Toc241063203" w:history="1">
             <w:r>
               <w:rPr>
                 <w:rStyle w:val="Hyperlink"/>
@@ -2375,7 +2469,7 @@
                 <w:noProof/>
                 <w:webHidden/>
               </w:rPr>
-              <w:instrText xml:space="preserve"> PAGEREF _Toc240448006 \h </w:instrText>
+              <w:instrText xml:space="preserve"> PAGEREF _Toc241063203 \h </w:instrText>
             </w:r>
             <w:r>
               <w:rPr>
@@ -2395,7 +2489,7 @@
                 <w:noProof/>
                 <w:webHidden/>
               </w:rPr>
-              <w:t>17</w:t>
+              <w:t>18</w:t>
             </w:r>
             <w:r>
               <w:rPr>
@@ -2425,7 +2519,7 @@
       </w:pPr>
       <w:bookmarkStart w:id="0" w:name="_Toc122445514"/>
       <w:bookmarkStart w:id="1" w:name="_Toc1145122854"/>
-      <w:bookmarkStart w:id="2" w:name="_Toc240447979"/>
+      <w:bookmarkStart w:id="2" w:name="_Toc241063175"/>
       <w:r>
         <w:lastRenderedPageBreak/>
         <w:t>Revision History</w:t>
@@ -3100,13 +3194,86 @@
           </w:p>
         </w:tc>
       </w:tr>
+      <w:tr>
+        <w:trPr>
+          <w:trHeight w:val="375"/>
+        </w:trPr>
+        <w:tc>
+          <w:tcPr>
+            <w:cnfStyle w:val="001000000000" w:firstRow="0" w:lastRow="0" w:firstColumn="1" w:lastColumn="0" w:oddVBand="0" w:evenVBand="0" w:oddHBand="0" w:evenHBand="0" w:firstRowFirstColumn="0" w:firstRowLastColumn="0" w:lastRowFirstColumn="0" w:lastRowLastColumn="0"/>
+            <w:tcW w:w="1050" w:type="dxa"/>
+            <w:vAlign w:val="center"/>
+          </w:tcPr>
+          <w:p>
+            <w:pPr>
+              <w:jc w:val="center"/>
+              <w:rPr>
+                <w:b w:val="0"/>
+                <w:bCs w:val="0"/>
+              </w:rPr>
+            </w:pPr>
+            <w:r>
+              <w:rPr>
+                <w:b w:val="0"/>
+                <w:bCs w:val="0"/>
+              </w:rPr>
+              <w:t>1.7</w:t>
+            </w:r>
+          </w:p>
+        </w:tc>
+        <w:tc>
+          <w:tcPr>
+            <w:tcW w:w="1395" w:type="dxa"/>
+            <w:vAlign w:val="center"/>
+          </w:tcPr>
+          <w:p>
+            <w:pPr>
+              <w:jc w:val="center"/>
+              <w:cnfStyle w:val="000000000000" w:firstRow="0" w:lastRow="0" w:firstColumn="0" w:lastColumn="0" w:oddVBand="0" w:evenVBand="0" w:oddHBand="0" w:evenHBand="0" w:firstRowFirstColumn="0" w:firstRowLastColumn="0" w:lastRowFirstColumn="0" w:lastRowLastColumn="0"/>
+            </w:pPr>
+            <w:r>
+              <w:t>23/09/2026</w:t>
+            </w:r>
+          </w:p>
+        </w:tc>
+        <w:tc>
+          <w:tcPr>
+            <w:tcW w:w="6359" w:type="dxa"/>
+            <w:vAlign w:val="center"/>
+          </w:tcPr>
+          <w:p>
+            <w:pPr>
+              <w:jc w:val="center"/>
+              <w:cnfStyle w:val="000000000000" w:firstRow="0" w:lastRow="0" w:firstColumn="0" w:lastColumn="0" w:oddVBand="0" w:evenVBand="0" w:oddHBand="0" w:evenHBand="0" w:firstRowFirstColumn="0" w:firstRowLastColumn="0" w:lastRowFirstColumn="0" w:lastRowLastColumn="0"/>
+            </w:pPr>
+            <w:r>
+              <w:t>Added Forwards compatibility section with parser rules and a worked example.</w:t>
+            </w:r>
+          </w:p>
+        </w:tc>
+        <w:tc>
+          <w:tcPr>
+            <w:tcW w:w="976" w:type="dxa"/>
+            <w:vAlign w:val="center"/>
+          </w:tcPr>
+          <w:p>
+            <w:pPr>
+              <w:jc w:val="center"/>
+              <w:cnfStyle w:val="000000000000" w:firstRow="0" w:lastRow="0" w:firstColumn="0" w:lastColumn="0" w:oddVBand="0" w:evenVBand="0" w:oddHBand="0" w:evenHBand="0" w:firstRowFirstColumn="0" w:firstRowLastColumn="0" w:lastRowFirstColumn="0" w:lastRowLastColumn="0"/>
+            </w:pPr>
+            <w:r>
+              <w:t>JB</w:t>
+            </w:r>
+          </w:p>
+        </w:tc>
+      </w:tr>
     </w:tbl>
     <w:p/>
     <w:p>
       <w:pPr>
         <w:pStyle w:val="Heading1"/>
       </w:pPr>
-      <w:bookmarkStart w:id="3" w:name="_Toc240447980"/>
+      <w:bookmarkStart w:id="3" w:name="_Toc241063176"/>
       <w:r>
         <w:lastRenderedPageBreak/>
         <w:t>O</w:t>
@@ -3161,7 +3328,7 @@
         <w:pStyle w:val="Heading2"/>
       </w:pPr>
       <w:bookmarkStart w:id="4" w:name="_Ref97549053"/>
-      <w:bookmarkStart w:id="5" w:name="_Toc240447981"/>
+      <w:bookmarkStart w:id="5" w:name="_Toc241063177"/>
       <w:r>
         <w:t>Racelogic</w:t>
       </w:r>
@@ -3199,8 +3366,10 @@
       </w:pPr>
       <w:bookmarkStart w:id="6" w:name="_Toc177630131"/>
       <w:bookmarkStart w:id="7" w:name="_Toc240447982"/>
+      <w:bookmarkStart w:id="8" w:name="_Toc241063178"/>
       <w:bookmarkEnd w:id="6"/>
       <w:bookmarkEnd w:id="7"/>
+      <w:bookmarkEnd w:id="8"/>
     </w:p>
     <w:p>
       <w:pPr>
@@ -3222,10 +3391,12 @@
           <w:szCs w:val="24"/>
         </w:rPr>
       </w:pPr>
-      <w:bookmarkStart w:id="8" w:name="_Toc177630132"/>
-      <w:bookmarkStart w:id="9" w:name="_Toc240447983"/>
-      <w:bookmarkEnd w:id="8"/>
+      <w:bookmarkStart w:id="9" w:name="_Toc177630132"/>
+      <w:bookmarkStart w:id="10" w:name="_Toc240447983"/>
+      <w:bookmarkStart w:id="11" w:name="_Toc241063179"/>
       <w:bookmarkEnd w:id="9"/>
+      <w:bookmarkEnd w:id="10"/>
+      <w:bookmarkEnd w:id="11"/>
     </w:p>
     <w:p>
       <w:pPr>
@@ -3247,20 +3418,22 @@
           <w:szCs w:val="24"/>
         </w:rPr>
       </w:pPr>
-      <w:bookmarkStart w:id="10" w:name="_Toc177630133"/>
-      <w:bookmarkStart w:id="11" w:name="_Toc240447984"/>
-      <w:bookmarkEnd w:id="10"/>
-      <w:bookmarkEnd w:id="11"/>
+      <w:bookmarkStart w:id="12" w:name="_Toc177630133"/>
+      <w:bookmarkStart w:id="13" w:name="_Toc240447984"/>
+      <w:bookmarkStart w:id="14" w:name="_Toc241063180"/>
+      <w:bookmarkEnd w:id="12"/>
+      <w:bookmarkEnd w:id="13"/>
+      <w:bookmarkEnd w:id="14"/>
     </w:p>
     <w:p>
       <w:pPr>
         <w:pStyle w:val="Heading3"/>
       </w:pPr>
-      <w:bookmarkStart w:id="12" w:name="_Toc240447985"/>
+      <w:bookmarkStart w:id="15" w:name="_Toc241063181"/>
       <w:r>
         <w:t>Introduction</w:t>
       </w:r>
-      <w:bookmarkEnd w:id="12"/>
+      <w:bookmarkEnd w:id="15"/>
     </w:p>
     <w:p>
       <w:r>
@@ -3501,11 +3674,11 @@
       <w:pPr>
         <w:pStyle w:val="Heading3"/>
       </w:pPr>
-      <w:bookmarkStart w:id="13" w:name="_Toc240447986"/>
+      <w:bookmarkStart w:id="16" w:name="_Toc241063182"/>
       <w:r>
         <w:t>Header</w:t>
       </w:r>
-      <w:bookmarkEnd w:id="13"/>
+      <w:bookmarkEnd w:id="16"/>
     </w:p>
     <w:p>
       <w:r>
@@ -3522,11 +3695,11 @@
       <w:pPr>
         <w:pStyle w:val="Heading3"/>
       </w:pPr>
-      <w:bookmarkStart w:id="14" w:name="_Toc240447987"/>
+      <w:bookmarkStart w:id="17" w:name="_Toc241063183"/>
       <w:r>
         <w:t>Message length</w:t>
       </w:r>
-      <w:bookmarkEnd w:id="14"/>
+      <w:bookmarkEnd w:id="17"/>
     </w:p>
     <w:p>
       <w:r>
@@ -3556,19 +3729,10 @@
       </w:pPr>
       <w:r>
         <w:rPr>
-          <w:b/>
           <w:bCs/>
-          <w:i/>
           <w:iCs/>
         </w:rPr>
-        <w:t xml:space="preserve">Note: </w:t>
-      </w:r>
-      <w:r>
-        <w:rPr>
-          <w:i/>
-          <w:iCs/>
-        </w:rPr>
-        <w:t>Parsers should use this length to calculate the checksum without needing to know all future field options. This makes future version of the protocol backwards compatible, by only parsing the sections that are known at the time, and support for new sections can be added later if needed.</w:t>
+        <w:t>See Forwards compatibility for the rules a parser must follow so that fields added in future never break it.</w:t>
       </w:r>
     </w:p>
     <w:p>
@@ -3588,12 +3752,12 @@
       <w:pPr>
         <w:pStyle w:val="Heading3"/>
       </w:pPr>
-      <w:bookmarkStart w:id="15" w:name="_Toc240447988"/>
+      <w:bookmarkStart w:id="18" w:name="_Toc241063184"/>
       <w:r>
         <w:lastRenderedPageBreak/>
         <w:t>Coordinate frame</w:t>
       </w:r>
-      <w:bookmarkEnd w:id="15"/>
+      <w:bookmarkEnd w:id="18"/>
     </w:p>
     <w:p>
       <w:r>
@@ -3715,11 +3879,104 @@
       <w:pPr>
         <w:pStyle w:val="Heading3"/>
       </w:pPr>
-      <w:bookmarkStart w:id="16" w:name="_Toc240447989"/>
+      <w:bookmarkStart w:id="19" w:name="_Toc241063185"/>
+      <w:r>
+        <w:t>Forwards compatibility</w:t>
+      </w:r>
+      <w:bookmarkEnd w:id="19"/>
+    </w:p>
+    <w:p>
+      <w:r>
+        <w:t>The protocol is designed to grow. A new field is always appended after every existing field and takes the next free bit in the options mask. The bits and layout of existing fields never change. Any bit listed as reserved today may become a real field in a future firmware release, and units already in service will start sending it as soon as they are updated.</w:t>
+      </w:r>
+    </w:p>
+    <w:p>
+      <w:r>
+        <w:lastRenderedPageBreak/>
+        <w:t>A parser that follows three rules will keep working when that happens:</w:t>
+      </w:r>
+    </w:p>
+    <w:p>
+      <w:r>
+        <w:t xml:space="preserve">1. </w:t>
+      </w:r>
+      <w:r>
+        <w:rPr>
+          <w:b/>
+        </w:rPr>
+        <w:t>Read the options mask from every packet.</w:t>
+      </w:r>
+      <w:r>
+        <w:t xml:space="preserve"> Do not assume it is fixed for a device, and do not cache it from the first packet.</w:t>
+      </w:r>
+    </w:p>
+    <w:p>
+      <w:r>
+        <w:t xml:space="preserve">2. </w:t>
+      </w:r>
+      <w:r>
+        <w:rPr>
+          <w:b/>
+        </w:rPr>
+        <w:t>Use the length field to find the checksum.</w:t>
+      </w:r>
+      <w:r>
+        <w:t xml:space="preserve"> It occupies the last two bytes of the message, at offset length - 2. Never compute the message length from your own table of known fields.</w:t>
+      </w:r>
+    </w:p>
+    <w:p>
+      <w:r>
+        <w:t xml:space="preserve">3. </w:t>
+      </w:r>
+      <w:r>
+        <w:rPr>
+          <w:b/>
+        </w:rPr>
+        <w:t>Skip fields you do not recognise.</w:t>
+      </w:r>
+      <w:r>
+        <w:t xml:space="preserve"> Parse the bits you know, in ascending bit order, then jump straight to the checksum.</w:t>
+      </w:r>
+    </w:p>
+    <w:p>
+      <w:r>
+        <w:t>A parser that instead walks a hard-coded field list and expects the checksum immediately after the last field it knows about will fail the first time a unit adds a field, either reporting checksum errors or reading the new field's bytes as if they were the checksum. Every "legacy mode" option in a Racelogic product exists because a parser was written that way.</w:t>
+      </w:r>
+    </w:p>
+    <w:p>
+      <w:r>
+        <w:rPr>
+          <w:b/>
+        </w:rPr>
+        <w:t>Worked example.</w:t>
+      </w:r>
+      <w:r>
+        <w:t xml:space="preserve"> A packet arrives with mask 0x00010046 and length 62. Bits 1, 2 and 6 are Status, Orientation and Accuracy, which this document defines. Bit 16 is not defined here. A correct parser reads the 32 bytes of header, length, mask, time and position, then Status (4 bytes), Orientation (12) and Accuracy (4), reaching offset 52. It does not know what bit 16 means, so it ignores bytes 52 to 59 and reads the checksum from offset 60, which is length - 2. Every value it decodes is correct and the checksum verifies.</w:t>
+      </w:r>
+    </w:p>
+    <w:p>
+      <w:r>
+        <w:t xml:space="preserve">The simulator in this repository has a </w:t>
+      </w:r>
+      <w:r>
+        <w:rPr>
+          <w:b/>
+        </w:rPr>
+        <w:t>Test forwards compatibility</w:t>
+      </w:r>
+      <w:r>
+        <w:t xml:space="preserve"> option that appends fields on undefined bits to every packet, so you can prove your parser copes before a firmware release makes it do so for real.</w:t>
+      </w:r>
+    </w:p>
+    <w:p>
+      <w:pPr>
+        <w:pStyle w:val="Heading3"/>
+      </w:pPr>
+      <w:bookmarkStart w:id="20" w:name="_Toc241063186"/>
       <w:r>
         <w:t>Options mask</w:t>
       </w:r>
-      <w:bookmarkEnd w:id="16"/>
+      <w:bookmarkEnd w:id="20"/>
     </w:p>
     <w:p>
       <w:r>
@@ -3766,7 +4023,6 @@
     </w:p>
     <w:p>
       <w:r>
-        <w:lastRenderedPageBreak/>
         <w:t xml:space="preserve">Items in </w:t>
       </w:r>
       <w:r>
@@ -3861,7 +4117,7 @@
             <w:tcW w:w="1980" w:type="dxa"/>
           </w:tcPr>
           <w:p>
-            <w:bookmarkStart w:id="17" w:name="_Hlk84257669"/>
+            <w:bookmarkStart w:id="21" w:name="_Hlk84257669"/>
             <w:r>
               <w:t>Bit</w:t>
             </w:r>
@@ -3982,7 +4238,7 @@
           </w:p>
         </w:tc>
       </w:tr>
-      <w:bookmarkEnd w:id="17"/>
+      <w:bookmarkEnd w:id="21"/>
       <w:tr>
         <w:tc>
           <w:tcPr>
@@ -4180,6 +4436,7 @@
           </w:tcPr>
           <w:p>
             <w:r>
+              <w:lastRenderedPageBreak/>
               <w:t>5 (0x0000_0020)</w:t>
             </w:r>
           </w:p>
@@ -4831,14 +5088,14 @@
       <w:pPr>
         <w:pStyle w:val="Heading3"/>
       </w:pPr>
-      <w:bookmarkStart w:id="18" w:name="_Toc240447990"/>
+      <w:bookmarkStart w:id="22" w:name="_Toc241063187"/>
       <w:r>
         <w:t>Details of o</w:t>
       </w:r>
       <w:r>
         <w:t>utput fields</w:t>
       </w:r>
-      <w:bookmarkEnd w:id="18"/>
+      <w:bookmarkEnd w:id="22"/>
     </w:p>
     <w:p>
       <w:r>
@@ -6004,7 +6261,7 @@
                 <w:color w:val="0070C0"/>
                 <w:u w:val="single"/>
               </w:rPr>
-              <w:t>2.1.7</w:t>
+              <w:t>2.1.8</w:t>
             </w:r>
             <w:r>
               <w:rPr>
@@ -7749,7 +8006,7 @@
                 <w:color w:val="0070C0"/>
               </w:rPr>
             </w:pPr>
-            <w:bookmarkStart w:id="19" w:name="_Hlk177550209"/>
+            <w:bookmarkStart w:id="23" w:name="_Hlk177550209"/>
             <w:r>
               <w:rPr>
                 <w:color w:val="0070C0"/>
@@ -7952,7 +8209,7 @@
           </w:p>
         </w:tc>
       </w:tr>
-      <w:bookmarkEnd w:id="19"/>
+      <w:bookmarkEnd w:id="23"/>
       <w:tr>
         <w:tc>
           <w:tcPr>
@@ -9809,7 +10066,7 @@
         <w:pStyle w:val="Caption"/>
         <w:keepNext/>
       </w:pPr>
-      <w:bookmarkStart w:id="20" w:name="_Ref112321867"/>
+      <w:bookmarkStart w:id="24" w:name="_Ref112321867"/>
       <w:r>
         <w:t xml:space="preserve">Table </w:t>
       </w:r>
@@ -9821,15 +10078,15 @@
           <w:t>3</w:t>
         </w:r>
       </w:fldSimple>
-      <w:bookmarkEnd w:id="20"/>
+      <w:bookmarkEnd w:id="24"/>
       <w:r>
         <w:t xml:space="preserve"> </w:t>
       </w:r>
-      <w:bookmarkStart w:id="21" w:name="_Ref112321859"/>
+      <w:bookmarkStart w:id="25" w:name="_Ref112321859"/>
       <w:r>
         <w:t>Reliability Flag values</w:t>
       </w:r>
-      <w:bookmarkEnd w:id="21"/>
+      <w:bookmarkEnd w:id="25"/>
     </w:p>
     <w:tbl>
       <w:tblPr>
@@ -10011,15 +10268,15 @@
       <w:pPr>
         <w:pStyle w:val="Heading3"/>
       </w:pPr>
-      <w:bookmarkStart w:id="22" w:name="_Kalman_Filter_Status"/>
-      <w:bookmarkStart w:id="23" w:name="_Ref177629954"/>
-      <w:bookmarkStart w:id="24" w:name="_Toc240447991"/>
-      <w:bookmarkEnd w:id="22"/>
+      <w:bookmarkStart w:id="26" w:name="_Kalman_Filter_Status"/>
+      <w:bookmarkStart w:id="27" w:name="_Ref177629954"/>
+      <w:bookmarkStart w:id="28" w:name="_Toc241063188"/>
+      <w:bookmarkEnd w:id="26"/>
       <w:r>
         <w:t>Kalman Filter Status</w:t>
       </w:r>
-      <w:bookmarkEnd w:id="23"/>
-      <w:bookmarkEnd w:id="24"/>
+      <w:bookmarkEnd w:id="27"/>
+      <w:bookmarkEnd w:id="28"/>
     </w:p>
     <w:p>
       <w:r>
@@ -10511,13 +10768,13 @@
       <w:pPr>
         <w:pStyle w:val="Heading3"/>
       </w:pPr>
-      <w:bookmarkStart w:id="25" w:name="_Ref177631325"/>
-      <w:bookmarkStart w:id="26" w:name="_Toc240447992"/>
+      <w:bookmarkStart w:id="29" w:name="_Ref177631325"/>
+      <w:bookmarkStart w:id="30" w:name="_Toc241063189"/>
       <w:r>
         <w:t>Checksum</w:t>
       </w:r>
-      <w:bookmarkEnd w:id="25"/>
-      <w:bookmarkEnd w:id="26"/>
+      <w:bookmarkEnd w:id="29"/>
+      <w:bookmarkEnd w:id="30"/>
     </w:p>
     <w:p>
       <w:r>
@@ -10528,11 +10785,11 @@
       <w:pPr>
         <w:pStyle w:val="Heading3"/>
       </w:pPr>
-      <w:bookmarkStart w:id="27" w:name="_Toc240447993"/>
+      <w:bookmarkStart w:id="31" w:name="_Toc241063190"/>
       <w:r>
         <w:t>Example data</w:t>
       </w:r>
-      <w:bookmarkEnd w:id="27"/>
+      <w:bookmarkEnd w:id="31"/>
     </w:p>
     <w:p>
       <w:r>
@@ -10832,14 +11089,14 @@
       <w:pPr>
         <w:pStyle w:val="Heading2"/>
       </w:pPr>
-      <w:bookmarkStart w:id="28" w:name="_Ref97549062"/>
-      <w:bookmarkStart w:id="29" w:name="_Toc240447994"/>
+      <w:bookmarkStart w:id="32" w:name="_Ref97549062"/>
+      <w:bookmarkStart w:id="33" w:name="_Toc241063191"/>
       <w:r>
         <w:lastRenderedPageBreak/>
         <w:t>NMEA output mode</w:t>
       </w:r>
-      <w:bookmarkEnd w:id="28"/>
-      <w:bookmarkEnd w:id="29"/>
+      <w:bookmarkEnd w:id="32"/>
+      <w:bookmarkEnd w:id="33"/>
     </w:p>
     <w:p>
       <w:r>
@@ -10984,8 +11241,8 @@
       <w:pPr>
         <w:pStyle w:val="Heading1"/>
       </w:pPr>
-      <w:bookmarkStart w:id="30" w:name="_Ref97549070"/>
-      <w:bookmarkStart w:id="31" w:name="_Toc240447995"/>
+      <w:bookmarkStart w:id="34" w:name="_Ref97549070"/>
+      <w:bookmarkStart w:id="35" w:name="_Toc241063192"/>
       <w:r>
         <w:lastRenderedPageBreak/>
         <w:t>Operation</w:t>
@@ -10993,8 +11250,8 @@
       <w:r>
         <w:t xml:space="preserve"> options</w:t>
       </w:r>
-      <w:bookmarkEnd w:id="30"/>
-      <w:bookmarkEnd w:id="31"/>
+      <w:bookmarkEnd w:id="34"/>
+      <w:bookmarkEnd w:id="35"/>
     </w:p>
     <w:p>
       <w:r>
@@ -11243,11 +11500,11 @@
       <w:pPr>
         <w:pStyle w:val="Heading2"/>
       </w:pPr>
-      <w:bookmarkStart w:id="32" w:name="_Toc240447996"/>
+      <w:bookmarkStart w:id="36" w:name="_Toc241063193"/>
       <w:r>
         <w:t>Blocked beacon detection</w:t>
       </w:r>
-      <w:bookmarkEnd w:id="32"/>
+      <w:bookmarkEnd w:id="36"/>
     </w:p>
     <w:p>
       <w:r>
@@ -11313,11 +11570,11 @@
       <w:pPr>
         <w:pStyle w:val="Heading2"/>
       </w:pPr>
-      <w:bookmarkStart w:id="33" w:name="_Toc240447997"/>
+      <w:bookmarkStart w:id="37" w:name="_Toc241063194"/>
       <w:r>
         <w:t>Elevation correction</w:t>
       </w:r>
-      <w:bookmarkEnd w:id="33"/>
+      <w:bookmarkEnd w:id="37"/>
     </w:p>
     <w:p>
       <w:r>
@@ -11510,382 +11767,382 @@
       <w:pPr>
         <w:pStyle w:val="Heading2"/>
       </w:pPr>
-      <w:bookmarkStart w:id="34" w:name="_Toc240447998"/>
+      <w:bookmarkStart w:id="38" w:name="_Toc241063195"/>
       <w:r>
         <w:t>Disable low pass filter</w:t>
-      </w:r>
-      <w:bookmarkEnd w:id="34"/>
-    </w:p>
-    <w:p>
-      <w:r>
-        <w:t>When operating without a Kalman filter VIPS defaults to passing the output position and velocity through a 5Hz Butterworth low pass filter. This option can be used to disable that filter</w:t>
-      </w:r>
-      <w:r>
-        <w:t xml:space="preserve"> if required</w:t>
-      </w:r>
-      <w:r>
-        <w:t>.</w:t>
-      </w:r>
-    </w:p>
-    <w:p>
-      <w:pPr>
-        <w:pStyle w:val="Heading2"/>
-      </w:pPr>
-      <w:bookmarkStart w:id="35" w:name="_Toc240447999"/>
-      <w:r>
-        <w:t>Force VIPS mode</w:t>
-      </w:r>
-      <w:bookmarkEnd w:id="35"/>
-    </w:p>
-    <w:p>
-      <w:r>
-        <w:t xml:space="preserve">Only applicable when in VB3i </w:t>
-      </w:r>
-      <w:r>
-        <w:t xml:space="preserve">indoor/outdoor </w:t>
-      </w:r>
-      <w:r>
-        <w:t xml:space="preserve">or ADMA </w:t>
-      </w:r>
-      <w:r>
-        <w:t>mode. This option forces the system to only ever use VIPS even if set to indoor/outdoor mode. This should be used when GPS is only being used as a time source and never used for positioning.</w:t>
-      </w:r>
-    </w:p>
-    <w:p>
-      <w:pPr>
-        <w:pStyle w:val="Heading2"/>
-      </w:pPr>
-      <w:bookmarkStart w:id="36" w:name="_Toc240448000"/>
-      <w:r>
-        <w:lastRenderedPageBreak/>
-        <w:t>Disable fine grain sync</w:t>
-      </w:r>
-      <w:bookmarkEnd w:id="36"/>
-    </w:p>
-    <w:p>
-      <w:r>
-        <w:t>Only applicable</w:t>
-      </w:r>
-      <w:r>
-        <w:t xml:space="preserve"> when </w:t>
-      </w:r>
-      <w:r>
-        <w:t xml:space="preserve">in multi-rover mode. Normally when </w:t>
-      </w:r>
-      <w:r>
-        <w:t xml:space="preserve">running in multi-rover mode the system will attempt to </w:t>
-      </w:r>
-      <w:r>
-        <w:t>synchronise the internal clocks between rovers. If the PPS is from a reliable external source (e.g. a VB3i in indoor/outdoor mode) then it is better to disable this and trust the PPS for cross unit synchronisation.</w:t>
-      </w:r>
-    </w:p>
-    <w:p>
-      <w:pPr>
-        <w:pStyle w:val="Heading2"/>
-      </w:pPr>
-      <w:bookmarkStart w:id="37" w:name="_Toc240448001"/>
-      <w:r>
-        <w:t>Studio LED mode</w:t>
-      </w:r>
-      <w:bookmarkEnd w:id="37"/>
-    </w:p>
-    <w:p>
-      <w:r>
-        <w:t xml:space="preserve">Beacon only. When enabled the beacon will disable its LED 30 seconds after first seeing a rover. The LED will </w:t>
-      </w:r>
-      <w:r>
-        <w:t xml:space="preserve">then </w:t>
-      </w:r>
-      <w:r>
-        <w:t xml:space="preserve">remain off until the </w:t>
-      </w:r>
-      <w:r>
-        <w:t xml:space="preserve">unit is </w:t>
-      </w:r>
-      <w:r>
-        <w:t>next reset</w:t>
-      </w:r>
-      <w:r>
-        <w:t xml:space="preserve"> or power cycled</w:t>
-      </w:r>
-      <w:r>
-        <w:t>.</w:t>
-      </w:r>
-    </w:p>
-    <w:p>
-      <w:pPr>
-        <w:pStyle w:val="Heading2"/>
-      </w:pPr>
-      <w:bookmarkStart w:id="38" w:name="_Toc240448002"/>
-      <w:r>
-        <w:t>Single Sided Fallback.</w:t>
       </w:r>
       <w:bookmarkEnd w:id="38"/>
     </w:p>
     <w:p>
       <w:r>
-        <w:t>Required Beacon F/W 1.0.2, Rover radio F/W 1.2.14, Wearable MM F/W 1.????.</w:t>
-      </w:r>
-      <w:r>
-        <w:br/>
-      </w:r>
-      <w:r>
-        <w:t xml:space="preserve">Under normal operation VIPS uses double sided two way ranging. While this provides the best possible accuracy it requires 4 radio messages to produce a range, if any of these 4 are lost </w:t>
-      </w:r>
-      <w:r>
-        <w:t xml:space="preserve">due to interference </w:t>
-      </w:r>
-      <w:r>
-        <w:t>then the range measurement fails.</w:t>
-      </w:r>
-      <w:r>
-        <w:t xml:space="preserve"> Single sided ranging allows the rover to calculate a range from just the first two of these messages. </w:t>
-      </w:r>
-      <w:r>
-        <w:br/>
-      </w:r>
-      <w:r>
-        <w:t xml:space="preserve">When enabled if the system has insufficient information to calculate a double sided range it will fall back to a single sided calculation. This will increase the number of measurements available to the position calculation engine in the event of intermittent jamming and </w:t>
-      </w:r>
-      <w:r>
-        <w:t>multi-rover systems</w:t>
-      </w:r>
-      <w:r>
-        <w:t xml:space="preserve">. </w:t>
-      </w:r>
-      <w:r>
-        <w:t xml:space="preserve">However this method of ranging </w:t>
-      </w:r>
-      <w:r>
-        <w:t xml:space="preserve">can </w:t>
-      </w:r>
-      <w:r>
-        <w:t xml:space="preserve">result in a slight increase in measurement noise </w:t>
-      </w:r>
-      <w:r>
-        <w:t xml:space="preserve">in some situations </w:t>
-      </w:r>
-      <w:r>
-        <w:t xml:space="preserve">and so may not be suitable for every application. </w:t>
+        <w:t>When operating without a Kalman filter VIPS defaults to passing the output position and velocity through a 5Hz Butterworth low pass filter. This option can be used to disable that filter</w:t>
+      </w:r>
+      <w:r>
+        <w:t xml:space="preserve"> if required</w:t>
+      </w:r>
+      <w:r>
+        <w:t>.</w:t>
       </w:r>
     </w:p>
     <w:p>
-      <w:r>
-        <w:t>Note that for Radio FW 1.2.14-1.2.15 this bit was used to enable single sided. From 1.2.16 this was swapped to single sided being enabled as default and this bit being used to disable it.</w:t>
-      </w:r>
-    </w:p>
-    <w:p>
       <w:pPr>
         <w:pStyle w:val="Heading2"/>
       </w:pPr>
-      <w:bookmarkStart w:id="39" w:name="_Toc240448003"/>
-      <w:r>
-        <w:t>GeoFence Size</w:t>
+      <w:bookmarkStart w:id="39" w:name="_Toc241063196"/>
+      <w:r>
+        <w:t>Force VIPS mode</w:t>
       </w:r>
       <w:bookmarkEnd w:id="39"/>
     </w:p>
     <w:p>
       <w:r>
-        <w:t xml:space="preserve">Requires position engine </w:t>
-      </w:r>
-      <w:r>
-        <w:t>1.5.48</w:t>
-      </w:r>
-      <w:r>
-        <w:t xml:space="preserve"> or later.</w:t>
+        <w:t xml:space="preserve">Only applicable when in VB3i </w:t>
+      </w:r>
+      <w:r>
+        <w:t xml:space="preserve">indoor/outdoor </w:t>
+      </w:r>
+      <w:r>
+        <w:t xml:space="preserve">or ADMA </w:t>
+      </w:r>
+      <w:r>
+        <w:t>mode. This option forces the system to only ever use VIPS even if set to indoor/outdoor mode. This should be used when GPS is only being used as a time source and never used for positioning.</w:t>
       </w:r>
     </w:p>
     <w:p>
-      <w:r>
-        <w:t>As default VIPS implements a basic geofence around the covered area. If the rover passes outside of this fence then the output is flagged as do not use. This will impact the reliability flags section of the serial message, the CAN output and the VB3i when in indoor/outdoor mode. Note, other than a VB3i in indoor/outdoor mode this will not have any addition impact on the system operation, it will still attempt to operate as normal. This is purely intended as an indicator to the user equipment that the rover is leaving the covered area.</w:t>
-      </w:r>
-      <w:r>
-        <w:br/>
-        <w:t>This fence defaults to 10m outside of the beacon covered area.</w:t>
-      </w:r>
-      <w:r>
-        <w:br/>
-        <w:t>Th</w:t>
-      </w:r>
-      <w:r>
-        <w:t>e</w:t>
-      </w:r>
-      <w:r>
-        <w:t xml:space="preserve"> size is set as 10 – the value of this 4 bit field allowing the user to reduce the size of this fence by up to 15 meters and thus placing it inside the covered area if desired.</w:t>
-      </w:r>
-    </w:p>
-    <w:p>
-      <w:r>
-        <w:t>In all cases a 1 meter hysteresis is applied, the rover must move 1 meter further in to the site to clear the flag.</w:t>
-      </w:r>
-    </w:p>
-    <w:p>
-      <w:pPr>
-        <w:pStyle w:val="Heading1"/>
-      </w:pPr>
-      <w:bookmarkStart w:id="40" w:name="_Toc240448004"/>
+      <w:pPr>
+        <w:pStyle w:val="Heading2"/>
+      </w:pPr>
+      <w:bookmarkStart w:id="40" w:name="_Toc241063197"/>
       <w:r>
         <w:lastRenderedPageBreak/>
-        <w:t>Manual c</w:t>
-      </w:r>
-      <w:r>
-        <w:t>onfigur</w:t>
-      </w:r>
-      <w:r>
-        <w:t>ation of</w:t>
-      </w:r>
-      <w:r>
-        <w:t xml:space="preserve"> VIPS options</w:t>
+        <w:t>Disable fine grain sync</w:t>
       </w:r>
       <w:bookmarkEnd w:id="40"/>
     </w:p>
     <w:p>
       <w:r>
-        <w:t xml:space="preserve">Most VIPS options can be configured from within the VIPS Site setup software. However some newer or less common combinations and options may not be fully supported by the software. It is possible to manually force a </w:t>
-      </w:r>
-      <w:r>
-        <w:t xml:space="preserve">specific </w:t>
-      </w:r>
-      <w:r>
-        <w:t xml:space="preserve">configuration by editing the setup </w:t>
-      </w:r>
-      <w:r>
-        <w:t>JSON</w:t>
-      </w:r>
-      <w:r>
-        <w:t xml:space="preserve"> file in a text editor. When this modified </w:t>
-      </w:r>
-      <w:r>
-        <w:t>JSON</w:t>
-      </w:r>
-      <w:r>
-        <w:t xml:space="preserve"> file is loading into site setup the user set values will be maintained unless the configuration is</w:t>
-      </w:r>
-      <w:r>
-        <w:t xml:space="preserve"> later </w:t>
-      </w:r>
-      <w:r>
-        <w:t>changed in the user interface.</w:t>
+        <w:t>Only applicable</w:t>
+      </w:r>
+      <w:r>
+        <w:t xml:space="preserve"> when </w:t>
+      </w:r>
+      <w:r>
+        <w:t xml:space="preserve">in multi-rover mode. Normally when </w:t>
+      </w:r>
+      <w:r>
+        <w:t xml:space="preserve">running in multi-rover mode the system will attempt to </w:t>
+      </w:r>
+      <w:r>
+        <w:t>synchronise the internal clocks between rovers. If the PPS is from a reliable external source (e.g. a VB3i in indoor/outdoor mode) then it is better to disable this and trust the PPS for cross unit synchronisation.</w:t>
       </w:r>
     </w:p>
     <w:p>
-      <w:r>
-        <w:t xml:space="preserve">There are two different configuration options that may be modified by the user, the output format and the operating mode options. </w:t>
-      </w:r>
-      <w:r>
-        <w:t>When editing these values ensure that only the required value is changed and that no other file contents, including commas at the ends of lines, are changed.</w:t>
-      </w:r>
+      <w:pPr>
+        <w:pStyle w:val="Heading2"/>
+      </w:pPr>
+      <w:bookmarkStart w:id="41" w:name="_Toc241063198"/>
+      <w:r>
+        <w:t>Studio LED mode</w:t>
+      </w:r>
+      <w:bookmarkEnd w:id="41"/>
     </w:p>
     <w:p>
+      <w:r>
+        <w:t xml:space="preserve">Beacon only. When enabled the beacon will disable its LED 30 seconds after first seeing a rover. The LED will </w:t>
+      </w:r>
+      <w:r>
+        <w:t xml:space="preserve">then </w:t>
+      </w:r>
+      <w:r>
+        <w:t xml:space="preserve">remain off until the </w:t>
+      </w:r>
+      <w:r>
+        <w:t xml:space="preserve">unit is </w:t>
+      </w:r>
+      <w:r>
+        <w:t>next reset</w:t>
+      </w:r>
+      <w:r>
+        <w:t xml:space="preserve"> or power cycled</w:t>
+      </w:r>
+      <w:r>
+        <w:t>.</w:t>
+      </w:r>
+    </w:p>
+    <w:p>
       <w:pPr>
         <w:pStyle w:val="Heading2"/>
       </w:pPr>
-      <w:bookmarkStart w:id="41" w:name="_Ref97548984"/>
-      <w:bookmarkStart w:id="42" w:name="_Toc240448005"/>
-      <w:r>
-        <w:t>Output format</w:t>
-      </w:r>
-      <w:bookmarkEnd w:id="41"/>
+      <w:bookmarkStart w:id="42" w:name="_Toc241063199"/>
+      <w:r>
+        <w:t>Single Sided Fallback.</w:t>
+      </w:r>
       <w:bookmarkEnd w:id="42"/>
     </w:p>
     <w:p>
       <w:r>
-        <w:t>This setting is found under “</w:t>
-      </w:r>
-      <w:r>
-        <w:t>BinaryOutput</w:t>
-      </w:r>
-      <w:r>
-        <w:t xml:space="preserve">” in the </w:t>
-      </w:r>
-      <w:r>
-        <w:t>JSON</w:t>
-      </w:r>
-      <w:r>
-        <w:t xml:space="preserve"> file. It controls the desired VIPS binary or NMEA output options.</w:t>
+        <w:t>Required Beacon F/W 1.0.2, Rover radio F/W 1.2.14, Wearable MM F/W 1.????.</w:t>
+      </w:r>
+      <w:r>
+        <w:br/>
+      </w:r>
+      <w:r>
+        <w:t xml:space="preserve">Under normal operation VIPS uses double sided two way ranging. While this provides the best possible accuracy it requires 4 radio messages to produce a range, if any of these 4 are lost </w:t>
+      </w:r>
+      <w:r>
+        <w:t xml:space="preserve">due to interference </w:t>
+      </w:r>
+      <w:r>
+        <w:t>then the range measurement fails.</w:t>
+      </w:r>
+      <w:r>
+        <w:t xml:space="preserve"> Single sided ranging allows the rover to calculate a range from just the first two of these messages. </w:t>
+      </w:r>
+      <w:r>
+        <w:br/>
+      </w:r>
+      <w:r>
+        <w:t xml:space="preserve">When enabled if the system has insufficient information to calculate a double sided range it will fall back to a single sided calculation. This will increase the number of measurements available to the position calculation engine in the event of intermittent jamming and </w:t>
+      </w:r>
+      <w:r>
+        <w:t>multi-rover systems</w:t>
+      </w:r>
+      <w:r>
+        <w:t xml:space="preserve">. </w:t>
+      </w:r>
+      <w:r>
+        <w:t xml:space="preserve">However this method of ranging </w:t>
+      </w:r>
+      <w:r>
+        <w:t xml:space="preserve">can </w:t>
+      </w:r>
+      <w:r>
+        <w:t xml:space="preserve">result in a slight increase in measurement noise </w:t>
+      </w:r>
+      <w:r>
+        <w:t xml:space="preserve">in some situations </w:t>
+      </w:r>
+      <w:r>
+        <w:t xml:space="preserve">and so may not be suitable for every application. </w:t>
       </w:r>
     </w:p>
     <w:p>
       <w:r>
-        <w:t xml:space="preserve">In binary output mode the value set here will be used as the requested options mask as detailed in section </w:t>
-      </w:r>
-      <w:r>
-        <w:fldChar w:fldCharType="begin"/>
-      </w:r>
-      <w:r>
-        <w:instrText xml:space="preserve"> REF _Ref97549053 \r \h </w:instrText>
-      </w:r>
-      <w:r>
-        <w:fldChar w:fldCharType="separate"/>
-      </w:r>
-      <w:r>
-        <w:t>2.1</w:t>
-      </w:r>
-      <w:r>
-        <w:fldChar w:fldCharType="end"/>
-      </w:r>
-      <w:r>
-        <w:t xml:space="preserve">. The </w:t>
-      </w:r>
-      <w:r>
-        <w:t xml:space="preserve">options </w:t>
-      </w:r>
-      <w:r>
-        <w:t>value i</w:t>
-      </w:r>
-      <w:r>
-        <w:t>n</w:t>
-      </w:r>
-      <w:r>
-        <w:t xml:space="preserve"> the output message will normally be </w:t>
-      </w:r>
-      <w:r>
-        <w:t xml:space="preserve">the same as </w:t>
-      </w:r>
-      <w:r>
-        <w:t xml:space="preserve">the option set </w:t>
-      </w:r>
-      <w:r>
-        <w:t>h</w:t>
-      </w:r>
-      <w:r>
-        <w:t>ere unless an invalid combination of options has been selected. For example orientation channels will only be output if the Kalman filter is also enabled.</w:t>
-      </w:r>
-      <w:r>
-        <w:t xml:space="preserve"> The user should always parse a message based on the options field it contains not the value requested in the JSON file.</w:t>
+        <w:t>Note that for Radio FW 1.2.14-1.2.15 this bit was used to enable single sided. From 1.2.16 this was swapped to single sided being enabled as default and this bit being used to disable it.</w:t>
       </w:r>
     </w:p>
     <w:p>
-      <w:r>
-        <w:t xml:space="preserve">In NMEA mode this value sets which NMEA messages are output as detailed in section </w:t>
-      </w:r>
-      <w:r>
-        <w:fldChar w:fldCharType="begin"/>
-      </w:r>
-      <w:r>
-        <w:instrText xml:space="preserve"> REF _Ref97549062 \r \h </w:instrText>
-      </w:r>
-      <w:r>
-        <w:fldChar w:fldCharType="separate"/>
-      </w:r>
-      <w:r>
-        <w:t>2.2</w:t>
-      </w:r>
-      <w:r>
-        <w:fldChar w:fldCharType="end"/>
-      </w:r>
+      <w:pPr>
+        <w:pStyle w:val="Heading2"/>
+      </w:pPr>
+      <w:bookmarkStart w:id="43" w:name="_Toc241063200"/>
+      <w:r>
+        <w:t>GeoFence Size</w:t>
+      </w:r>
+      <w:bookmarkEnd w:id="43"/>
     </w:p>
     <w:p>
+      <w:r>
+        <w:t xml:space="preserve">Requires position engine </w:t>
+      </w:r>
+      <w:r>
+        <w:t>1.5.48</w:t>
+      </w:r>
+      <w:r>
+        <w:t xml:space="preserve"> or later.</w:t>
+      </w:r>
+    </w:p>
+    <w:p>
+      <w:r>
+        <w:t>As default VIPS implements a basic geofence around the covered area. If the rover passes outside of this fence then the output is flagged as do not use. This will impact the reliability flags section of the serial message, the CAN output and the VB3i when in indoor/outdoor mode. Note, other than a VB3i in indoor/outdoor mode this will not have any addition impact on the system operation, it will still attempt to operate as normal. This is purely intended as an indicator to the user equipment that the rover is leaving the covered area.</w:t>
+      </w:r>
+      <w:r>
+        <w:br/>
+        <w:t>This fence defaults to 10m outside of the beacon covered area.</w:t>
+      </w:r>
+      <w:r>
+        <w:br/>
+        <w:t>Th</w:t>
+      </w:r>
+      <w:r>
+        <w:t>e</w:t>
+      </w:r>
+      <w:r>
+        <w:t xml:space="preserve"> size is set as 10 – the value of this 4 bit field allowing the user to reduce the size of this fence by up to 15 meters and thus placing it inside the covered area if desired.</w:t>
+      </w:r>
+    </w:p>
+    <w:p>
+      <w:r>
+        <w:t>In all cases a 1 meter hysteresis is applied, the rover must move 1 meter further in to the site to clear the flag.</w:t>
+      </w:r>
+    </w:p>
+    <w:p>
+      <w:pPr>
+        <w:pStyle w:val="Heading1"/>
+      </w:pPr>
+      <w:bookmarkStart w:id="44" w:name="_Toc241063201"/>
+      <w:r>
+        <w:lastRenderedPageBreak/>
+        <w:t>Manual c</w:t>
+      </w:r>
+      <w:r>
+        <w:t>onfigur</w:t>
+      </w:r>
+      <w:r>
+        <w:t>ation of</w:t>
+      </w:r>
+      <w:r>
+        <w:t xml:space="preserve"> VIPS options</w:t>
+      </w:r>
+      <w:bookmarkEnd w:id="44"/>
+    </w:p>
+    <w:p>
+      <w:r>
+        <w:t xml:space="preserve">Most VIPS options can be configured from within the VIPS Site setup software. However some newer or less common combinations and options may not be fully supported by the software. It is possible to manually force a </w:t>
+      </w:r>
+      <w:r>
+        <w:t xml:space="preserve">specific </w:t>
+      </w:r>
+      <w:r>
+        <w:t xml:space="preserve">configuration by editing the setup </w:t>
+      </w:r>
+      <w:r>
+        <w:t>JSON</w:t>
+      </w:r>
+      <w:r>
+        <w:t xml:space="preserve"> file in a text editor. When this modified </w:t>
+      </w:r>
+      <w:r>
+        <w:t>JSON</w:t>
+      </w:r>
+      <w:r>
+        <w:t xml:space="preserve"> file is loading into site setup the user set values will be maintained unless the configuration is</w:t>
+      </w:r>
+      <w:r>
+        <w:t xml:space="preserve"> later </w:t>
+      </w:r>
+      <w:r>
+        <w:t>changed in the user interface.</w:t>
+      </w:r>
+    </w:p>
+    <w:p>
+      <w:r>
+        <w:t xml:space="preserve">There are two different configuration options that may be modified by the user, the output format and the operating mode options. </w:t>
+      </w:r>
+      <w:r>
+        <w:t>When editing these values ensure that only the required value is changed and that no other file contents, including commas at the ends of lines, are changed.</w:t>
+      </w:r>
+    </w:p>
+    <w:p>
       <w:pPr>
         <w:pStyle w:val="Heading2"/>
       </w:pPr>
-      <w:bookmarkStart w:id="43" w:name="_Ref97549028"/>
-      <w:bookmarkStart w:id="44" w:name="_Toc240448006"/>
+      <w:bookmarkStart w:id="45" w:name="_Ref97548984"/>
+      <w:bookmarkStart w:id="46" w:name="_Toc241063202"/>
+      <w:r>
+        <w:t>Output format</w:t>
+      </w:r>
+      <w:bookmarkEnd w:id="45"/>
+      <w:bookmarkEnd w:id="46"/>
+    </w:p>
+    <w:p>
+      <w:r>
+        <w:t>This setting is found under “</w:t>
+      </w:r>
+      <w:r>
+        <w:t>BinaryOutput</w:t>
+      </w:r>
+      <w:r>
+        <w:t xml:space="preserve">” in the </w:t>
+      </w:r>
+      <w:r>
+        <w:t>JSON</w:t>
+      </w:r>
+      <w:r>
+        <w:t xml:space="preserve"> file. It controls the desired VIPS binary or NMEA output options.</w:t>
+      </w:r>
+    </w:p>
+    <w:p>
+      <w:r>
+        <w:t xml:space="preserve">In binary output mode the value set here will be used as the requested options mask as detailed in section </w:t>
+      </w:r>
+      <w:r>
+        <w:fldChar w:fldCharType="begin"/>
+      </w:r>
+      <w:r>
+        <w:instrText xml:space="preserve"> REF _Ref97549053 \r \h </w:instrText>
+      </w:r>
+      <w:r>
+        <w:fldChar w:fldCharType="separate"/>
+      </w:r>
+      <w:r>
+        <w:t>2.1</w:t>
+      </w:r>
+      <w:r>
+        <w:fldChar w:fldCharType="end"/>
+      </w:r>
+      <w:r>
+        <w:t xml:space="preserve">. The </w:t>
+      </w:r>
+      <w:r>
+        <w:t xml:space="preserve">options </w:t>
+      </w:r>
+      <w:r>
+        <w:t>value i</w:t>
+      </w:r>
+      <w:r>
+        <w:t>n</w:t>
+      </w:r>
+      <w:r>
+        <w:t xml:space="preserve"> the output message will normally be </w:t>
+      </w:r>
+      <w:r>
+        <w:t xml:space="preserve">the same as </w:t>
+      </w:r>
+      <w:r>
+        <w:t xml:space="preserve">the option set </w:t>
+      </w:r>
+      <w:r>
+        <w:t>h</w:t>
+      </w:r>
+      <w:r>
+        <w:t>ere unless an invalid combination of options has been selected. For example orientation channels will only be output if the Kalman filter is also enabled.</w:t>
+      </w:r>
+      <w:r>
+        <w:t xml:space="preserve"> The user should always parse a message based on the options field it contains not the value requested in the JSON file.</w:t>
+      </w:r>
+    </w:p>
+    <w:p>
+      <w:r>
+        <w:t xml:space="preserve">In NMEA mode this value sets which NMEA messages are output as detailed in section </w:t>
+      </w:r>
+      <w:r>
+        <w:fldChar w:fldCharType="begin"/>
+      </w:r>
+      <w:r>
+        <w:instrText xml:space="preserve"> REF _Ref97549062 \r \h </w:instrText>
+      </w:r>
+      <w:r>
+        <w:fldChar w:fldCharType="separate"/>
+      </w:r>
+      <w:r>
+        <w:t>2.2</w:t>
+      </w:r>
+      <w:r>
+        <w:fldChar w:fldCharType="end"/>
+      </w:r>
+    </w:p>
+    <w:p>
+      <w:pPr>
+        <w:pStyle w:val="Heading2"/>
+      </w:pPr>
+      <w:bookmarkStart w:id="47" w:name="_Ref97549028"/>
+      <w:bookmarkStart w:id="48" w:name="_Toc241063203"/>
       <w:r>
         <w:t>Operating Options</w:t>
       </w:r>
-      <w:bookmarkEnd w:id="43"/>
-      <w:bookmarkEnd w:id="44"/>
+      <w:bookmarkEnd w:id="47"/>
+      <w:bookmarkEnd w:id="48"/>
     </w:p>
     <w:p>
       <w:r>
@@ -11996,7 +12253,7 @@
       <w:rPr>
         <w:noProof/>
       </w:rPr>
-      <w:t>16/09/2026</w:t>
+      <w:t>23/09/2026</w:t>
     </w:r>
     <w:r>
       <w:fldChar w:fldCharType="end"/>

</xml_diff>